<commit_message>
Hackathon submission files and project updates
Hackathon submission files and project updates
</commit_message>
<xml_diff>
--- a/ProbStmntSolnSummarySystemArchitecture.docx
+++ b/ProbStmntSolnSummarySystemArchitecture.docx
@@ -1,35 +1,29 @@
 
 <file path=word/document.xml><?xml version="1.0" encoding="utf-8"?>
-<w:document xmlns:wpc="http://schemas.microsoft.com/office/word/2010/wordprocessingCanvas" xmlns:cx="http://schemas.microsoft.com/office/drawing/2014/chartex" xmlns:cx1="http://schemas.microsoft.com/office/drawing/2015/9/8/chartex" xmlns:cx2="http://schemas.microsoft.com/office/drawing/2015/10/21/chartex" xmlns:cx3="http://schemas.microsoft.com/office/drawing/2016/5/9/chartex" xmlns:cx4="http://schemas.microsoft.com/office/drawing/2016/5/10/chartex" xmlns:cx5="http://schemas.microsoft.com/office/drawing/2016/5/11/chartex" xmlns:cx6="http://schemas.microsoft.com/office/drawing/2016/5/12/chartex" xmlns:cx7="http://schemas.microsoft.com/office/drawing/2016/5/13/chartex" xmlns:cx8="http://schemas.microsoft.com/office/drawing/2016/5/14/chartex" xmlns:mc="http://schemas.openxmlformats.org/markup-compatibility/2006" xmlns:aink="http://schemas.microsoft.com/office/drawing/2016/ink" xmlns:am3d="http://schemas.microsoft.com/office/drawing/2017/model3d" xmlns:o="urn:schemas-microsoft-com:office:office" xmlns:oel="http://schemas.microsoft.com/office/2019/extlst" xmlns:r="http://schemas.openxmlformats.org/officeDocument/2006/relationships" xmlns:m="http://schemas.openxmlformats.org/officeDocument/2006/math" xmlns:v="urn:schemas-microsoft-com:vml" xmlns:wp14="http://schemas.microsoft.com/office/word/2010/wordprocessingDrawing" xmlns:wp="http://schemas.openxmlformats.org/drawingml/2006/wordprocessingDrawing" xmlns:w10="urn:schemas-microsoft-com:office:word" xmlns:w="http://schemas.openxmlformats.org/wordprocessingml/2006/main" xmlns:w14="http://schemas.microsoft.com/office/word/2010/wordml" xmlns:w15="http://schemas.microsoft.com/office/word/2012/wordml" xmlns:w16cex="http://schemas.microsoft.com/office/word/2018/wordml/cex" xmlns:w16cid="http://schemas.microsoft.com/office/word/2016/wordml/cid" xmlns:w16="http://schemas.microsoft.com/office/word/2018/wordml" xmlns:w16du="http://schemas.microsoft.com/office/word/2023/wordml/word16du" xmlns:w16sdtdh="http://schemas.microsoft.com/office/word/2020/wordml/sdtdatahash" xmlns:w16sdtfl="http://schemas.microsoft.com/office/word/2024/wordml/sdtformatlock" xmlns:w16se="http://schemas.microsoft.com/office/word/2015/wordml/symex" xmlns:wpg="http://schemas.microsoft.com/office/word/2010/wordprocessingGroup" xmlns:wpi="http://schemas.microsoft.com/office/word/2010/wordprocessingInk" xmlns:wne="http://schemas.microsoft.com/office/word/2006/wordml" xmlns:wps="http://schemas.microsoft.com/office/word/2010/wordprocessingShape" mc:Ignorable="w14 w15 w16se w16cid w16 w16cex w16sdtdh w16sdtfl w16du wp14">
+<w:document xmlns:wpc="http://schemas.microsoft.com/office/word/2010/wordprocessingCanvas" xmlns:cx="http://schemas.microsoft.com/office/drawing/2014/chartex" xmlns:cx1="http://schemas.microsoft.com/office/drawing/2015/9/8/chartex" xmlns:cx2="http://schemas.microsoft.com/office/drawing/2015/10/21/chartex" xmlns:cx3="http://schemas.microsoft.com/office/drawing/2016/5/9/chartex" xmlns:cx4="http://schemas.microsoft.com/office/drawing/2016/5/10/chartex" xmlns:cx5="http://schemas.microsoft.com/office/drawing/2016/5/11/chartex" xmlns:cx6="http://schemas.microsoft.com/office/drawing/2016/5/12/chartex" xmlns:cx7="http://schemas.microsoft.com/office/drawing/2016/5/13/chartex" xmlns:cx8="http://schemas.microsoft.com/office/drawing/2016/5/14/chartex" xmlns:mc="http://schemas.openxmlformats.org/markup-compatibility/2006" xmlns:aink="http://schemas.microsoft.com/office/drawing/2016/ink" xmlns:am3d="http://schemas.microsoft.com/office/drawing/2017/model3d" xmlns:o="urn:schemas-microsoft-com:office:office" xmlns:oel="http://schemas.microsoft.com/office/2019/extlst" xmlns:r="http://schemas.openxmlformats.org/officeDocument/2006/relationships" xmlns:m="http://schemas.openxmlformats.org/officeDocument/2006/math" xmlns:v="urn:schemas-microsoft-com:vml" xmlns:wp14="http://schemas.microsoft.com/office/word/2010/wordprocessingDrawing" xmlns:wp="http://schemas.openxmlformats.org/drawingml/2006/wordprocessingDrawing" xmlns:w10="urn:schemas-microsoft-com:office:word" xmlns:w="http://schemas.openxmlformats.org/wordprocessingml/2006/main" xmlns:w14="http://schemas.microsoft.com/office/word/2010/wordml" xmlns:w15="http://schemas.microsoft.com/office/word/2012/wordml" xmlns:w16cex="http://schemas.microsoft.com/office/word/2018/wordml/cex" xmlns:w16cid="http://schemas.microsoft.com/office/word/2016/wordml/cid" xmlns:w16="http://schemas.microsoft.com/office/word/2018/wordml" xmlns:w16du="http://schemas.microsoft.com/office/word/2023/wordml/word16du" xmlns:w16sdtdh="http://schemas.microsoft.com/office/word/2020/wordml/sdtdatahash" xmlns:w16se="http://schemas.microsoft.com/office/word/2015/wordml/symex" xmlns:wpg="http://schemas.microsoft.com/office/word/2010/wordprocessingGroup" xmlns:wpi="http://schemas.microsoft.com/office/word/2010/wordprocessingInk" xmlns:wne="http://schemas.microsoft.com/office/word/2006/wordml" xmlns:wps="http://schemas.microsoft.com/office/word/2010/wordprocessingShape" mc:Ignorable="w14 w15 w16se w16cid w16 w16cex w16sdtdh wp14">
   <w:body>
     <w:p>
       <w:pPr>
         <w:pStyle w:val="Heading2"/>
       </w:pPr>
       <w:r>
-        <w:rPr/>
-        <w:t>🔟</w:t>
-      </w:r>
-      <w:r>
-        <w:rPr/>
         <w:t xml:space="preserve">.1 — </w:t>
       </w:r>
       <w:r>
         <w:rPr>
-          <w:b w:val="1"/>
-          <w:bCs w:val="1"/>
+          <w:b/>
+          <w:bCs/>
         </w:rPr>
         <w:t>One‑Page Problem → Solution Summary</w:t>
       </w:r>
       <w:r>
-        <w:rPr/>
         <w:t xml:space="preserve"> </w:t>
       </w:r>
     </w:p>
     <w:p>
       <w:pPr>
         <w:pBdr>
-          <w:left w:val="single" w:color="A6A6A6" w:sz="18" w:space="4"/>
+          <w:left w:val="single" w:sz="18" w:space="4" w:color="A6A6A6"/>
         </w:pBdr>
         <w:ind w:left="180"/>
       </w:pPr>
@@ -42,15 +36,13 @@
       </w:r>
       <w:r>
         <w:br/>
-      </w:r>
-      <w:r>
         <w:t>Small‑scale farmers often lack access to real‑time, actionable insights for irrigation decisions. Existing solutions are either too complex, expensive, or not explainable, leading to inefficient water usage and crop stress.</w:t>
       </w:r>
     </w:p>
     <w:p>
       <w:pPr>
         <w:pBdr>
-          <w:left w:val="single" w:color="A6A6A6" w:sz="18" w:space="4"/>
+          <w:left w:val="single" w:sz="18" w:space="4" w:color="A6A6A6"/>
         </w:pBdr>
         <w:ind w:left="180"/>
       </w:pPr>
@@ -63,8 +55,6 @@
       </w:r>
       <w:r>
         <w:br/>
-      </w:r>
-      <w:r>
         <w:t xml:space="preserve">We built a </w:t>
       </w:r>
       <w:r>
@@ -91,7 +81,7 @@
     <w:p>
       <w:pPr>
         <w:pBdr>
-          <w:left w:val="single" w:color="A6A6A6" w:sz="18" w:space="4"/>
+          <w:left w:val="single" w:sz="18" w:space="4" w:color="A6A6A6"/>
         </w:pBdr>
         <w:ind w:left="180"/>
       </w:pPr>
@@ -104,8 +94,6 @@
       </w:r>
       <w:r>
         <w:br/>
-      </w:r>
-      <w:r>
         <w:t xml:space="preserve">Unlike black‑box AI systems, our solution uses </w:t>
       </w:r>
       <w:r>
@@ -132,7 +120,7 @@
     <w:p>
       <w:pPr>
         <w:pBdr>
-          <w:left w:val="single" w:color="A6A6A6" w:sz="18" w:space="4"/>
+          <w:left w:val="single" w:sz="18" w:space="4" w:color="A6A6A6"/>
         </w:pBdr>
         <w:ind w:left="180"/>
       </w:pPr>
@@ -145,17 +133,12 @@
       </w:r>
       <w:r>
         <w:br/>
-      </w:r>
-      <w:r>
         <w:t>The solution improves water efficiency, reduces crop stress, and provides farmers with a scalable, low‑cost decision support system that can be extended to real sensors and enterprise deployments.</w:t>
       </w:r>
     </w:p>
     <w:p>
       <w:r>
-        <w:t>✅</w:t>
-      </w:r>
-      <w:r>
-        <w:t xml:space="preserve"> This is </w:t>
+        <w:t xml:space="preserve">✅ This is </w:t>
       </w:r>
       <w:r>
         <w:rPr>
@@ -171,7 +154,7 @@
     <w:p>
       <w:pPr>
         <w:pBdr>
-          <w:top w:val="single" w:color="auto" w:sz="12" w:space="0"/>
+          <w:top w:val="single" w:sz="12" w:space="0" w:color="auto"/>
         </w:pBdr>
         <w:spacing w:after="0"/>
       </w:pPr>
@@ -181,17 +164,12 @@
         <w:pStyle w:val="Heading2"/>
       </w:pPr>
       <w:r>
-        <w:rPr/>
-        <w:t>🔟</w:t>
-      </w:r>
-      <w:r>
-        <w:rPr/>
         <w:t xml:space="preserve">.2 — </w:t>
       </w:r>
       <w:r>
         <w:rPr>
-          <w:b w:val="1"/>
-          <w:bCs w:val="1"/>
+          <w:b/>
+          <w:bCs/>
         </w:rPr>
         <w:t>System Architecture Diagram (Textual + Explainable)</w:t>
       </w:r>
@@ -200,12 +178,12 @@
       <w:tblPr>
         <w:tblW w:w="100" w:type="auto"/>
         <w:tblBorders>
-          <w:top w:val="single" w:color="auto" w:sz="4" w:space="0"/>
-          <w:left w:val="single" w:color="auto" w:sz="4" w:space="0"/>
-          <w:bottom w:val="single" w:color="auto" w:sz="4" w:space="0"/>
-          <w:right w:val="single" w:color="auto" w:sz="4" w:space="0"/>
-          <w:insideH w:val="single" w:color="auto" w:sz="4" w:space="0"/>
-          <w:insideV w:val="single" w:color="auto" w:sz="4" w:space="0"/>
+          <w:top w:val="single" w:sz="4" w:space="0" w:color="auto"/>
+          <w:left w:val="single" w:sz="4" w:space="0" w:color="auto"/>
+          <w:bottom w:val="single" w:sz="4" w:space="0" w:color="auto"/>
+          <w:right w:val="single" w:sz="4" w:space="0" w:color="auto"/>
+          <w:insideH w:val="single" w:sz="4" w:space="0" w:color="auto"/>
+          <w:insideV w:val="single" w:sz="4" w:space="0" w:color="auto"/>
         </w:tblBorders>
         <w:tblLayout w:type="fixed"/>
         <w:tblLook w:val="04A0" w:firstRow="1" w:lastRow="0" w:firstColumn="1" w:lastColumn="0" w:noHBand="0" w:noVBand="1"/>
@@ -217,7 +195,6 @@
         <w:tc>
           <w:tcPr>
             <w:tcW w:w="9016" w:type="dxa"/>
-            <w:tcMar/>
             <w:vAlign w:val="center"/>
           </w:tcPr>
           <w:p>
@@ -232,7 +209,7 @@
             </w:r>
             <w:r>
               <w:rPr>
-                <w:rFonts w:ascii="Consolas" w:hAnsi="Consolas" w:eastAsia="Consolas" w:cs="Consolas"/>
+                <w:rFonts w:ascii="Consolas" w:eastAsia="Consolas" w:hAnsi="Consolas" w:cs="Consolas"/>
               </w:rPr>
               <w:t>┌───────────────────────────┐</w:t>
             </w:r>
@@ -249,7 +226,7 @@
             </w:r>
             <w:r>
               <w:rPr>
-                <w:rFonts w:ascii="Consolas" w:hAnsi="Consolas" w:eastAsia="Consolas" w:cs="Consolas"/>
+                <w:rFonts w:ascii="Consolas" w:eastAsia="Consolas" w:hAnsi="Consolas" w:cs="Consolas"/>
               </w:rPr>
               <w:t>│        Frontend           │</w:t>
             </w:r>
@@ -266,7 +243,7 @@
             </w:r>
             <w:r>
               <w:rPr>
-                <w:rFonts w:ascii="Consolas" w:hAnsi="Consolas" w:eastAsia="Consolas" w:cs="Consolas"/>
+                <w:rFonts w:ascii="Consolas" w:eastAsia="Consolas" w:hAnsi="Consolas" w:cs="Consolas"/>
               </w:rPr>
               <w:t>│  React Dashboard (CDN)    │</w:t>
             </w:r>
@@ -283,7 +260,7 @@
             </w:r>
             <w:r>
               <w:rPr>
-                <w:rFonts w:ascii="Consolas" w:hAnsi="Consolas" w:eastAsia="Consolas" w:cs="Consolas"/>
+                <w:rFonts w:ascii="Consolas" w:eastAsia="Consolas" w:hAnsi="Consolas" w:cs="Consolas"/>
               </w:rPr>
               <w:t>│  - Zone Cards             │</w:t>
             </w:r>
@@ -300,7 +277,7 @@
             </w:r>
             <w:r>
               <w:rPr>
-                <w:rFonts w:ascii="Consolas" w:hAnsi="Consolas" w:eastAsia="Consolas" w:cs="Consolas"/>
+                <w:rFonts w:ascii="Consolas" w:eastAsia="Consolas" w:hAnsi="Consolas" w:cs="Consolas"/>
               </w:rPr>
               <w:t>│  - Live Sensor Values     │</w:t>
             </w:r>
@@ -317,7 +294,7 @@
             </w:r>
             <w:r>
               <w:rPr>
-                <w:rFonts w:ascii="Consolas" w:hAnsi="Consolas" w:eastAsia="Consolas" w:cs="Consolas"/>
+                <w:rFonts w:ascii="Consolas" w:eastAsia="Consolas" w:hAnsi="Consolas" w:cs="Consolas"/>
               </w:rPr>
               <w:t>│  - Status Badges          │</w:t>
             </w:r>
@@ -334,7 +311,7 @@
             </w:r>
             <w:r>
               <w:rPr>
-                <w:rFonts w:ascii="Consolas" w:hAnsi="Consolas" w:eastAsia="Consolas" w:cs="Consolas"/>
+                <w:rFonts w:ascii="Consolas" w:eastAsia="Consolas" w:hAnsi="Consolas" w:cs="Consolas"/>
               </w:rPr>
               <w:t>│  - Auto Refresh           │</w:t>
             </w:r>
@@ -351,7 +328,7 @@
             </w:r>
             <w:r>
               <w:rPr>
-                <w:rFonts w:ascii="Consolas" w:hAnsi="Consolas" w:eastAsia="Consolas" w:cs="Consolas"/>
+                <w:rFonts w:ascii="Consolas" w:eastAsia="Consolas" w:hAnsi="Consolas" w:cs="Consolas"/>
               </w:rPr>
               <w:t>└─────────────┬─────────────┘</w:t>
             </w:r>
@@ -368,7 +345,7 @@
             </w:r>
             <w:r>
               <w:rPr>
-                <w:rFonts w:ascii="Consolas" w:hAnsi="Consolas" w:eastAsia="Consolas" w:cs="Consolas"/>
+                <w:rFonts w:ascii="Consolas" w:eastAsia="Consolas" w:hAnsi="Consolas" w:cs="Consolas"/>
               </w:rPr>
               <w:t xml:space="preserve">              │ REST API (JWT Protected)</w:t>
             </w:r>
@@ -385,7 +362,7 @@
             </w:r>
             <w:r>
               <w:rPr>
-                <w:rFonts w:ascii="Consolas" w:hAnsi="Consolas" w:eastAsia="Consolas" w:cs="Consolas"/>
+                <w:rFonts w:ascii="Consolas" w:eastAsia="Consolas" w:hAnsi="Consolas" w:cs="Consolas"/>
               </w:rPr>
               <w:t xml:space="preserve">              ▼</w:t>
             </w:r>
@@ -402,7 +379,7 @@
             </w:r>
             <w:r>
               <w:rPr>
-                <w:rFonts w:ascii="Consolas" w:hAnsi="Consolas" w:eastAsia="Consolas" w:cs="Consolas"/>
+                <w:rFonts w:ascii="Consolas" w:eastAsia="Consolas" w:hAnsi="Consolas" w:cs="Consolas"/>
               </w:rPr>
               <w:t>┌───────────────────────────┐</w:t>
             </w:r>
@@ -419,7 +396,7 @@
             </w:r>
             <w:r>
               <w:rPr>
-                <w:rFonts w:ascii="Consolas" w:hAnsi="Consolas" w:eastAsia="Consolas" w:cs="Consolas"/>
+                <w:rFonts w:ascii="Consolas" w:eastAsia="Consolas" w:hAnsi="Consolas" w:cs="Consolas"/>
               </w:rPr>
               <w:t>│        Backend             │</w:t>
             </w:r>
@@ -436,7 +413,7 @@
             </w:r>
             <w:r>
               <w:rPr>
-                <w:rFonts w:ascii="Consolas" w:hAnsi="Consolas" w:eastAsia="Consolas" w:cs="Consolas"/>
+                <w:rFonts w:ascii="Consolas" w:eastAsia="Consolas" w:hAnsi="Consolas" w:cs="Consolas"/>
               </w:rPr>
               <w:t>│  Node.js + Express         │</w:t>
             </w:r>
@@ -453,7 +430,7 @@
             </w:r>
             <w:r>
               <w:rPr>
-                <w:rFonts w:ascii="Consolas" w:hAnsi="Consolas" w:eastAsia="Consolas" w:cs="Consolas"/>
+                <w:rFonts w:ascii="Consolas" w:eastAsia="Consolas" w:hAnsi="Consolas" w:cs="Consolas"/>
               </w:rPr>
               <w:t>│  - Authentication (JWT)    │</w:t>
             </w:r>
@@ -470,7 +447,7 @@
             </w:r>
             <w:r>
               <w:rPr>
-                <w:rFonts w:ascii="Consolas" w:hAnsi="Consolas" w:eastAsia="Consolas" w:cs="Consolas"/>
+                <w:rFonts w:ascii="Consolas" w:eastAsia="Consolas" w:hAnsi="Consolas" w:cs="Consolas"/>
               </w:rPr>
               <w:t>│  - Irrigation Logic        │</w:t>
             </w:r>
@@ -483,11 +460,12 @@
               <w:rPr>
                 <w:color w:val="707070"/>
               </w:rPr>
+              <w:lastRenderedPageBreak/>
               <w:t xml:space="preserve">16     </w:t>
             </w:r>
             <w:r>
               <w:rPr>
-                <w:rFonts w:ascii="Consolas" w:hAnsi="Consolas" w:eastAsia="Consolas" w:cs="Consolas"/>
+                <w:rFonts w:ascii="Consolas" w:eastAsia="Consolas" w:hAnsi="Consolas" w:cs="Consolas"/>
               </w:rPr>
               <w:t>│  - Weather Integration     │</w:t>
             </w:r>
@@ -504,7 +482,7 @@
             </w:r>
             <w:r>
               <w:rPr>
-                <w:rFonts w:ascii="Consolas" w:hAnsi="Consolas" w:eastAsia="Consolas" w:cs="Consolas"/>
+                <w:rFonts w:ascii="Consolas" w:eastAsia="Consolas" w:hAnsi="Consolas" w:cs="Consolas"/>
               </w:rPr>
               <w:t>│  - Zone Management         │</w:t>
             </w:r>
@@ -521,7 +499,7 @@
             </w:r>
             <w:r>
               <w:rPr>
-                <w:rFonts w:ascii="Consolas" w:hAnsi="Consolas" w:eastAsia="Consolas" w:cs="Consolas"/>
+                <w:rFonts w:ascii="Consolas" w:eastAsia="Consolas" w:hAnsi="Consolas" w:cs="Consolas"/>
               </w:rPr>
               <w:t>└─────────────┬─────────────┘</w:t>
             </w:r>
@@ -538,7 +516,7 @@
             </w:r>
             <w:r>
               <w:rPr>
-                <w:rFonts w:ascii="Consolas" w:hAnsi="Consolas" w:eastAsia="Consolas" w:cs="Consolas"/>
+                <w:rFonts w:ascii="Consolas" w:eastAsia="Consolas" w:hAnsi="Consolas" w:cs="Consolas"/>
               </w:rPr>
               <w:t xml:space="preserve">              │</w:t>
             </w:r>
@@ -555,7 +533,7 @@
             </w:r>
             <w:r>
               <w:rPr>
-                <w:rFonts w:ascii="Consolas" w:hAnsi="Consolas" w:eastAsia="Consolas" w:cs="Consolas"/>
+                <w:rFonts w:ascii="Consolas" w:eastAsia="Consolas" w:hAnsi="Consolas" w:cs="Consolas"/>
               </w:rPr>
               <w:t xml:space="preserve">              ▼</w:t>
             </w:r>
@@ -572,7 +550,7 @@
             </w:r>
             <w:r>
               <w:rPr>
-                <w:rFonts w:ascii="Consolas" w:hAnsi="Consolas" w:eastAsia="Consolas" w:cs="Consolas"/>
+                <w:rFonts w:ascii="Consolas" w:eastAsia="Consolas" w:hAnsi="Consolas" w:cs="Consolas"/>
               </w:rPr>
               <w:t>┌───────────────────────────┐</w:t>
             </w:r>
@@ -589,7 +567,7 @@
             </w:r>
             <w:r>
               <w:rPr>
-                <w:rFonts w:ascii="Consolas" w:hAnsi="Consolas" w:eastAsia="Consolas" w:cs="Consolas"/>
+                <w:rFonts w:ascii="Consolas" w:eastAsia="Consolas" w:hAnsi="Consolas" w:cs="Consolas"/>
               </w:rPr>
               <w:t>│   Mock Data &amp; Services     │</w:t>
             </w:r>
@@ -606,7 +584,7 @@
             </w:r>
             <w:r>
               <w:rPr>
-                <w:rFonts w:ascii="Consolas" w:hAnsi="Consolas" w:eastAsia="Consolas" w:cs="Consolas"/>
+                <w:rFonts w:ascii="Consolas" w:eastAsia="Consolas" w:hAnsi="Consolas" w:cs="Consolas"/>
               </w:rPr>
               <w:t>│  - zones.json              │</w:t>
             </w:r>
@@ -623,7 +601,7 @@
             </w:r>
             <w:r>
               <w:rPr>
-                <w:rFonts w:ascii="Consolas" w:hAnsi="Consolas" w:eastAsia="Consolas" w:cs="Consolas"/>
+                <w:rFonts w:ascii="Consolas" w:eastAsia="Consolas" w:hAnsi="Consolas" w:cs="Consolas"/>
               </w:rPr>
               <w:t>│  - Dynamic Sensor Simulator│</w:t>
             </w:r>
@@ -640,7 +618,7 @@
             </w:r>
             <w:r>
               <w:rPr>
-                <w:rFonts w:ascii="Consolas" w:hAnsi="Consolas" w:eastAsia="Consolas" w:cs="Consolas"/>
+                <w:rFonts w:ascii="Consolas" w:eastAsia="Consolas" w:hAnsi="Consolas" w:cs="Consolas"/>
               </w:rPr>
               <w:t>│  - Weather Fallback Logic  │</w:t>
             </w:r>
@@ -657,7 +635,7 @@
             </w:r>
             <w:r>
               <w:rPr>
-                <w:rFonts w:ascii="Consolas" w:hAnsi="Consolas" w:eastAsia="Consolas" w:cs="Consolas"/>
+                <w:rFonts w:ascii="Consolas" w:eastAsia="Consolas" w:hAnsi="Consolas" w:cs="Consolas"/>
               </w:rPr>
               <w:t>└───────────────────────────┘</w:t>
             </w:r>
@@ -668,7 +646,7 @@
     <w:p>
       <w:pPr>
         <w:pBdr>
-          <w:top w:val="single" w:color="auto" w:sz="12" w:space="0"/>
+          <w:top w:val="single" w:sz="12" w:space="0" w:color="auto"/>
         </w:pBdr>
         <w:spacing w:after="0"/>
       </w:pPr>
@@ -677,9 +655,6 @@
       <w:pPr>
         <w:pStyle w:val="Heading2"/>
       </w:pPr>
-      <w:r>
-        <w:t>🔟</w:t>
-      </w:r>
       <w:r>
         <w:t xml:space="preserve">.3 — </w:t>
       </w:r>
@@ -698,61 +673,41 @@
     </w:p>
     <w:p>
       <w:r>
-        <w:t>✅</w:t>
-      </w:r>
-      <w:r>
-        <w:t xml:space="preserve"> Multi‑zone field visualization</w:t>
+        <w:t>✅ Multi‑zone field visualization</w:t>
       </w:r>
       <w:r>
         <w:br/>
-      </w:r>
-      <w:r>
-        <w:t>✅</w:t>
-      </w:r>
-      <w:r>
-        <w:t xml:space="preserve"> Dynamic sensor simulation (soil moisture, temperature, humidity)</w:t>
+        <w:t>✅ Dynamic sensor simulation (soil moisture, temperature, humidity)</w:t>
       </w:r>
       <w:r>
         <w:br/>
-      </w:r>
-      <w:r>
         <w:t>✅ Explainable AI‑based irrigation scoring (0–100)</w:t>
       </w:r>
       <w:r>
         <w:br/>
-      </w:r>
-      <w:r>
         <w:t>✅ Weather‑aware decision logic (OpenWeather with enterprise fallback)</w:t>
       </w:r>
       <w:r>
         <w:br/>
-      </w:r>
-      <w:r>
         <w:t>✅ JWT‑based secure authentication</w:t>
       </w:r>
       <w:r>
         <w:br/>
-      </w:r>
-      <w:r>
         <w:t>✅ Protected APIs with role‑ready design</w:t>
       </w:r>
       <w:r>
         <w:br/>
-      </w:r>
-      <w:r>
         <w:t>✅ Auto‑refreshing real‑time dashboard</w:t>
       </w:r>
       <w:r>
         <w:br/>
-      </w:r>
-      <w:r>
         <w:t>✅ Enterprise‑safe &amp; hackathon‑friendly architecture</w:t>
       </w:r>
     </w:p>
     <w:p>
       <w:pPr>
         <w:pBdr>
-          <w:top w:val="single" w:color="auto" w:sz="12" w:space="0"/>
+          <w:top w:val="single" w:sz="12" w:space="0" w:color="auto"/>
         </w:pBdr>
         <w:spacing w:after="0"/>
       </w:pPr>
@@ -762,17 +717,12 @@
         <w:pStyle w:val="Heading2"/>
       </w:pPr>
       <w:r>
-        <w:rPr/>
-        <w:t>🔟</w:t>
-      </w:r>
-      <w:r>
-        <w:rPr/>
         <w:t xml:space="preserve">.4 — </w:t>
       </w:r>
       <w:r>
         <w:rPr>
-          <w:b w:val="1"/>
-          <w:bCs w:val="1"/>
+          <w:b/>
+          <w:bCs/>
         </w:rPr>
         <w:t>Explainable AI Logic (Judge‑Friendly)</w:t>
       </w:r>
@@ -780,7 +730,7 @@
     <w:p>
       <w:pPr>
         <w:pBdr>
-          <w:left w:val="single" w:color="A6A6A6" w:sz="18" w:space="4"/>
+          <w:left w:val="single" w:sz="18" w:space="4" w:color="A6A6A6"/>
         </w:pBdr>
         <w:ind w:left="180"/>
       </w:pPr>
@@ -793,8 +743,6 @@
       </w:r>
       <w:r>
         <w:br/>
-      </w:r>
-      <w:r>
         <w:t xml:space="preserve">The system calculates an </w:t>
       </w:r>
       <w:r>
@@ -847,7 +795,7 @@
     <w:p>
       <w:pPr>
         <w:pBdr>
-          <w:left w:val="single" w:color="A6A6A6" w:sz="18" w:space="4"/>
+          <w:left w:val="single" w:sz="18" w:space="4" w:color="A6A6A6"/>
         </w:pBdr>
         <w:ind w:left="180"/>
       </w:pPr>
@@ -858,7 +806,7 @@
     <w:p>
       <w:pPr>
         <w:pBdr>
-          <w:left w:val="single" w:color="A6A6A6" w:sz="18" w:space="4"/>
+          <w:left w:val="single" w:sz="18" w:space="4" w:color="A6A6A6"/>
         </w:pBdr>
         <w:ind w:left="180"/>
       </w:pPr>
@@ -917,6 +865,7 @@
           <w:b/>
           <w:bCs/>
         </w:rPr>
+        <w:lastRenderedPageBreak/>
         <w:t>&lt; 40</w:t>
       </w:r>
       <w:r>
@@ -926,7 +875,7 @@
     <w:p>
       <w:pPr>
         <w:pBdr>
-          <w:left w:val="single" w:color="A6A6A6" w:sz="18" w:space="4"/>
+          <w:left w:val="single" w:sz="18" w:space="4" w:color="A6A6A6"/>
         </w:pBdr>
         <w:ind w:left="180"/>
       </w:pPr>
@@ -936,10 +885,7 @@
     </w:p>
     <w:p>
       <w:r>
-        <w:t>✅</w:t>
-      </w:r>
-      <w:r>
-        <w:t xml:space="preserve"> This positions your project as </w:t>
+        <w:t xml:space="preserve">✅ This positions your project as </w:t>
       </w:r>
       <w:r>
         <w:rPr>
@@ -955,7 +901,7 @@
     <w:p>
       <w:pPr>
         <w:pBdr>
-          <w:top w:val="single" w:color="auto" w:sz="12" w:space="0"/>
+          <w:top w:val="single" w:sz="12" w:space="0" w:color="auto"/>
         </w:pBdr>
         <w:spacing w:after="0"/>
       </w:pPr>
@@ -965,17 +911,12 @@
         <w:pStyle w:val="Heading2"/>
       </w:pPr>
       <w:r>
-        <w:rPr/>
-        <w:t>🔟</w:t>
-      </w:r>
-      <w:r>
-        <w:rPr/>
-        <w:t xml:space="preserve">.5 — </w:t>
+        <w:t xml:space="preserve">5 — </w:t>
       </w:r>
       <w:r>
         <w:rPr>
-          <w:b w:val="1"/>
-          <w:bCs w:val="1"/>
+          <w:b/>
+          <w:bCs/>
         </w:rPr>
         <w:t xml:space="preserve">Demo </w:t>
       </w:r>
@@ -992,7 +933,7 @@
     <w:p>
       <w:pPr>
         <w:pBdr>
-          <w:left w:val="single" w:color="A6A6A6" w:sz="18" w:space="4"/>
+          <w:left w:val="single" w:sz="18" w:space="4" w:color="A6A6A6"/>
         </w:pBdr>
         <w:ind w:left="180"/>
       </w:pPr>
@@ -1012,7 +953,7 @@
     <w:p>
       <w:pPr>
         <w:pBdr>
-          <w:left w:val="single" w:color="A6A6A6" w:sz="18" w:space="4"/>
+          <w:left w:val="single" w:sz="18" w:space="4" w:color="A6A6A6"/>
         </w:pBdr>
         <w:ind w:left="180"/>
       </w:pPr>
@@ -1032,7 +973,7 @@
     <w:p>
       <w:pPr>
         <w:pBdr>
-          <w:left w:val="single" w:color="A6A6A6" w:sz="18" w:space="4"/>
+          <w:left w:val="single" w:sz="18" w:space="4" w:color="A6A6A6"/>
         </w:pBdr>
         <w:ind w:left="180"/>
       </w:pPr>
@@ -1052,7 +993,7 @@
     <w:p>
       <w:pPr>
         <w:pBdr>
-          <w:left w:val="single" w:color="A6A6A6" w:sz="18" w:space="4"/>
+          <w:left w:val="single" w:sz="18" w:space="4" w:color="A6A6A6"/>
         </w:pBdr>
         <w:ind w:left="180"/>
       </w:pPr>
@@ -1072,7 +1013,7 @@
     <w:p>
       <w:pPr>
         <w:pBdr>
-          <w:left w:val="single" w:color="A6A6A6" w:sz="18" w:space="4"/>
+          <w:left w:val="single" w:sz="18" w:space="4" w:color="A6A6A6"/>
         </w:pBdr>
         <w:ind w:left="180"/>
       </w:pPr>
@@ -1092,19 +1033,18 @@
     <w:p>
       <w:pPr>
         <w:pBdr>
-          <w:left w:val="single" w:color="A6A6A6" w:sz="18" w:space="4"/>
+          <w:left w:val="single" w:sz="18" w:space="4" w:color="A6A6A6"/>
         </w:pBdr>
         <w:ind w:left="180"/>
       </w:pPr>
       <w:r>
-        <w:rPr/>
         <w:t>“All sensitive APIs are protected — unauthorized access is blocked.”</w:t>
       </w:r>
     </w:p>
     <w:p>
       <w:pPr>
         <w:pBdr>
-          <w:top w:val="single" w:color="auto" w:sz="12" w:space="0"/>
+          <w:top w:val="single" w:sz="12" w:space="0" w:color="auto"/>
         </w:pBdr>
         <w:spacing w:after="0"/>
       </w:pPr>
@@ -1114,17 +1054,12 @@
         <w:pStyle w:val="Heading2"/>
       </w:pPr>
       <w:r>
-        <w:rPr/>
-        <w:t>🔟</w:t>
-      </w:r>
-      <w:r>
-        <w:rPr/>
-        <w:t xml:space="preserve">.6 — </w:t>
+        <w:t xml:space="preserve">🔟.6 — </w:t>
       </w:r>
       <w:r>
         <w:rPr>
-          <w:b w:val="1"/>
-          <w:bCs w:val="1"/>
+          <w:b/>
+          <w:bCs/>
         </w:rPr>
         <w:t>README.md (Final Version)</w:t>
       </w:r>
@@ -1133,12 +1068,12 @@
       <w:tblPr>
         <w:tblW w:w="100" w:type="auto"/>
         <w:tblBorders>
-          <w:top w:val="single" w:color="auto" w:sz="4" w:space="0"/>
-          <w:left w:val="single" w:color="auto" w:sz="4" w:space="0"/>
-          <w:bottom w:val="single" w:color="auto" w:sz="4" w:space="0"/>
-          <w:right w:val="single" w:color="auto" w:sz="4" w:space="0"/>
-          <w:insideH w:val="single" w:color="auto" w:sz="4" w:space="0"/>
-          <w:insideV w:val="single" w:color="auto" w:sz="4" w:space="0"/>
+          <w:top w:val="single" w:sz="4" w:space="0" w:color="auto"/>
+          <w:left w:val="single" w:sz="4" w:space="0" w:color="auto"/>
+          <w:bottom w:val="single" w:sz="4" w:space="0" w:color="auto"/>
+          <w:right w:val="single" w:sz="4" w:space="0" w:color="auto"/>
+          <w:insideH w:val="single" w:sz="4" w:space="0" w:color="auto"/>
+          <w:insideV w:val="single" w:sz="4" w:space="0" w:color="auto"/>
         </w:tblBorders>
         <w:tblLayout w:type="fixed"/>
         <w:tblLook w:val="04A0" w:firstRow="1" w:lastRow="0" w:firstColumn="1" w:lastColumn="0" w:noHBand="0" w:noVBand="1"/>
@@ -1150,7 +1085,6 @@
         <w:tc>
           <w:tcPr>
             <w:tcW w:w="9016" w:type="dxa"/>
-            <w:tcMar/>
             <w:vAlign w:val="center"/>
           </w:tcPr>
           <w:p>
@@ -1165,708 +1099,702 @@
             </w:r>
             <w:r>
               <w:rPr>
-                <w:rFonts w:ascii="Consolas" w:hAnsi="Consolas" w:eastAsia="Consolas" w:cs="Consolas"/>
+                <w:rFonts w:ascii="Consolas" w:eastAsia="Consolas" w:hAnsi="Consolas" w:cs="Consolas"/>
                 <w:color w:val="0550AE"/>
               </w:rPr>
-              <w:t xml:space="preserve"># Precision Agriculture Portal </w:t>
-            </w:r>
-            <w:r>
-              <w:rPr>
-                <w:rFonts w:ascii="Consolas" w:hAnsi="Consolas" w:eastAsia="Consolas" w:cs="Consolas"/>
+              <w:t># Precision Agriculture Portal 🌱</w:t>
+            </w:r>
+          </w:p>
+          <w:p>
+            <w:pPr>
+              <w:spacing w:after="0"/>
+            </w:pPr>
+            <w:r>
+              <w:rPr>
+                <w:color w:val="707070"/>
+              </w:rPr>
+              <w:t xml:space="preserve">2     </w:t>
+            </w:r>
+          </w:p>
+          <w:p>
+            <w:pPr>
+              <w:spacing w:after="0"/>
+            </w:pPr>
+            <w:r>
+              <w:rPr>
+                <w:color w:val="707070"/>
+              </w:rPr>
+              <w:t xml:space="preserve">3     </w:t>
+            </w:r>
+            <w:r>
+              <w:rPr>
+                <w:rFonts w:ascii="Consolas" w:eastAsia="Consolas" w:hAnsi="Consolas" w:cs="Consolas"/>
                 <w:color w:val="0550AE"/>
               </w:rPr>
-              <w:t>🌱</w:t>
-            </w:r>
-          </w:p>
-          <w:p>
-            <w:pPr>
-              <w:spacing w:after="0"/>
-            </w:pPr>
-            <w:r>
-              <w:rPr>
-                <w:color w:val="707070"/>
-              </w:rPr>
-              <w:t xml:space="preserve">2     </w:t>
-            </w:r>
-          </w:p>
-          <w:p>
-            <w:pPr>
-              <w:spacing w:after="0"/>
-            </w:pPr>
-            <w:r>
-              <w:rPr>
-                <w:color w:val="707070"/>
-              </w:rPr>
-              <w:t xml:space="preserve">3     </w:t>
-            </w:r>
-            <w:r>
-              <w:rPr>
-                <w:rFonts w:ascii="Consolas" w:hAnsi="Consolas" w:eastAsia="Consolas" w:cs="Consolas"/>
+              <w:t>## Overview</w:t>
+            </w:r>
+          </w:p>
+          <w:p>
+            <w:pPr>
+              <w:spacing w:after="0"/>
+            </w:pPr>
+            <w:r>
+              <w:rPr>
+                <w:color w:val="707070"/>
+              </w:rPr>
+              <w:t xml:space="preserve">4     </w:t>
+            </w:r>
+            <w:r>
+              <w:rPr>
+                <w:rFonts w:ascii="Consolas" w:eastAsia="Consolas" w:hAnsi="Consolas" w:cs="Consolas"/>
+                <w:color w:val="1F2328"/>
+              </w:rPr>
+              <w:t>A full‑stack Precision Agriculture platform that helps small‑scale farmers make explainable, data‑driven irrigation decisions.</w:t>
+            </w:r>
+          </w:p>
+          <w:p>
+            <w:pPr>
+              <w:spacing w:after="0"/>
+            </w:pPr>
+            <w:r>
+              <w:rPr>
+                <w:color w:val="707070"/>
+              </w:rPr>
+              <w:t xml:space="preserve">5     </w:t>
+            </w:r>
+          </w:p>
+          <w:p>
+            <w:pPr>
+              <w:spacing w:after="0"/>
+            </w:pPr>
+            <w:r>
+              <w:rPr>
+                <w:color w:val="707070"/>
+              </w:rPr>
+              <w:t xml:space="preserve">6     </w:t>
+            </w:r>
+            <w:r>
+              <w:rPr>
+                <w:rFonts w:ascii="Consolas" w:eastAsia="Consolas" w:hAnsi="Consolas" w:cs="Consolas"/>
                 <w:color w:val="0550AE"/>
               </w:rPr>
-              <w:t>## Overview</w:t>
-            </w:r>
-          </w:p>
-          <w:p>
-            <w:pPr>
-              <w:spacing w:after="0"/>
-            </w:pPr>
-            <w:r>
-              <w:rPr>
-                <w:color w:val="707070"/>
-              </w:rPr>
-              <w:t xml:space="preserve">4     </w:t>
-            </w:r>
-            <w:r>
-              <w:rPr>
-                <w:rFonts w:ascii="Consolas" w:hAnsi="Consolas" w:eastAsia="Consolas" w:cs="Consolas"/>
+              <w:t>## Tech Stack</w:t>
+            </w:r>
+          </w:p>
+          <w:p>
+            <w:pPr>
+              <w:spacing w:after="0"/>
+            </w:pPr>
+            <w:r>
+              <w:rPr>
+                <w:color w:val="707070"/>
+              </w:rPr>
+              <w:t xml:space="preserve">7     </w:t>
+            </w:r>
+            <w:r>
+              <w:rPr>
+                <w:rFonts w:ascii="Consolas" w:eastAsia="Consolas" w:hAnsi="Consolas" w:cs="Consolas"/>
+                <w:color w:val="953800"/>
+              </w:rPr>
+              <w:t>-</w:t>
+            </w:r>
+            <w:r>
+              <w:rPr>
+                <w:rFonts w:ascii="Consolas" w:eastAsia="Consolas" w:hAnsi="Consolas" w:cs="Consolas"/>
                 <w:color w:val="1F2328"/>
               </w:rPr>
-              <w:t>A full‑stack Precision Agriculture platform that helps small‑scale farmers make explainable, data‑driven irrigation decisions.</w:t>
-            </w:r>
-          </w:p>
-          <w:p>
-            <w:pPr>
-              <w:spacing w:after="0"/>
-            </w:pPr>
-            <w:r>
-              <w:rPr>
-                <w:color w:val="707070"/>
-              </w:rPr>
-              <w:t xml:space="preserve">5     </w:t>
-            </w:r>
-          </w:p>
-          <w:p>
-            <w:pPr>
-              <w:spacing w:after="0"/>
-            </w:pPr>
-            <w:r>
-              <w:rPr>
-                <w:color w:val="707070"/>
-              </w:rPr>
-              <w:t xml:space="preserve">6     </w:t>
-            </w:r>
-            <w:r>
-              <w:rPr>
-                <w:rFonts w:ascii="Consolas" w:hAnsi="Consolas" w:eastAsia="Consolas" w:cs="Consolas"/>
+              <w:t xml:space="preserve"> Frontend: React (CDN, HTML, CSS, JS)</w:t>
+            </w:r>
+          </w:p>
+          <w:p>
+            <w:pPr>
+              <w:spacing w:after="0"/>
+            </w:pPr>
+            <w:r>
+              <w:rPr>
+                <w:color w:val="707070"/>
+              </w:rPr>
+              <w:t xml:space="preserve">8     </w:t>
+            </w:r>
+            <w:r>
+              <w:rPr>
+                <w:rFonts w:ascii="Consolas" w:eastAsia="Consolas" w:hAnsi="Consolas" w:cs="Consolas"/>
+                <w:color w:val="953800"/>
+              </w:rPr>
+              <w:t>-</w:t>
+            </w:r>
+            <w:r>
+              <w:rPr>
+                <w:rFonts w:ascii="Consolas" w:eastAsia="Consolas" w:hAnsi="Consolas" w:cs="Consolas"/>
+                <w:color w:val="1F2328"/>
+              </w:rPr>
+              <w:t xml:space="preserve"> Backend: Node.js, Express</w:t>
+            </w:r>
+          </w:p>
+          <w:p>
+            <w:pPr>
+              <w:spacing w:after="0"/>
+            </w:pPr>
+            <w:r>
+              <w:rPr>
+                <w:color w:val="707070"/>
+              </w:rPr>
+              <w:t xml:space="preserve">9     </w:t>
+            </w:r>
+            <w:r>
+              <w:rPr>
+                <w:rFonts w:ascii="Consolas" w:eastAsia="Consolas" w:hAnsi="Consolas" w:cs="Consolas"/>
+                <w:color w:val="953800"/>
+              </w:rPr>
+              <w:t>-</w:t>
+            </w:r>
+            <w:r>
+              <w:rPr>
+                <w:rFonts w:ascii="Consolas" w:eastAsia="Consolas" w:hAnsi="Consolas" w:cs="Consolas"/>
+                <w:color w:val="1F2328"/>
+              </w:rPr>
+              <w:t xml:space="preserve"> Auth: JWT</w:t>
+            </w:r>
+          </w:p>
+          <w:p>
+            <w:pPr>
+              <w:spacing w:after="0"/>
+            </w:pPr>
+            <w:r>
+              <w:rPr>
+                <w:color w:val="707070"/>
+              </w:rPr>
+              <w:t xml:space="preserve">10     </w:t>
+            </w:r>
+            <w:r>
+              <w:rPr>
+                <w:rFonts w:ascii="Consolas" w:eastAsia="Consolas" w:hAnsi="Consolas" w:cs="Consolas"/>
+                <w:color w:val="953800"/>
+              </w:rPr>
+              <w:t>-</w:t>
+            </w:r>
+            <w:r>
+              <w:rPr>
+                <w:rFonts w:ascii="Consolas" w:eastAsia="Consolas" w:hAnsi="Consolas" w:cs="Consolas"/>
+                <w:color w:val="1F2328"/>
+              </w:rPr>
+              <w:t xml:space="preserve"> Weather: OpenWeather API (with enterprise fallback)</w:t>
+            </w:r>
+          </w:p>
+          <w:p>
+            <w:pPr>
+              <w:spacing w:after="0"/>
+            </w:pPr>
+            <w:r>
+              <w:rPr>
+                <w:color w:val="707070"/>
+              </w:rPr>
+              <w:lastRenderedPageBreak/>
+              <w:t xml:space="preserve">11     </w:t>
+            </w:r>
+            <w:r>
+              <w:rPr>
+                <w:rFonts w:ascii="Consolas" w:eastAsia="Consolas" w:hAnsi="Consolas" w:cs="Consolas"/>
+                <w:color w:val="953800"/>
+              </w:rPr>
+              <w:t>-</w:t>
+            </w:r>
+            <w:r>
+              <w:rPr>
+                <w:rFonts w:ascii="Consolas" w:eastAsia="Consolas" w:hAnsi="Consolas" w:cs="Consolas"/>
+                <w:color w:val="1F2328"/>
+              </w:rPr>
+              <w:t xml:space="preserve"> Data: Mock JSON + dynamic simulation</w:t>
+            </w:r>
+          </w:p>
+          <w:p>
+            <w:pPr>
+              <w:spacing w:after="0"/>
+            </w:pPr>
+            <w:r>
+              <w:rPr>
+                <w:color w:val="707070"/>
+              </w:rPr>
+              <w:t xml:space="preserve">12     </w:t>
+            </w:r>
+          </w:p>
+          <w:p>
+            <w:pPr>
+              <w:spacing w:after="0"/>
+            </w:pPr>
+            <w:r>
+              <w:rPr>
+                <w:color w:val="707070"/>
+              </w:rPr>
+              <w:t xml:space="preserve">13     </w:t>
+            </w:r>
+            <w:r>
+              <w:rPr>
+                <w:rFonts w:ascii="Consolas" w:eastAsia="Consolas" w:hAnsi="Consolas" w:cs="Consolas"/>
                 <w:color w:val="0550AE"/>
               </w:rPr>
-              <w:t>## Tech Stack</w:t>
-            </w:r>
-          </w:p>
-          <w:p>
-            <w:pPr>
-              <w:spacing w:after="0"/>
-            </w:pPr>
-            <w:r>
-              <w:rPr>
-                <w:color w:val="707070"/>
-              </w:rPr>
-              <w:t xml:space="preserve">7     </w:t>
-            </w:r>
-            <w:r>
-              <w:rPr>
-                <w:rFonts w:ascii="Consolas" w:hAnsi="Consolas" w:eastAsia="Consolas" w:cs="Consolas"/>
+              <w:t>## Features</w:t>
+            </w:r>
+          </w:p>
+          <w:p>
+            <w:pPr>
+              <w:spacing w:after="0"/>
+            </w:pPr>
+            <w:r>
+              <w:rPr>
+                <w:color w:val="707070"/>
+              </w:rPr>
+              <w:t xml:space="preserve">14     </w:t>
+            </w:r>
+            <w:r>
+              <w:rPr>
+                <w:rFonts w:ascii="Consolas" w:eastAsia="Consolas" w:hAnsi="Consolas" w:cs="Consolas"/>
                 <w:color w:val="953800"/>
               </w:rPr>
               <w:t>-</w:t>
             </w:r>
             <w:r>
               <w:rPr>
-                <w:rFonts w:ascii="Consolas" w:hAnsi="Consolas" w:eastAsia="Consolas" w:cs="Consolas"/>
+                <w:rFonts w:ascii="Consolas" w:eastAsia="Consolas" w:hAnsi="Consolas" w:cs="Consolas"/>
                 <w:color w:val="1F2328"/>
               </w:rPr>
-              <w:t xml:space="preserve"> Frontend: React (CDN, HTML, CSS, JS)</w:t>
-            </w:r>
-          </w:p>
-          <w:p>
-            <w:pPr>
-              <w:spacing w:after="0"/>
-            </w:pPr>
-            <w:r>
-              <w:rPr>
-                <w:color w:val="707070"/>
-              </w:rPr>
-              <w:t xml:space="preserve">8     </w:t>
-            </w:r>
-            <w:r>
-              <w:rPr>
-                <w:rFonts w:ascii="Consolas" w:hAnsi="Consolas" w:eastAsia="Consolas" w:cs="Consolas"/>
+              <w:t xml:space="preserve"> Multi‑zone dashboard</w:t>
+            </w:r>
+          </w:p>
+          <w:p>
+            <w:pPr>
+              <w:spacing w:after="0"/>
+            </w:pPr>
+            <w:r>
+              <w:rPr>
+                <w:color w:val="707070"/>
+              </w:rPr>
+              <w:t xml:space="preserve">15     </w:t>
+            </w:r>
+            <w:r>
+              <w:rPr>
+                <w:rFonts w:ascii="Consolas" w:eastAsia="Consolas" w:hAnsi="Consolas" w:cs="Consolas"/>
                 <w:color w:val="953800"/>
               </w:rPr>
               <w:t>-</w:t>
             </w:r>
             <w:r>
               <w:rPr>
-                <w:rFonts w:ascii="Consolas" w:hAnsi="Consolas" w:eastAsia="Consolas" w:cs="Consolas"/>
+                <w:rFonts w:ascii="Consolas" w:eastAsia="Consolas" w:hAnsi="Consolas" w:cs="Consolas"/>
                 <w:color w:val="1F2328"/>
               </w:rPr>
-              <w:t xml:space="preserve"> Backend: Node.js, Express</w:t>
-            </w:r>
-          </w:p>
-          <w:p>
-            <w:pPr>
-              <w:spacing w:after="0"/>
-            </w:pPr>
-            <w:r>
-              <w:rPr>
-                <w:color w:val="707070"/>
-              </w:rPr>
-              <w:t xml:space="preserve">9     </w:t>
-            </w:r>
-            <w:r>
-              <w:rPr>
-                <w:rFonts w:ascii="Consolas" w:hAnsi="Consolas" w:eastAsia="Consolas" w:cs="Consolas"/>
+              <w:t xml:space="preserve"> Live sensor simulation</w:t>
+            </w:r>
+          </w:p>
+          <w:p>
+            <w:pPr>
+              <w:spacing w:after="0"/>
+            </w:pPr>
+            <w:r>
+              <w:rPr>
+                <w:color w:val="707070"/>
+              </w:rPr>
+              <w:t xml:space="preserve">16     </w:t>
+            </w:r>
+            <w:r>
+              <w:rPr>
+                <w:rFonts w:ascii="Consolas" w:eastAsia="Consolas" w:hAnsi="Consolas" w:cs="Consolas"/>
                 <w:color w:val="953800"/>
               </w:rPr>
               <w:t>-</w:t>
             </w:r>
             <w:r>
               <w:rPr>
-                <w:rFonts w:ascii="Consolas" w:hAnsi="Consolas" w:eastAsia="Consolas" w:cs="Consolas"/>
+                <w:rFonts w:ascii="Consolas" w:eastAsia="Consolas" w:hAnsi="Consolas" w:cs="Consolas"/>
                 <w:color w:val="1F2328"/>
               </w:rPr>
-              <w:t xml:space="preserve"> Auth: JWT</w:t>
-            </w:r>
-          </w:p>
-          <w:p>
-            <w:pPr>
-              <w:spacing w:after="0"/>
-            </w:pPr>
-            <w:r>
-              <w:rPr>
-                <w:color w:val="707070"/>
-              </w:rPr>
-              <w:t xml:space="preserve">10     </w:t>
-            </w:r>
-            <w:r>
-              <w:rPr>
-                <w:rFonts w:ascii="Consolas" w:hAnsi="Consolas" w:eastAsia="Consolas" w:cs="Consolas"/>
+              <w:t xml:space="preserve"> Explainable AI irrigation scoring</w:t>
+            </w:r>
+          </w:p>
+          <w:p>
+            <w:pPr>
+              <w:spacing w:after="0"/>
+            </w:pPr>
+            <w:r>
+              <w:rPr>
+                <w:color w:val="707070"/>
+              </w:rPr>
+              <w:t xml:space="preserve">17     </w:t>
+            </w:r>
+            <w:r>
+              <w:rPr>
+                <w:rFonts w:ascii="Consolas" w:eastAsia="Consolas" w:hAnsi="Consolas" w:cs="Consolas"/>
                 <w:color w:val="953800"/>
               </w:rPr>
               <w:t>-</w:t>
             </w:r>
             <w:r>
               <w:rPr>
-                <w:rFonts w:ascii="Consolas" w:hAnsi="Consolas" w:eastAsia="Consolas" w:cs="Consolas"/>
+                <w:rFonts w:ascii="Consolas" w:eastAsia="Consolas" w:hAnsi="Consolas" w:cs="Consolas"/>
                 <w:color w:val="1F2328"/>
               </w:rPr>
-              <w:t xml:space="preserve"> Weather: OpenWeather API (with enterprise fallback)</w:t>
-            </w:r>
-          </w:p>
-          <w:p>
-            <w:pPr>
-              <w:spacing w:after="0"/>
-            </w:pPr>
-            <w:r>
-              <w:rPr>
-                <w:color w:val="707070"/>
-              </w:rPr>
-              <w:t xml:space="preserve">11     </w:t>
-            </w:r>
-            <w:r>
-              <w:rPr>
-                <w:rFonts w:ascii="Consolas" w:hAnsi="Consolas" w:eastAsia="Consolas" w:cs="Consolas"/>
+              <w:t xml:space="preserve"> Weather‑aware logic</w:t>
+            </w:r>
+          </w:p>
+          <w:p>
+            <w:pPr>
+              <w:spacing w:after="0"/>
+            </w:pPr>
+            <w:r>
+              <w:rPr>
+                <w:color w:val="707070"/>
+              </w:rPr>
+              <w:t xml:space="preserve">18     </w:t>
+            </w:r>
+            <w:r>
+              <w:rPr>
+                <w:rFonts w:ascii="Consolas" w:eastAsia="Consolas" w:hAnsi="Consolas" w:cs="Consolas"/>
                 <w:color w:val="953800"/>
               </w:rPr>
               <w:t>-</w:t>
             </w:r>
             <w:r>
               <w:rPr>
-                <w:rFonts w:ascii="Consolas" w:hAnsi="Consolas" w:eastAsia="Consolas" w:cs="Consolas"/>
+                <w:rFonts w:ascii="Consolas" w:eastAsia="Consolas" w:hAnsi="Consolas" w:cs="Consolas"/>
                 <w:color w:val="1F2328"/>
               </w:rPr>
-              <w:t xml:space="preserve"> Data: Mock JSON + dynamic simulation</w:t>
-            </w:r>
-          </w:p>
-          <w:p>
-            <w:pPr>
-              <w:spacing w:after="0"/>
-            </w:pPr>
-            <w:r>
-              <w:rPr>
-                <w:color w:val="707070"/>
-              </w:rPr>
-              <w:t xml:space="preserve">12     </w:t>
-            </w:r>
-          </w:p>
-          <w:p>
-            <w:pPr>
-              <w:spacing w:after="0"/>
-            </w:pPr>
-            <w:r>
-              <w:rPr>
-                <w:color w:val="707070"/>
-              </w:rPr>
-              <w:t xml:space="preserve">13     </w:t>
-            </w:r>
-            <w:r>
-              <w:rPr>
-                <w:rFonts w:ascii="Consolas" w:hAnsi="Consolas" w:eastAsia="Consolas" w:cs="Consolas"/>
+              <w:t xml:space="preserve"> Secure JWT authentication</w:t>
+            </w:r>
+          </w:p>
+          <w:p>
+            <w:pPr>
+              <w:spacing w:after="0"/>
+            </w:pPr>
+            <w:r>
+              <w:rPr>
+                <w:color w:val="707070"/>
+              </w:rPr>
+              <w:t xml:space="preserve">19     </w:t>
+            </w:r>
+            <w:r>
+              <w:rPr>
+                <w:rFonts w:ascii="Consolas" w:eastAsia="Consolas" w:hAnsi="Consolas" w:cs="Consolas"/>
+                <w:color w:val="953800"/>
+              </w:rPr>
+              <w:t>-</w:t>
+            </w:r>
+            <w:r>
+              <w:rPr>
+                <w:rFonts w:ascii="Consolas" w:eastAsia="Consolas" w:hAnsi="Consolas" w:cs="Consolas"/>
+                <w:color w:val="1F2328"/>
+              </w:rPr>
+              <w:t xml:space="preserve"> Protected APIs</w:t>
+            </w:r>
+          </w:p>
+          <w:p>
+            <w:pPr>
+              <w:spacing w:after="0"/>
+            </w:pPr>
+            <w:r>
+              <w:rPr>
+                <w:color w:val="707070"/>
+              </w:rPr>
+              <w:t xml:space="preserve">20     </w:t>
+            </w:r>
+          </w:p>
+          <w:p>
+            <w:pPr>
+              <w:spacing w:after="0"/>
+            </w:pPr>
+            <w:r>
+              <w:rPr>
+                <w:color w:val="707070"/>
+              </w:rPr>
+              <w:t xml:space="preserve">21     </w:t>
+            </w:r>
+            <w:r>
+              <w:rPr>
+                <w:rFonts w:ascii="Consolas" w:eastAsia="Consolas" w:hAnsi="Consolas" w:cs="Consolas"/>
                 <w:color w:val="0550AE"/>
               </w:rPr>
-              <w:t>## Features</w:t>
-            </w:r>
-          </w:p>
-          <w:p>
-            <w:pPr>
-              <w:spacing w:after="0"/>
-            </w:pPr>
-            <w:r>
-              <w:rPr>
-                <w:color w:val="707070"/>
-              </w:rPr>
-              <w:t xml:space="preserve">14     </w:t>
-            </w:r>
-            <w:r>
-              <w:rPr>
-                <w:rFonts w:ascii="Consolas" w:hAnsi="Consolas" w:eastAsia="Consolas" w:cs="Consolas"/>
+              <w:t>## How It Works</w:t>
+            </w:r>
+          </w:p>
+          <w:p>
+            <w:pPr>
+              <w:spacing w:after="0"/>
+            </w:pPr>
+            <w:r>
+              <w:rPr>
+                <w:color w:val="707070"/>
+              </w:rPr>
+              <w:t xml:space="preserve">22     </w:t>
+            </w:r>
+            <w:r>
+              <w:rPr>
+                <w:rFonts w:ascii="Consolas" w:eastAsia="Consolas" w:hAnsi="Consolas" w:cs="Consolas"/>
                 <w:color w:val="953800"/>
               </w:rPr>
+              <w:t>1.</w:t>
+            </w:r>
+            <w:r>
+              <w:rPr>
+                <w:rFonts w:ascii="Consolas" w:eastAsia="Consolas" w:hAnsi="Consolas" w:cs="Consolas"/>
+                <w:color w:val="1F2328"/>
+              </w:rPr>
+              <w:t xml:space="preserve"> Users log in to receive a JWT token</w:t>
+            </w:r>
+          </w:p>
+          <w:p>
+            <w:pPr>
+              <w:spacing w:after="0"/>
+            </w:pPr>
+            <w:r>
+              <w:rPr>
+                <w:color w:val="707070"/>
+              </w:rPr>
+              <w:t xml:space="preserve">23     </w:t>
+            </w:r>
+            <w:r>
+              <w:rPr>
+                <w:rFonts w:ascii="Consolas" w:eastAsia="Consolas" w:hAnsi="Consolas" w:cs="Consolas"/>
+                <w:color w:val="953800"/>
+              </w:rPr>
+              <w:t>2.</w:t>
+            </w:r>
+            <w:r>
+              <w:rPr>
+                <w:rFonts w:ascii="Consolas" w:eastAsia="Consolas" w:hAnsi="Consolas" w:cs="Consolas"/>
+                <w:color w:val="1F2328"/>
+              </w:rPr>
+              <w:t xml:space="preserve"> Authenticated users access protected APIs</w:t>
+            </w:r>
+          </w:p>
+          <w:p>
+            <w:pPr>
+              <w:spacing w:after="0"/>
+            </w:pPr>
+            <w:r>
+              <w:rPr>
+                <w:color w:val="707070"/>
+              </w:rPr>
+              <w:t xml:space="preserve">24     </w:t>
+            </w:r>
+            <w:r>
+              <w:rPr>
+                <w:rFonts w:ascii="Consolas" w:eastAsia="Consolas" w:hAnsi="Consolas" w:cs="Consolas"/>
+                <w:color w:val="953800"/>
+              </w:rPr>
+              <w:t>3.</w:t>
+            </w:r>
+            <w:r>
+              <w:rPr>
+                <w:rFonts w:ascii="Consolas" w:eastAsia="Consolas" w:hAnsi="Consolas" w:cs="Consolas"/>
+                <w:color w:val="1F2328"/>
+              </w:rPr>
+              <w:t xml:space="preserve"> Backend computes irrigation scores dynamically</w:t>
+            </w:r>
+          </w:p>
+          <w:p>
+            <w:pPr>
+              <w:spacing w:after="0"/>
+            </w:pPr>
+            <w:r>
+              <w:rPr>
+                <w:color w:val="707070"/>
+              </w:rPr>
+              <w:t xml:space="preserve">25     </w:t>
+            </w:r>
+            <w:r>
+              <w:rPr>
+                <w:rFonts w:ascii="Consolas" w:eastAsia="Consolas" w:hAnsi="Consolas" w:cs="Consolas"/>
+                <w:color w:val="953800"/>
+              </w:rPr>
+              <w:t>4.</w:t>
+            </w:r>
+            <w:r>
+              <w:rPr>
+                <w:rFonts w:ascii="Consolas" w:eastAsia="Consolas" w:hAnsi="Consolas" w:cs="Consolas"/>
+                <w:color w:val="1F2328"/>
+              </w:rPr>
+              <w:t xml:space="preserve"> Frontend auto‑refreshes and renders results</w:t>
+            </w:r>
+          </w:p>
+          <w:p>
+            <w:pPr>
+              <w:spacing w:after="0"/>
+            </w:pPr>
+            <w:r>
+              <w:rPr>
+                <w:color w:val="707070"/>
+              </w:rPr>
+              <w:t xml:space="preserve">26     </w:t>
+            </w:r>
+          </w:p>
+          <w:p>
+            <w:pPr>
+              <w:spacing w:after="0"/>
+            </w:pPr>
+            <w:r>
+              <w:rPr>
+                <w:color w:val="707070"/>
+              </w:rPr>
+              <w:t xml:space="preserve">27     </w:t>
+            </w:r>
+            <w:r>
+              <w:rPr>
+                <w:rFonts w:ascii="Consolas" w:eastAsia="Consolas" w:hAnsi="Consolas" w:cs="Consolas"/>
+                <w:color w:val="0550AE"/>
+              </w:rPr>
+              <w:t>## Future Enhancements</w:t>
+            </w:r>
+          </w:p>
+          <w:p>
+            <w:pPr>
+              <w:spacing w:after="0"/>
+            </w:pPr>
+            <w:r>
+              <w:rPr>
+                <w:color w:val="707070"/>
+              </w:rPr>
+              <w:t xml:space="preserve">28     </w:t>
+            </w:r>
+            <w:r>
+              <w:rPr>
+                <w:rFonts w:ascii="Consolas" w:eastAsia="Consolas" w:hAnsi="Consolas" w:cs="Consolas"/>
+                <w:color w:val="953800"/>
+              </w:rPr>
               <w:t>-</w:t>
             </w:r>
             <w:r>
               <w:rPr>
-                <w:rFonts w:ascii="Consolas" w:hAnsi="Consolas" w:eastAsia="Consolas" w:cs="Consolas"/>
+                <w:rFonts w:ascii="Consolas" w:eastAsia="Consolas" w:hAnsi="Consolas" w:cs="Consolas"/>
                 <w:color w:val="1F2328"/>
               </w:rPr>
-              <w:t xml:space="preserve"> Multi‑zone dashboard</w:t>
-            </w:r>
-          </w:p>
-          <w:p>
-            <w:pPr>
-              <w:spacing w:after="0"/>
-            </w:pPr>
-            <w:r>
-              <w:rPr>
-                <w:color w:val="707070"/>
-              </w:rPr>
-              <w:t xml:space="preserve">15     </w:t>
-            </w:r>
-            <w:r>
-              <w:rPr>
-                <w:rFonts w:ascii="Consolas" w:hAnsi="Consolas" w:eastAsia="Consolas" w:cs="Consolas"/>
+              <w:t xml:space="preserve"> Real IoT sensor integration</w:t>
+            </w:r>
+          </w:p>
+          <w:p>
+            <w:pPr>
+              <w:spacing w:after="0"/>
+            </w:pPr>
+            <w:r>
+              <w:rPr>
+                <w:color w:val="707070"/>
+              </w:rPr>
+              <w:t xml:space="preserve">29     </w:t>
+            </w:r>
+            <w:r>
+              <w:rPr>
+                <w:rFonts w:ascii="Consolas" w:eastAsia="Consolas" w:hAnsi="Consolas" w:cs="Consolas"/>
                 <w:color w:val="953800"/>
               </w:rPr>
               <w:t>-</w:t>
             </w:r>
             <w:r>
               <w:rPr>
-                <w:rFonts w:ascii="Consolas" w:hAnsi="Consolas" w:eastAsia="Consolas" w:cs="Consolas"/>
+                <w:rFonts w:ascii="Consolas" w:eastAsia="Consolas" w:hAnsi="Consolas" w:cs="Consolas"/>
                 <w:color w:val="1F2328"/>
               </w:rPr>
-              <w:t xml:space="preserve"> Live sensor simulation</w:t>
-            </w:r>
-          </w:p>
-          <w:p>
-            <w:pPr>
-              <w:spacing w:after="0"/>
-            </w:pPr>
-            <w:r>
-              <w:rPr>
-                <w:color w:val="707070"/>
-              </w:rPr>
-              <w:t xml:space="preserve">16     </w:t>
-            </w:r>
-            <w:r>
-              <w:rPr>
-                <w:rFonts w:ascii="Consolas" w:hAnsi="Consolas" w:eastAsia="Consolas" w:cs="Consolas"/>
+              <w:t xml:space="preserve"> SMS alerts</w:t>
+            </w:r>
+          </w:p>
+          <w:p>
+            <w:pPr>
+              <w:spacing w:after="0"/>
+            </w:pPr>
+            <w:r>
+              <w:rPr>
+                <w:color w:val="707070"/>
+              </w:rPr>
+              <w:t xml:space="preserve">30     </w:t>
+            </w:r>
+            <w:r>
+              <w:rPr>
+                <w:rFonts w:ascii="Consolas" w:eastAsia="Consolas" w:hAnsi="Consolas" w:cs="Consolas"/>
                 <w:color w:val="953800"/>
               </w:rPr>
               <w:t>-</w:t>
             </w:r>
             <w:r>
               <w:rPr>
-                <w:rFonts w:ascii="Consolas" w:hAnsi="Consolas" w:eastAsia="Consolas" w:cs="Consolas"/>
+                <w:rFonts w:ascii="Consolas" w:eastAsia="Consolas" w:hAnsi="Consolas" w:cs="Consolas"/>
                 <w:color w:val="1F2328"/>
               </w:rPr>
-              <w:t xml:space="preserve"> Explainable AI irrigation scoring</w:t>
-            </w:r>
-          </w:p>
-          <w:p>
-            <w:pPr>
-              <w:spacing w:after="0"/>
-            </w:pPr>
-            <w:r>
-              <w:rPr>
-                <w:color w:val="707070"/>
-              </w:rPr>
-              <w:t xml:space="preserve">17     </w:t>
-            </w:r>
-            <w:r>
-              <w:rPr>
-                <w:rFonts w:ascii="Consolas" w:hAnsi="Consolas" w:eastAsia="Consolas" w:cs="Consolas"/>
+              <w:t xml:space="preserve"> Crop‑specific models</w:t>
+            </w:r>
+          </w:p>
+          <w:p>
+            <w:pPr>
+              <w:spacing w:after="0"/>
+            </w:pPr>
+            <w:r>
+              <w:rPr>
+                <w:color w:val="707070"/>
+              </w:rPr>
+              <w:t xml:space="preserve">31     </w:t>
+            </w:r>
+            <w:r>
+              <w:rPr>
+                <w:rFonts w:ascii="Consolas" w:eastAsia="Consolas" w:hAnsi="Consolas" w:cs="Consolas"/>
                 <w:color w:val="953800"/>
               </w:rPr>
               <w:t>-</w:t>
             </w:r>
             <w:r>
               <w:rPr>
-                <w:rFonts w:ascii="Consolas" w:hAnsi="Consolas" w:eastAsia="Consolas" w:cs="Consolas"/>
+                <w:rFonts w:ascii="Consolas" w:eastAsia="Consolas" w:hAnsi="Consolas" w:cs="Consolas"/>
                 <w:color w:val="1F2328"/>
               </w:rPr>
-              <w:t xml:space="preserve"> Weather‑aware logic</w:t>
-            </w:r>
-          </w:p>
-          <w:p>
-            <w:pPr>
-              <w:spacing w:after="0"/>
-            </w:pPr>
-            <w:r>
-              <w:rPr>
-                <w:color w:val="707070"/>
-              </w:rPr>
-              <w:t xml:space="preserve">18     </w:t>
-            </w:r>
-            <w:r>
-              <w:rPr>
-                <w:rFonts w:ascii="Consolas" w:hAnsi="Consolas" w:eastAsia="Consolas" w:cs="Consolas"/>
+              <w:t xml:space="preserve"> Cloud deployment</w:t>
+            </w:r>
+          </w:p>
+          <w:p>
+            <w:pPr>
+              <w:spacing w:after="0"/>
+            </w:pPr>
+            <w:r>
+              <w:rPr>
+                <w:color w:val="707070"/>
+              </w:rPr>
+              <w:t xml:space="preserve">32     </w:t>
+            </w:r>
+            <w:r>
+              <w:rPr>
+                <w:rFonts w:ascii="Consolas" w:eastAsia="Consolas" w:hAnsi="Consolas" w:cs="Consolas"/>
                 <w:color w:val="953800"/>
               </w:rPr>
               <w:t>-</w:t>
             </w:r>
             <w:r>
               <w:rPr>
-                <w:rFonts w:ascii="Consolas" w:hAnsi="Consolas" w:eastAsia="Consolas" w:cs="Consolas"/>
+                <w:rFonts w:ascii="Consolas" w:eastAsia="Consolas" w:hAnsi="Consolas" w:cs="Consolas"/>
                 <w:color w:val="1F2328"/>
               </w:rPr>
-              <w:t xml:space="preserve"> Secure JWT authentication</w:t>
-            </w:r>
-          </w:p>
-          <w:p>
-            <w:pPr>
-              <w:spacing w:after="0"/>
-            </w:pPr>
-            <w:r>
-              <w:rPr>
-                <w:color w:val="707070"/>
-              </w:rPr>
-              <w:t xml:space="preserve">19     </w:t>
-            </w:r>
-            <w:r>
-              <w:rPr>
-                <w:rFonts w:ascii="Consolas" w:hAnsi="Consolas" w:eastAsia="Consolas" w:cs="Consolas"/>
-                <w:color w:val="953800"/>
-              </w:rPr>
-              <w:t>-</w:t>
-            </w:r>
-            <w:r>
-              <w:rPr>
-                <w:rFonts w:ascii="Consolas" w:hAnsi="Consolas" w:eastAsia="Consolas" w:cs="Consolas"/>
-                <w:color w:val="1F2328"/>
-              </w:rPr>
-              <w:t xml:space="preserve"> Protected APIs</w:t>
-            </w:r>
-          </w:p>
-          <w:p>
-            <w:pPr>
-              <w:spacing w:after="0"/>
-            </w:pPr>
-            <w:r>
-              <w:rPr>
-                <w:color w:val="707070"/>
-              </w:rPr>
-              <w:t xml:space="preserve">20     </w:t>
-            </w:r>
-          </w:p>
-          <w:p>
-            <w:pPr>
-              <w:spacing w:after="0"/>
-            </w:pPr>
-            <w:r>
-              <w:rPr>
-                <w:color w:val="707070"/>
-              </w:rPr>
-              <w:t xml:space="preserve">21     </w:t>
-            </w:r>
-            <w:r>
-              <w:rPr>
-                <w:rFonts w:ascii="Consolas" w:hAnsi="Consolas" w:eastAsia="Consolas" w:cs="Consolas"/>
+              <w:t xml:space="preserve"> Mobile app</w:t>
+            </w:r>
+          </w:p>
+          <w:p>
+            <w:pPr>
+              <w:spacing w:after="0"/>
+            </w:pPr>
+            <w:r>
+              <w:rPr>
+                <w:color w:val="707070"/>
+              </w:rPr>
+              <w:t xml:space="preserve">33     </w:t>
+            </w:r>
+          </w:p>
+          <w:p>
+            <w:pPr>
+              <w:spacing w:after="0"/>
+            </w:pPr>
+            <w:r>
+              <w:rPr>
+                <w:color w:val="707070"/>
+              </w:rPr>
+              <w:t xml:space="preserve">34     </w:t>
+            </w:r>
+            <w:r>
+              <w:rPr>
+                <w:rFonts w:ascii="Consolas" w:eastAsia="Consolas" w:hAnsi="Consolas" w:cs="Consolas"/>
                 <w:color w:val="0550AE"/>
               </w:rPr>
-              <w:t>## How It Works</w:t>
-            </w:r>
-          </w:p>
-          <w:p>
-            <w:pPr>
-              <w:spacing w:after="0"/>
-            </w:pPr>
-            <w:r>
-              <w:rPr>
-                <w:color w:val="707070"/>
-              </w:rPr>
-              <w:t xml:space="preserve">22     </w:t>
-            </w:r>
-            <w:r>
-              <w:rPr>
-                <w:rFonts w:ascii="Consolas" w:hAnsi="Consolas" w:eastAsia="Consolas" w:cs="Consolas"/>
-                <w:color w:val="953800"/>
-              </w:rPr>
-              <w:t>1.</w:t>
-            </w:r>
-            <w:r>
-              <w:rPr>
-                <w:rFonts w:ascii="Consolas" w:hAnsi="Consolas" w:eastAsia="Consolas" w:cs="Consolas"/>
-                <w:color w:val="1F2328"/>
-              </w:rPr>
-              <w:t xml:space="preserve"> Users log in to receive a JWT token</w:t>
-            </w:r>
-          </w:p>
-          <w:p>
-            <w:pPr>
-              <w:spacing w:after="0"/>
-            </w:pPr>
-            <w:r>
-              <w:rPr>
-                <w:color w:val="707070"/>
-              </w:rPr>
-              <w:t xml:space="preserve">23     </w:t>
-            </w:r>
-            <w:r>
-              <w:rPr>
-                <w:rFonts w:ascii="Consolas" w:hAnsi="Consolas" w:eastAsia="Consolas" w:cs="Consolas"/>
-                <w:color w:val="953800"/>
-              </w:rPr>
-              <w:t>2.</w:t>
-            </w:r>
-            <w:r>
-              <w:rPr>
-                <w:rFonts w:ascii="Consolas" w:hAnsi="Consolas" w:eastAsia="Consolas" w:cs="Consolas"/>
-                <w:color w:val="1F2328"/>
-              </w:rPr>
-              <w:t xml:space="preserve"> Authenticated users access protected APIs</w:t>
-            </w:r>
-          </w:p>
-          <w:p>
-            <w:pPr>
-              <w:spacing w:after="0"/>
-            </w:pPr>
-            <w:r>
-              <w:rPr>
-                <w:color w:val="707070"/>
-              </w:rPr>
-              <w:t xml:space="preserve">24     </w:t>
-            </w:r>
-            <w:r>
-              <w:rPr>
-                <w:rFonts w:ascii="Consolas" w:hAnsi="Consolas" w:eastAsia="Consolas" w:cs="Consolas"/>
-                <w:color w:val="953800"/>
-              </w:rPr>
-              <w:t>3.</w:t>
-            </w:r>
-            <w:r>
-              <w:rPr>
-                <w:rFonts w:ascii="Consolas" w:hAnsi="Consolas" w:eastAsia="Consolas" w:cs="Consolas"/>
-                <w:color w:val="1F2328"/>
-              </w:rPr>
-              <w:t xml:space="preserve"> Backend computes irrigation scores dynamically</w:t>
-            </w:r>
-          </w:p>
-          <w:p>
-            <w:pPr>
-              <w:spacing w:after="0"/>
-            </w:pPr>
-            <w:r>
-              <w:rPr>
-                <w:color w:val="707070"/>
-              </w:rPr>
-              <w:t xml:space="preserve">25     </w:t>
-            </w:r>
-            <w:r>
-              <w:rPr>
-                <w:rFonts w:ascii="Consolas" w:hAnsi="Consolas" w:eastAsia="Consolas" w:cs="Consolas"/>
-                <w:color w:val="953800"/>
-              </w:rPr>
-              <w:t>4.</w:t>
-            </w:r>
-            <w:r>
-              <w:rPr>
-                <w:rFonts w:ascii="Consolas" w:hAnsi="Consolas" w:eastAsia="Consolas" w:cs="Consolas"/>
-                <w:color w:val="1F2328"/>
-              </w:rPr>
-              <w:t xml:space="preserve"> Frontend auto‑refreshes and renders results</w:t>
-            </w:r>
-          </w:p>
-          <w:p>
-            <w:pPr>
-              <w:spacing w:after="0"/>
-            </w:pPr>
-            <w:r>
-              <w:rPr>
-                <w:color w:val="707070"/>
-              </w:rPr>
-              <w:t xml:space="preserve">26     </w:t>
-            </w:r>
-          </w:p>
-          <w:p>
-            <w:pPr>
-              <w:spacing w:after="0"/>
-            </w:pPr>
-            <w:r>
-              <w:rPr>
-                <w:color w:val="707070"/>
-              </w:rPr>
-              <w:t xml:space="preserve">27     </w:t>
-            </w:r>
-            <w:r>
-              <w:rPr>
-                <w:rFonts w:ascii="Consolas" w:hAnsi="Consolas" w:eastAsia="Consolas" w:cs="Consolas"/>
-                <w:color w:val="0550AE"/>
-              </w:rPr>
-              <w:t>## Future Enhancements</w:t>
-            </w:r>
-          </w:p>
-          <w:p>
-            <w:pPr>
-              <w:spacing w:after="0"/>
-            </w:pPr>
-            <w:r>
-              <w:rPr>
-                <w:color w:val="707070"/>
-              </w:rPr>
-              <w:t xml:space="preserve">28     </w:t>
-            </w:r>
-            <w:r>
-              <w:rPr>
-                <w:rFonts w:ascii="Consolas" w:hAnsi="Consolas" w:eastAsia="Consolas" w:cs="Consolas"/>
-                <w:color w:val="953800"/>
-              </w:rPr>
-              <w:t>-</w:t>
-            </w:r>
-            <w:r>
-              <w:rPr>
-                <w:rFonts w:ascii="Consolas" w:hAnsi="Consolas" w:eastAsia="Consolas" w:cs="Consolas"/>
-                <w:color w:val="1F2328"/>
-              </w:rPr>
-              <w:t xml:space="preserve"> Real IoT sensor integration</w:t>
-            </w:r>
-          </w:p>
-          <w:p>
-            <w:pPr>
-              <w:spacing w:after="0"/>
-            </w:pPr>
-            <w:r>
-              <w:rPr>
-                <w:color w:val="707070"/>
-              </w:rPr>
-              <w:t xml:space="preserve">29     </w:t>
-            </w:r>
-            <w:r>
-              <w:rPr>
-                <w:rFonts w:ascii="Consolas" w:hAnsi="Consolas" w:eastAsia="Consolas" w:cs="Consolas"/>
-                <w:color w:val="953800"/>
-              </w:rPr>
-              <w:t>-</w:t>
-            </w:r>
-            <w:r>
-              <w:rPr>
-                <w:rFonts w:ascii="Consolas" w:hAnsi="Consolas" w:eastAsia="Consolas" w:cs="Consolas"/>
-                <w:color w:val="1F2328"/>
-              </w:rPr>
-              <w:t xml:space="preserve"> SMS alerts</w:t>
-            </w:r>
-          </w:p>
-          <w:p>
-            <w:pPr>
-              <w:spacing w:after="0"/>
-            </w:pPr>
-            <w:r>
-              <w:rPr>
-                <w:color w:val="707070"/>
-              </w:rPr>
-              <w:t xml:space="preserve">30     </w:t>
-            </w:r>
-            <w:r>
-              <w:rPr>
-                <w:rFonts w:ascii="Consolas" w:hAnsi="Consolas" w:eastAsia="Consolas" w:cs="Consolas"/>
-                <w:color w:val="953800"/>
-              </w:rPr>
-              <w:t>-</w:t>
-            </w:r>
-            <w:r>
-              <w:rPr>
-                <w:rFonts w:ascii="Consolas" w:hAnsi="Consolas" w:eastAsia="Consolas" w:cs="Consolas"/>
-                <w:color w:val="1F2328"/>
-              </w:rPr>
-              <w:t xml:space="preserve"> Crop‑specific models</w:t>
-            </w:r>
-          </w:p>
-          <w:p>
-            <w:pPr>
-              <w:spacing w:after="0"/>
-            </w:pPr>
-            <w:r>
-              <w:rPr>
-                <w:color w:val="707070"/>
-              </w:rPr>
-              <w:t xml:space="preserve">31     </w:t>
-            </w:r>
-            <w:r>
-              <w:rPr>
-                <w:rFonts w:ascii="Consolas" w:hAnsi="Consolas" w:eastAsia="Consolas" w:cs="Consolas"/>
-                <w:color w:val="953800"/>
-              </w:rPr>
-              <w:t>-</w:t>
-            </w:r>
-            <w:r>
-              <w:rPr>
-                <w:rFonts w:ascii="Consolas" w:hAnsi="Consolas" w:eastAsia="Consolas" w:cs="Consolas"/>
-                <w:color w:val="1F2328"/>
-              </w:rPr>
-              <w:t xml:space="preserve"> Cloud deployment</w:t>
-            </w:r>
-          </w:p>
-          <w:p>
-            <w:pPr>
-              <w:spacing w:after="0"/>
-            </w:pPr>
-            <w:r>
-              <w:rPr>
-                <w:color w:val="707070"/>
-              </w:rPr>
-              <w:t xml:space="preserve">32     </w:t>
-            </w:r>
-            <w:r>
-              <w:rPr>
-                <w:rFonts w:ascii="Consolas" w:hAnsi="Consolas" w:eastAsia="Consolas" w:cs="Consolas"/>
-                <w:color w:val="953800"/>
-              </w:rPr>
-              <w:t>-</w:t>
-            </w:r>
-            <w:r>
-              <w:rPr>
-                <w:rFonts w:ascii="Consolas" w:hAnsi="Consolas" w:eastAsia="Consolas" w:cs="Consolas"/>
-                <w:color w:val="1F2328"/>
-              </w:rPr>
-              <w:t xml:space="preserve"> Mobile app</w:t>
-            </w:r>
-          </w:p>
-          <w:p>
-            <w:pPr>
-              <w:spacing w:after="0"/>
-            </w:pPr>
-            <w:r>
-              <w:rPr>
-                <w:color w:val="707070"/>
-              </w:rPr>
-              <w:t xml:space="preserve">33     </w:t>
-            </w:r>
-          </w:p>
-          <w:p>
-            <w:pPr>
-              <w:spacing w:after="0"/>
-            </w:pPr>
-            <w:r>
-              <w:rPr>
-                <w:color w:val="707070"/>
-              </w:rPr>
-              <w:t xml:space="preserve">34     </w:t>
-            </w:r>
-            <w:r>
-              <w:rPr>
-                <w:rFonts w:ascii="Consolas" w:hAnsi="Consolas" w:eastAsia="Consolas" w:cs="Consolas"/>
-                <w:color w:val="0550AE"/>
-              </w:rPr>
               <w:t>## Disclaimer</w:t>
             </w:r>
           </w:p>
@@ -1882,7 +1810,7 @@
             </w:r>
             <w:r>
               <w:rPr>
-                <w:rFonts w:ascii="Consolas" w:hAnsi="Consolas" w:eastAsia="Consolas" w:cs="Consolas"/>
+                <w:rFonts w:ascii="Consolas" w:eastAsia="Consolas" w:hAnsi="Consolas" w:cs="Consolas"/>
                 <w:color w:val="1F2328"/>
               </w:rPr>
               <w:t>Sensor data is simulated for hackathon and demo purposes.</w:t>
@@ -1894,7 +1822,7 @@
     <w:p>
       <w:pPr>
         <w:pBdr>
-          <w:top w:val="single" w:color="auto" w:sz="12" w:space="0"/>
+          <w:top w:val="single" w:sz="12" w:space="0" w:color="auto"/>
         </w:pBdr>
         <w:spacing w:after="0"/>
       </w:pPr>
@@ -1904,61 +1832,32 @@
         <w:pStyle w:val="Heading1"/>
       </w:pPr>
       <w:r>
-        <w:t>✅</w:t>
-      </w:r>
-      <w:r>
-        <w:t xml:space="preserve"> ✅ FINAL VERDICT</w:t>
+        <w:t>✅ ✅ FINAL VERDICT</w:t>
       </w:r>
     </w:p>
     <w:p>
       <w:pPr>
         <w:rPr>
-          <w:b w:val="1"/>
-          <w:bCs w:val="1"/>
+          <w:b/>
+          <w:bCs/>
         </w:rPr>
       </w:pPr>
       <w:r>
-        <w:rPr/>
-        <w:t>🎉</w:t>
-      </w:r>
-      <w:r>
-        <w:rPr/>
-        <w:t xml:space="preserve"> </w:t>
+        <w:t xml:space="preserve">🎉 </w:t>
       </w:r>
       <w:r>
         <w:rPr>
-          <w:b w:val="1"/>
-          <w:bCs w:val="1"/>
+          <w:b/>
+          <w:bCs/>
         </w:rPr>
-        <w:t xml:space="preserve">Full Stack </w:t>
+        <w:t>Full Stack Prcesion weather monitoring app. Built -</w:t>
       </w:r>
       <w:r>
         <w:rPr>
-          <w:b w:val="1"/>
-          <w:bCs w:val="1"/>
+          <w:b/>
+          <w:bCs/>
         </w:rPr>
-        <w:t>Prcesion</w:t>
-      </w:r>
-      <w:r>
-        <w:rPr>
-          <w:b w:val="1"/>
-          <w:bCs w:val="1"/>
-        </w:rPr>
-        <w:t xml:space="preserve"> weather monitoring app. Built -</w:t>
-      </w:r>
-      <w:r>
-        <w:rPr>
-          <w:b w:val="1"/>
-          <w:bCs w:val="1"/>
-        </w:rPr>
-        <w:t xml:space="preserve"> </w:t>
-      </w:r>
-      <w:r>
-        <w:rPr>
-          <w:b w:val="1"/>
-          <w:bCs w:val="1"/>
-        </w:rPr>
-        <w:t>COMPLETED ALL STEPS SUCCESSFULLY</w:t>
+        <w:t xml:space="preserve"> COMPLETED ALL STEPS SUCCESSFULLY</w:t>
       </w:r>
     </w:p>
     <w:tbl>
@@ -1966,12 +1865,12 @@
         <w:tblStyle w:val="GridTable4-Accent1"/>
         <w:tblW w:w="100" w:type="auto"/>
         <w:tblBorders>
-          <w:top w:val="single" w:color="auto" w:sz="4" w:space="0"/>
-          <w:left w:val="single" w:color="auto" w:sz="4" w:space="0"/>
-          <w:bottom w:val="single" w:color="auto" w:sz="4" w:space="0"/>
-          <w:right w:val="single" w:color="auto" w:sz="4" w:space="0"/>
-          <w:insideH w:val="single" w:color="auto" w:sz="4" w:space="0"/>
-          <w:insideV w:val="single" w:color="auto" w:sz="4" w:space="0"/>
+          <w:top w:val="single" w:sz="4" w:space="0" w:color="auto"/>
+          <w:left w:val="single" w:sz="4" w:space="0" w:color="auto"/>
+          <w:bottom w:val="single" w:sz="4" w:space="0" w:color="auto"/>
+          <w:right w:val="single" w:sz="4" w:space="0" w:color="auto"/>
+          <w:insideH w:val="single" w:sz="4" w:space="0" w:color="auto"/>
+          <w:insideV w:val="single" w:sz="4" w:space="0" w:color="auto"/>
         </w:tblBorders>
         <w:tblLook w:val="04A0" w:firstRow="1" w:lastRow="0" w:firstColumn="1" w:lastColumn="0" w:noHBand="0" w:noVBand="1"/>
       </w:tblPr>
@@ -2222,24 +2121,20 @@
     <w:p>
       <w:pPr>
         <w:pBdr>
-          <w:top w:val="single" w:color="auto" w:sz="12" w:space="0"/>
+          <w:top w:val="single" w:sz="12" w:space="0" w:color="auto"/>
         </w:pBdr>
         <w:spacing w:after="0"/>
       </w:pPr>
     </w:p>
     <w:p>
       <w:r>
-        <w:rPr/>
-        <w:t>✅</w:t>
-      </w:r>
-      <w:r>
-        <w:rPr/>
-        <w:t xml:space="preserve"> A </w:t>
+        <w:lastRenderedPageBreak/>
+        <w:t xml:space="preserve">✅ A </w:t>
       </w:r>
       <w:r>
         <w:rPr>
-          <w:b w:val="1"/>
-          <w:bCs w:val="1"/>
+          <w:b/>
+          <w:bCs/>
         </w:rPr>
         <w:t>complete full‑stack application</w:t>
       </w:r>
@@ -2248,15 +2143,12 @@
       </w:r>
       <w:r>
         <w:br/>
-      </w:r>
-      <w:r>
-        <w:rPr/>
         <w:t xml:space="preserve">✅ A </w:t>
       </w:r>
       <w:r>
         <w:rPr>
-          <w:b w:val="1"/>
-          <w:bCs w:val="1"/>
+          <w:b/>
+          <w:bCs/>
         </w:rPr>
         <w:t>real enterprise‑grade architecture</w:t>
       </w:r>
@@ -2267,7 +2159,7 @@
     <w:p>
       <w:pPr>
         <w:pBdr>
-          <w:top w:val="single" w:color="auto" w:sz="12" w:space="0"/>
+          <w:top w:val="single" w:sz="12" w:space="0" w:color="auto"/>
         </w:pBdr>
         <w:spacing w:after="0"/>
       </w:pPr>
@@ -2280,7 +2172,7 @@
       <w:footerReference w:type="default" r:id="rId10"/>
       <w:headerReference w:type="first" r:id="rId11"/>
       <w:footerReference w:type="first" r:id="rId12"/>
-      <w:pgSz w:w="11906" w:h="16838" w:orient="portrait"/>
+      <w:pgSz w:w="11906" w:h="16838"/>
       <w:pgMar w:top="1440" w:right="1440" w:bottom="1440" w:left="1440" w:header="708" w:footer="708" w:gutter="0"/>
       <w:cols w:space="720"/>
       <w:docGrid w:linePitch="360"/>
@@ -2290,7 +2182,7 @@
 </file>
 
 <file path=word/endnotes.xml><?xml version="1.0" encoding="utf-8"?>
-<w:endnotes xmlns:wpc="http://schemas.microsoft.com/office/word/2010/wordprocessingCanvas" xmlns:cx="http://schemas.microsoft.com/office/drawing/2014/chartex" xmlns:cx1="http://schemas.microsoft.com/office/drawing/2015/9/8/chartex" xmlns:cx2="http://schemas.microsoft.com/office/drawing/2015/10/21/chartex" xmlns:cx3="http://schemas.microsoft.com/office/drawing/2016/5/9/chartex" xmlns:cx4="http://schemas.microsoft.com/office/drawing/2016/5/10/chartex" xmlns:cx5="http://schemas.microsoft.com/office/drawing/2016/5/11/chartex" xmlns:cx6="http://schemas.microsoft.com/office/drawing/2016/5/12/chartex" xmlns:cx7="http://schemas.microsoft.com/office/drawing/2016/5/13/chartex" xmlns:cx8="http://schemas.microsoft.com/office/drawing/2016/5/14/chartex" xmlns:mc="http://schemas.openxmlformats.org/markup-compatibility/2006" xmlns:aink="http://schemas.microsoft.com/office/drawing/2016/ink" xmlns:am3d="http://schemas.microsoft.com/office/drawing/2017/model3d" xmlns:o="urn:schemas-microsoft-com:office:office" xmlns:oel="http://schemas.microsoft.com/office/2019/extlst" xmlns:r="http://schemas.openxmlformats.org/officeDocument/2006/relationships" xmlns:m="http://schemas.openxmlformats.org/officeDocument/2006/math" xmlns:v="urn:schemas-microsoft-com:vml" xmlns:wp14="http://schemas.microsoft.com/office/word/2010/wordprocessingDrawing" xmlns:wp="http://schemas.openxmlformats.org/drawingml/2006/wordprocessingDrawing" xmlns:w10="urn:schemas-microsoft-com:office:word" xmlns:w="http://schemas.openxmlformats.org/wordprocessingml/2006/main" xmlns:w14="http://schemas.microsoft.com/office/word/2010/wordml" xmlns:w15="http://schemas.microsoft.com/office/word/2012/wordml" xmlns:w16cex="http://schemas.microsoft.com/office/word/2018/wordml/cex" xmlns:w16cid="http://schemas.microsoft.com/office/word/2016/wordml/cid" xmlns:w16="http://schemas.microsoft.com/office/word/2018/wordml" xmlns:w16du="http://schemas.microsoft.com/office/word/2023/wordml/word16du" xmlns:w16sdtdh="http://schemas.microsoft.com/office/word/2020/wordml/sdtdatahash" xmlns:w16sdtfl="http://schemas.microsoft.com/office/word/2024/wordml/sdtformatlock" xmlns:w16se="http://schemas.microsoft.com/office/word/2015/wordml/symex" xmlns:wpg="http://schemas.microsoft.com/office/word/2010/wordprocessingGroup" xmlns:wpi="http://schemas.microsoft.com/office/word/2010/wordprocessingInk" xmlns:wne="http://schemas.microsoft.com/office/word/2006/wordml" xmlns:wps="http://schemas.microsoft.com/office/word/2010/wordprocessingShape" mc:Ignorable="w14 w15 w16se w16cid w16 w16cex w16sdtdh w16sdtfl w16du wp14">
+<w:endnotes xmlns:wpc="http://schemas.microsoft.com/office/word/2010/wordprocessingCanvas" xmlns:cx="http://schemas.microsoft.com/office/drawing/2014/chartex" xmlns:cx1="http://schemas.microsoft.com/office/drawing/2015/9/8/chartex" xmlns:cx2="http://schemas.microsoft.com/office/drawing/2015/10/21/chartex" xmlns:cx3="http://schemas.microsoft.com/office/drawing/2016/5/9/chartex" xmlns:cx4="http://schemas.microsoft.com/office/drawing/2016/5/10/chartex" xmlns:cx5="http://schemas.microsoft.com/office/drawing/2016/5/11/chartex" xmlns:cx6="http://schemas.microsoft.com/office/drawing/2016/5/12/chartex" xmlns:cx7="http://schemas.microsoft.com/office/drawing/2016/5/13/chartex" xmlns:cx8="http://schemas.microsoft.com/office/drawing/2016/5/14/chartex" xmlns:mc="http://schemas.openxmlformats.org/markup-compatibility/2006" xmlns:aink="http://schemas.microsoft.com/office/drawing/2016/ink" xmlns:am3d="http://schemas.microsoft.com/office/drawing/2017/model3d" xmlns:o="urn:schemas-microsoft-com:office:office" xmlns:oel="http://schemas.microsoft.com/office/2019/extlst" xmlns:r="http://schemas.openxmlformats.org/officeDocument/2006/relationships" xmlns:m="http://schemas.openxmlformats.org/officeDocument/2006/math" xmlns:v="urn:schemas-microsoft-com:vml" xmlns:wp14="http://schemas.microsoft.com/office/word/2010/wordprocessingDrawing" xmlns:wp="http://schemas.openxmlformats.org/drawingml/2006/wordprocessingDrawing" xmlns:w10="urn:schemas-microsoft-com:office:word" xmlns:w="http://schemas.openxmlformats.org/wordprocessingml/2006/main" xmlns:w14="http://schemas.microsoft.com/office/word/2010/wordml" xmlns:w15="http://schemas.microsoft.com/office/word/2012/wordml" xmlns:w16cex="http://schemas.microsoft.com/office/word/2018/wordml/cex" xmlns:w16cid="http://schemas.microsoft.com/office/word/2016/wordml/cid" xmlns:w16="http://schemas.microsoft.com/office/word/2018/wordml" xmlns:w16du="http://schemas.microsoft.com/office/word/2023/wordml/word16du" xmlns:w16sdtdh="http://schemas.microsoft.com/office/word/2020/wordml/sdtdatahash" xmlns:w16se="http://schemas.microsoft.com/office/word/2015/wordml/symex" xmlns:wpg="http://schemas.microsoft.com/office/word/2010/wordprocessingGroup" xmlns:wpi="http://schemas.microsoft.com/office/word/2010/wordprocessingInk" xmlns:wne="http://schemas.microsoft.com/office/word/2006/wordml" xmlns:wps="http://schemas.microsoft.com/office/word/2010/wordprocessingShape" mc:Ignorable="w14 w15 w16se w16cid w16 w16cex w16sdtdh wp14">
   <w:endnote w:type="separator" w:id="-1">
     <w:p>
       <w:pPr>
@@ -2315,7 +2207,7 @@
 </file>
 
 <file path=word/footer1.xml><?xml version="1.0" encoding="utf-8"?>
-<w:ftr xmlns:wpc="http://schemas.microsoft.com/office/word/2010/wordprocessingCanvas" xmlns:cx="http://schemas.microsoft.com/office/drawing/2014/chartex" xmlns:cx1="http://schemas.microsoft.com/office/drawing/2015/9/8/chartex" xmlns:cx2="http://schemas.microsoft.com/office/drawing/2015/10/21/chartex" xmlns:cx3="http://schemas.microsoft.com/office/drawing/2016/5/9/chartex" xmlns:cx4="http://schemas.microsoft.com/office/drawing/2016/5/10/chartex" xmlns:cx5="http://schemas.microsoft.com/office/drawing/2016/5/11/chartex" xmlns:cx6="http://schemas.microsoft.com/office/drawing/2016/5/12/chartex" xmlns:cx7="http://schemas.microsoft.com/office/drawing/2016/5/13/chartex" xmlns:cx8="http://schemas.microsoft.com/office/drawing/2016/5/14/chartex" xmlns:mc="http://schemas.openxmlformats.org/markup-compatibility/2006" xmlns:aink="http://schemas.microsoft.com/office/drawing/2016/ink" xmlns:am3d="http://schemas.microsoft.com/office/drawing/2017/model3d" xmlns:o="urn:schemas-microsoft-com:office:office" xmlns:oel="http://schemas.microsoft.com/office/2019/extlst" xmlns:r="http://schemas.openxmlformats.org/officeDocument/2006/relationships" xmlns:m="http://schemas.openxmlformats.org/officeDocument/2006/math" xmlns:v="urn:schemas-microsoft-com:vml" xmlns:wp14="http://schemas.microsoft.com/office/word/2010/wordprocessingDrawing" xmlns:wp="http://schemas.openxmlformats.org/drawingml/2006/wordprocessingDrawing" xmlns:w10="urn:schemas-microsoft-com:office:word" xmlns:w="http://schemas.openxmlformats.org/wordprocessingml/2006/main" xmlns:w14="http://schemas.microsoft.com/office/word/2010/wordml" xmlns:w15="http://schemas.microsoft.com/office/word/2012/wordml" xmlns:w16cex="http://schemas.microsoft.com/office/word/2018/wordml/cex" xmlns:w16cid="http://schemas.microsoft.com/office/word/2016/wordml/cid" xmlns:w16="http://schemas.microsoft.com/office/word/2018/wordml" xmlns:w16du="http://schemas.microsoft.com/office/word/2023/wordml/word16du" xmlns:w16sdtdh="http://schemas.microsoft.com/office/word/2020/wordml/sdtdatahash" xmlns:w16sdtfl="http://schemas.microsoft.com/office/word/2024/wordml/sdtformatlock" xmlns:w16se="http://schemas.microsoft.com/office/word/2015/wordml/symex" xmlns:wpg="http://schemas.microsoft.com/office/word/2010/wordprocessingGroup" xmlns:wpi="http://schemas.microsoft.com/office/word/2010/wordprocessingInk" xmlns:wne="http://schemas.microsoft.com/office/word/2006/wordml" xmlns:wps="http://schemas.microsoft.com/office/word/2010/wordprocessingShape" xmlns:a="http://schemas.openxmlformats.org/drawingml/2006/main" xmlns:aclsh="http://schemas.microsoft.com/office/drawing/2020/classificationShape" mc:Ignorable="w14 w15 w16se w16cid w16 w16cex w16sdtdh w16sdtfl w16du wp14">
+<w:ftr xmlns:wpc="http://schemas.microsoft.com/office/word/2010/wordprocessingCanvas" xmlns:cx="http://schemas.microsoft.com/office/drawing/2014/chartex" xmlns:cx1="http://schemas.microsoft.com/office/drawing/2015/9/8/chartex" xmlns:cx2="http://schemas.microsoft.com/office/drawing/2015/10/21/chartex" xmlns:cx3="http://schemas.microsoft.com/office/drawing/2016/5/9/chartex" xmlns:cx4="http://schemas.microsoft.com/office/drawing/2016/5/10/chartex" xmlns:cx5="http://schemas.microsoft.com/office/drawing/2016/5/11/chartex" xmlns:cx6="http://schemas.microsoft.com/office/drawing/2016/5/12/chartex" xmlns:cx7="http://schemas.microsoft.com/office/drawing/2016/5/13/chartex" xmlns:cx8="http://schemas.microsoft.com/office/drawing/2016/5/14/chartex" xmlns:mc="http://schemas.openxmlformats.org/markup-compatibility/2006" xmlns:aink="http://schemas.microsoft.com/office/drawing/2016/ink" xmlns:am3d="http://schemas.microsoft.com/office/drawing/2017/model3d" xmlns:o="urn:schemas-microsoft-com:office:office" xmlns:oel="http://schemas.microsoft.com/office/2019/extlst" xmlns:r="http://schemas.openxmlformats.org/officeDocument/2006/relationships" xmlns:m="http://schemas.openxmlformats.org/officeDocument/2006/math" xmlns:v="urn:schemas-microsoft-com:vml" xmlns:wp14="http://schemas.microsoft.com/office/word/2010/wordprocessingDrawing" xmlns:wp="http://schemas.openxmlformats.org/drawingml/2006/wordprocessingDrawing" xmlns:w10="urn:schemas-microsoft-com:office:word" xmlns:w="http://schemas.openxmlformats.org/wordprocessingml/2006/main" xmlns:w14="http://schemas.microsoft.com/office/word/2010/wordml" xmlns:w15="http://schemas.microsoft.com/office/word/2012/wordml" xmlns:w16cex="http://schemas.microsoft.com/office/word/2018/wordml/cex" xmlns:w16cid="http://schemas.microsoft.com/office/word/2016/wordml/cid" xmlns:w16="http://schemas.microsoft.com/office/word/2018/wordml" xmlns:w16du="http://schemas.microsoft.com/office/word/2023/wordml/word16du" xmlns:w16sdtdh="http://schemas.microsoft.com/office/word/2020/wordml/sdtdatahash" xmlns:w16se="http://schemas.microsoft.com/office/word/2015/wordml/symex" xmlns:wpg="http://schemas.microsoft.com/office/word/2010/wordprocessingGroup" xmlns:wpi="http://schemas.microsoft.com/office/word/2010/wordprocessingInk" xmlns:wne="http://schemas.microsoft.com/office/word/2006/wordml" xmlns:wps="http://schemas.microsoft.com/office/word/2010/wordprocessingShape" mc:Ignorable="w14 w15 w16se w16cid w16 w16cex w16sdtdh wp14">
   <w:p>
     <w:pPr>
       <w:pStyle w:val="Footer"/>
@@ -2369,7 +2261,7 @@
                           <w:pPr>
                             <w:spacing w:after="0"/>
                             <w:rPr>
-                              <w:rFonts w:ascii="Century Gothic" w:hAnsi="Century Gothic" w:eastAsia="Century Gothic" w:cs="Century Gothic"/>
+                              <w:rFonts w:ascii="Century Gothic" w:eastAsia="Century Gothic" w:hAnsi="Century Gothic" w:cs="Century Gothic"/>
                               <w:noProof/>
                               <w:color w:val="5514B4"/>
                               <w:sz w:val="18"/>
@@ -2378,7 +2270,7 @@
                           </w:pPr>
                           <w:r>
                             <w:rPr>
-                              <w:rFonts w:ascii="Century Gothic" w:hAnsi="Century Gothic" w:eastAsia="Century Gothic" w:cs="Century Gothic"/>
+                              <w:rFonts w:ascii="Century Gothic" w:eastAsia="Century Gothic" w:hAnsi="Century Gothic" w:cs="Century Gothic"/>
                               <w:noProof/>
                               <w:color w:val="5514B4"/>
                               <w:sz w:val="18"/>
@@ -2401,7 +2293,7 @@
             </wp:anchor>
           </w:drawing>
         </mc:Choice>
-        <mc:Fallback>
+        <mc:Fallback xmlns:aclsh="http://schemas.microsoft.com/office/drawing/2020/classificationShape" xmlns:a="http://schemas.openxmlformats.org/drawingml/2006/main" xmlns:w16sdtfl="http://schemas.microsoft.com/office/word/2024/wordml/sdtformatlock">
           <w:pict w14:anchorId="5B92273F">
             <v:shapetype id="_x0000_t202" coordsize="21600,21600" o:spt="202" path="m,l,21600r21600,l21600,xe" w14:anchorId="1FE13AA2">
               <v:stroke joinstyle="miter"/>
@@ -2446,7 +2338,7 @@
 </file>
 
 <file path=word/footer2.xml><?xml version="1.0" encoding="utf-8"?>
-<w:ftr xmlns:wpc="http://schemas.microsoft.com/office/word/2010/wordprocessingCanvas" xmlns:cx="http://schemas.microsoft.com/office/drawing/2014/chartex" xmlns:cx1="http://schemas.microsoft.com/office/drawing/2015/9/8/chartex" xmlns:cx2="http://schemas.microsoft.com/office/drawing/2015/10/21/chartex" xmlns:cx3="http://schemas.microsoft.com/office/drawing/2016/5/9/chartex" xmlns:cx4="http://schemas.microsoft.com/office/drawing/2016/5/10/chartex" xmlns:cx5="http://schemas.microsoft.com/office/drawing/2016/5/11/chartex" xmlns:cx6="http://schemas.microsoft.com/office/drawing/2016/5/12/chartex" xmlns:cx7="http://schemas.microsoft.com/office/drawing/2016/5/13/chartex" xmlns:cx8="http://schemas.microsoft.com/office/drawing/2016/5/14/chartex" xmlns:mc="http://schemas.openxmlformats.org/markup-compatibility/2006" xmlns:aink="http://schemas.microsoft.com/office/drawing/2016/ink" xmlns:am3d="http://schemas.microsoft.com/office/drawing/2017/model3d" xmlns:o="urn:schemas-microsoft-com:office:office" xmlns:oel="http://schemas.microsoft.com/office/2019/extlst" xmlns:r="http://schemas.openxmlformats.org/officeDocument/2006/relationships" xmlns:m="http://schemas.openxmlformats.org/officeDocument/2006/math" xmlns:v="urn:schemas-microsoft-com:vml" xmlns:wp14="http://schemas.microsoft.com/office/word/2010/wordprocessingDrawing" xmlns:wp="http://schemas.openxmlformats.org/drawingml/2006/wordprocessingDrawing" xmlns:w10="urn:schemas-microsoft-com:office:word" xmlns:w="http://schemas.openxmlformats.org/wordprocessingml/2006/main" xmlns:w14="http://schemas.microsoft.com/office/word/2010/wordml" xmlns:w15="http://schemas.microsoft.com/office/word/2012/wordml" xmlns:w16cex="http://schemas.microsoft.com/office/word/2018/wordml/cex" xmlns:w16cid="http://schemas.microsoft.com/office/word/2016/wordml/cid" xmlns:w16="http://schemas.microsoft.com/office/word/2018/wordml" xmlns:w16du="http://schemas.microsoft.com/office/word/2023/wordml/word16du" xmlns:w16sdtdh="http://schemas.microsoft.com/office/word/2020/wordml/sdtdatahash" xmlns:w16sdtfl="http://schemas.microsoft.com/office/word/2024/wordml/sdtformatlock" xmlns:w16se="http://schemas.microsoft.com/office/word/2015/wordml/symex" xmlns:wpg="http://schemas.microsoft.com/office/word/2010/wordprocessingGroup" xmlns:wpi="http://schemas.microsoft.com/office/word/2010/wordprocessingInk" xmlns:wne="http://schemas.microsoft.com/office/word/2006/wordml" xmlns:wps="http://schemas.microsoft.com/office/word/2010/wordprocessingShape" xmlns:a="http://schemas.openxmlformats.org/drawingml/2006/main" xmlns:aclsh="http://schemas.microsoft.com/office/drawing/2020/classificationShape" mc:Ignorable="w14 w15 w16se w16cid w16 w16cex w16sdtdh w16sdtfl w16du wp14">
+<w:ftr xmlns:wpc="http://schemas.microsoft.com/office/word/2010/wordprocessingCanvas" xmlns:cx="http://schemas.microsoft.com/office/drawing/2014/chartex" xmlns:cx1="http://schemas.microsoft.com/office/drawing/2015/9/8/chartex" xmlns:cx2="http://schemas.microsoft.com/office/drawing/2015/10/21/chartex" xmlns:cx3="http://schemas.microsoft.com/office/drawing/2016/5/9/chartex" xmlns:cx4="http://schemas.microsoft.com/office/drawing/2016/5/10/chartex" xmlns:cx5="http://schemas.microsoft.com/office/drawing/2016/5/11/chartex" xmlns:cx6="http://schemas.microsoft.com/office/drawing/2016/5/12/chartex" xmlns:cx7="http://schemas.microsoft.com/office/drawing/2016/5/13/chartex" xmlns:cx8="http://schemas.microsoft.com/office/drawing/2016/5/14/chartex" xmlns:mc="http://schemas.openxmlformats.org/markup-compatibility/2006" xmlns:aink="http://schemas.microsoft.com/office/drawing/2016/ink" xmlns:am3d="http://schemas.microsoft.com/office/drawing/2017/model3d" xmlns:o="urn:schemas-microsoft-com:office:office" xmlns:oel="http://schemas.microsoft.com/office/2019/extlst" xmlns:r="http://schemas.openxmlformats.org/officeDocument/2006/relationships" xmlns:m="http://schemas.openxmlformats.org/officeDocument/2006/math" xmlns:v="urn:schemas-microsoft-com:vml" xmlns:wp14="http://schemas.microsoft.com/office/word/2010/wordprocessingDrawing" xmlns:wp="http://schemas.openxmlformats.org/drawingml/2006/wordprocessingDrawing" xmlns:w10="urn:schemas-microsoft-com:office:word" xmlns:w="http://schemas.openxmlformats.org/wordprocessingml/2006/main" xmlns:w14="http://schemas.microsoft.com/office/word/2010/wordml" xmlns:w15="http://schemas.microsoft.com/office/word/2012/wordml" xmlns:w16cex="http://schemas.microsoft.com/office/word/2018/wordml/cex" xmlns:w16cid="http://schemas.microsoft.com/office/word/2016/wordml/cid" xmlns:w16="http://schemas.microsoft.com/office/word/2018/wordml" xmlns:w16du="http://schemas.microsoft.com/office/word/2023/wordml/word16du" xmlns:w16sdtdh="http://schemas.microsoft.com/office/word/2020/wordml/sdtdatahash" xmlns:w16se="http://schemas.microsoft.com/office/word/2015/wordml/symex" xmlns:wpg="http://schemas.microsoft.com/office/word/2010/wordprocessingGroup" xmlns:wpi="http://schemas.microsoft.com/office/word/2010/wordprocessingInk" xmlns:wne="http://schemas.microsoft.com/office/word/2006/wordml" xmlns:wps="http://schemas.microsoft.com/office/word/2010/wordprocessingShape" mc:Ignorable="w14 w15 w16se w16cid w16 w16cex w16sdtdh wp14">
   <w:p>
     <w:pPr>
       <w:pStyle w:val="Footer"/>
@@ -2500,7 +2392,7 @@
                           <w:pPr>
                             <w:spacing w:after="0"/>
                             <w:rPr>
-                              <w:rFonts w:ascii="Century Gothic" w:hAnsi="Century Gothic" w:eastAsia="Century Gothic" w:cs="Century Gothic"/>
+                              <w:rFonts w:ascii="Century Gothic" w:eastAsia="Century Gothic" w:hAnsi="Century Gothic" w:cs="Century Gothic"/>
                               <w:noProof/>
                               <w:color w:val="5514B4"/>
                               <w:sz w:val="18"/>
@@ -2509,7 +2401,7 @@
                           </w:pPr>
                           <w:r>
                             <w:rPr>
-                              <w:rFonts w:ascii="Century Gothic" w:hAnsi="Century Gothic" w:eastAsia="Century Gothic" w:cs="Century Gothic"/>
+                              <w:rFonts w:ascii="Century Gothic" w:eastAsia="Century Gothic" w:hAnsi="Century Gothic" w:cs="Century Gothic"/>
                               <w:noProof/>
                               <w:color w:val="5514B4"/>
                               <w:sz w:val="18"/>
@@ -2532,7 +2424,7 @@
             </wp:anchor>
           </w:drawing>
         </mc:Choice>
-        <mc:Fallback>
+        <mc:Fallback xmlns:aclsh="http://schemas.microsoft.com/office/drawing/2020/classificationShape" xmlns:a="http://schemas.openxmlformats.org/drawingml/2006/main" xmlns:w16sdtfl="http://schemas.microsoft.com/office/word/2024/wordml/sdtformatlock">
           <w:pict w14:anchorId="5A26F6BC">
             <v:shapetype id="_x0000_t202" coordsize="21600,21600" o:spt="202" path="m,l,21600r21600,l21600,xe" w14:anchorId="1C7D1EB8">
               <v:stroke joinstyle="miter"/>
@@ -2577,7 +2469,7 @@
 </file>
 
 <file path=word/footer3.xml><?xml version="1.0" encoding="utf-8"?>
-<w:ftr xmlns:wpc="http://schemas.microsoft.com/office/word/2010/wordprocessingCanvas" xmlns:cx="http://schemas.microsoft.com/office/drawing/2014/chartex" xmlns:cx1="http://schemas.microsoft.com/office/drawing/2015/9/8/chartex" xmlns:cx2="http://schemas.microsoft.com/office/drawing/2015/10/21/chartex" xmlns:cx3="http://schemas.microsoft.com/office/drawing/2016/5/9/chartex" xmlns:cx4="http://schemas.microsoft.com/office/drawing/2016/5/10/chartex" xmlns:cx5="http://schemas.microsoft.com/office/drawing/2016/5/11/chartex" xmlns:cx6="http://schemas.microsoft.com/office/drawing/2016/5/12/chartex" xmlns:cx7="http://schemas.microsoft.com/office/drawing/2016/5/13/chartex" xmlns:cx8="http://schemas.microsoft.com/office/drawing/2016/5/14/chartex" xmlns:mc="http://schemas.openxmlformats.org/markup-compatibility/2006" xmlns:aink="http://schemas.microsoft.com/office/drawing/2016/ink" xmlns:am3d="http://schemas.microsoft.com/office/drawing/2017/model3d" xmlns:o="urn:schemas-microsoft-com:office:office" xmlns:oel="http://schemas.microsoft.com/office/2019/extlst" xmlns:r="http://schemas.openxmlformats.org/officeDocument/2006/relationships" xmlns:m="http://schemas.openxmlformats.org/officeDocument/2006/math" xmlns:v="urn:schemas-microsoft-com:vml" xmlns:wp14="http://schemas.microsoft.com/office/word/2010/wordprocessingDrawing" xmlns:wp="http://schemas.openxmlformats.org/drawingml/2006/wordprocessingDrawing" xmlns:w10="urn:schemas-microsoft-com:office:word" xmlns:w="http://schemas.openxmlformats.org/wordprocessingml/2006/main" xmlns:w14="http://schemas.microsoft.com/office/word/2010/wordml" xmlns:w15="http://schemas.microsoft.com/office/word/2012/wordml" xmlns:w16cex="http://schemas.microsoft.com/office/word/2018/wordml/cex" xmlns:w16cid="http://schemas.microsoft.com/office/word/2016/wordml/cid" xmlns:w16="http://schemas.microsoft.com/office/word/2018/wordml" xmlns:w16du="http://schemas.microsoft.com/office/word/2023/wordml/word16du" xmlns:w16sdtdh="http://schemas.microsoft.com/office/word/2020/wordml/sdtdatahash" xmlns:w16sdtfl="http://schemas.microsoft.com/office/word/2024/wordml/sdtformatlock" xmlns:w16se="http://schemas.microsoft.com/office/word/2015/wordml/symex" xmlns:wpg="http://schemas.microsoft.com/office/word/2010/wordprocessingGroup" xmlns:wpi="http://schemas.microsoft.com/office/word/2010/wordprocessingInk" xmlns:wne="http://schemas.microsoft.com/office/word/2006/wordml" xmlns:wps="http://schemas.microsoft.com/office/word/2010/wordprocessingShape" xmlns:a="http://schemas.openxmlformats.org/drawingml/2006/main" xmlns:aclsh="http://schemas.microsoft.com/office/drawing/2020/classificationShape" mc:Ignorable="w14 w15 w16se w16cid w16 w16cex w16sdtdh w16sdtfl w16du wp14">
+<w:ftr xmlns:wpc="http://schemas.microsoft.com/office/word/2010/wordprocessingCanvas" xmlns:cx="http://schemas.microsoft.com/office/drawing/2014/chartex" xmlns:cx1="http://schemas.microsoft.com/office/drawing/2015/9/8/chartex" xmlns:cx2="http://schemas.microsoft.com/office/drawing/2015/10/21/chartex" xmlns:cx3="http://schemas.microsoft.com/office/drawing/2016/5/9/chartex" xmlns:cx4="http://schemas.microsoft.com/office/drawing/2016/5/10/chartex" xmlns:cx5="http://schemas.microsoft.com/office/drawing/2016/5/11/chartex" xmlns:cx6="http://schemas.microsoft.com/office/drawing/2016/5/12/chartex" xmlns:cx7="http://schemas.microsoft.com/office/drawing/2016/5/13/chartex" xmlns:cx8="http://schemas.microsoft.com/office/drawing/2016/5/14/chartex" xmlns:mc="http://schemas.openxmlformats.org/markup-compatibility/2006" xmlns:aink="http://schemas.microsoft.com/office/drawing/2016/ink" xmlns:am3d="http://schemas.microsoft.com/office/drawing/2017/model3d" xmlns:o="urn:schemas-microsoft-com:office:office" xmlns:oel="http://schemas.microsoft.com/office/2019/extlst" xmlns:r="http://schemas.openxmlformats.org/officeDocument/2006/relationships" xmlns:m="http://schemas.openxmlformats.org/officeDocument/2006/math" xmlns:v="urn:schemas-microsoft-com:vml" xmlns:wp14="http://schemas.microsoft.com/office/word/2010/wordprocessingDrawing" xmlns:wp="http://schemas.openxmlformats.org/drawingml/2006/wordprocessingDrawing" xmlns:w10="urn:schemas-microsoft-com:office:word" xmlns:w="http://schemas.openxmlformats.org/wordprocessingml/2006/main" xmlns:w14="http://schemas.microsoft.com/office/word/2010/wordml" xmlns:w15="http://schemas.microsoft.com/office/word/2012/wordml" xmlns:w16cex="http://schemas.microsoft.com/office/word/2018/wordml/cex" xmlns:w16cid="http://schemas.microsoft.com/office/word/2016/wordml/cid" xmlns:w16="http://schemas.microsoft.com/office/word/2018/wordml" xmlns:w16du="http://schemas.microsoft.com/office/word/2023/wordml/word16du" xmlns:w16sdtdh="http://schemas.microsoft.com/office/word/2020/wordml/sdtdatahash" xmlns:w16se="http://schemas.microsoft.com/office/word/2015/wordml/symex" xmlns:wpg="http://schemas.microsoft.com/office/word/2010/wordprocessingGroup" xmlns:wpi="http://schemas.microsoft.com/office/word/2010/wordprocessingInk" xmlns:wne="http://schemas.microsoft.com/office/word/2006/wordml" xmlns:wps="http://schemas.microsoft.com/office/word/2010/wordprocessingShape" mc:Ignorable="w14 w15 w16se w16cid w16 w16cex w16sdtdh wp14">
   <w:p>
     <w:pPr>
       <w:pStyle w:val="Footer"/>
@@ -2631,7 +2523,7 @@
                           <w:pPr>
                             <w:spacing w:after="0"/>
                             <w:rPr>
-                              <w:rFonts w:ascii="Century Gothic" w:hAnsi="Century Gothic" w:eastAsia="Century Gothic" w:cs="Century Gothic"/>
+                              <w:rFonts w:ascii="Century Gothic" w:eastAsia="Century Gothic" w:hAnsi="Century Gothic" w:cs="Century Gothic"/>
                               <w:noProof/>
                               <w:color w:val="5514B4"/>
                               <w:sz w:val="18"/>
@@ -2640,7 +2532,7 @@
                           </w:pPr>
                           <w:r>
                             <w:rPr>
-                              <w:rFonts w:ascii="Century Gothic" w:hAnsi="Century Gothic" w:eastAsia="Century Gothic" w:cs="Century Gothic"/>
+                              <w:rFonts w:ascii="Century Gothic" w:eastAsia="Century Gothic" w:hAnsi="Century Gothic" w:cs="Century Gothic"/>
                               <w:noProof/>
                               <w:color w:val="5514B4"/>
                               <w:sz w:val="18"/>
@@ -2663,7 +2555,7 @@
             </wp:anchor>
           </w:drawing>
         </mc:Choice>
-        <mc:Fallback>
+        <mc:Fallback xmlns:aclsh="http://schemas.microsoft.com/office/drawing/2020/classificationShape" xmlns:a="http://schemas.openxmlformats.org/drawingml/2006/main" xmlns:w16sdtfl="http://schemas.microsoft.com/office/word/2024/wordml/sdtformatlock">
           <w:pict w14:anchorId="2E216750">
             <v:shapetype id="_x0000_t202" coordsize="21600,21600" o:spt="202" path="m,l,21600r21600,l21600,xe" w14:anchorId="10D20D87">
               <v:stroke joinstyle="miter"/>
@@ -2708,7 +2600,7 @@
 </file>
 
 <file path=word/footnotes.xml><?xml version="1.0" encoding="utf-8"?>
-<w:footnotes xmlns:wpc="http://schemas.microsoft.com/office/word/2010/wordprocessingCanvas" xmlns:cx="http://schemas.microsoft.com/office/drawing/2014/chartex" xmlns:cx1="http://schemas.microsoft.com/office/drawing/2015/9/8/chartex" xmlns:cx2="http://schemas.microsoft.com/office/drawing/2015/10/21/chartex" xmlns:cx3="http://schemas.microsoft.com/office/drawing/2016/5/9/chartex" xmlns:cx4="http://schemas.microsoft.com/office/drawing/2016/5/10/chartex" xmlns:cx5="http://schemas.microsoft.com/office/drawing/2016/5/11/chartex" xmlns:cx6="http://schemas.microsoft.com/office/drawing/2016/5/12/chartex" xmlns:cx7="http://schemas.microsoft.com/office/drawing/2016/5/13/chartex" xmlns:cx8="http://schemas.microsoft.com/office/drawing/2016/5/14/chartex" xmlns:mc="http://schemas.openxmlformats.org/markup-compatibility/2006" xmlns:aink="http://schemas.microsoft.com/office/drawing/2016/ink" xmlns:am3d="http://schemas.microsoft.com/office/drawing/2017/model3d" xmlns:o="urn:schemas-microsoft-com:office:office" xmlns:oel="http://schemas.microsoft.com/office/2019/extlst" xmlns:r="http://schemas.openxmlformats.org/officeDocument/2006/relationships" xmlns:m="http://schemas.openxmlformats.org/officeDocument/2006/math" xmlns:v="urn:schemas-microsoft-com:vml" xmlns:wp14="http://schemas.microsoft.com/office/word/2010/wordprocessingDrawing" xmlns:wp="http://schemas.openxmlformats.org/drawingml/2006/wordprocessingDrawing" xmlns:w10="urn:schemas-microsoft-com:office:word" xmlns:w="http://schemas.openxmlformats.org/wordprocessingml/2006/main" xmlns:w14="http://schemas.microsoft.com/office/word/2010/wordml" xmlns:w15="http://schemas.microsoft.com/office/word/2012/wordml" xmlns:w16cex="http://schemas.microsoft.com/office/word/2018/wordml/cex" xmlns:w16cid="http://schemas.microsoft.com/office/word/2016/wordml/cid" xmlns:w16="http://schemas.microsoft.com/office/word/2018/wordml" xmlns:w16du="http://schemas.microsoft.com/office/word/2023/wordml/word16du" xmlns:w16sdtdh="http://schemas.microsoft.com/office/word/2020/wordml/sdtdatahash" xmlns:w16sdtfl="http://schemas.microsoft.com/office/word/2024/wordml/sdtformatlock" xmlns:w16se="http://schemas.microsoft.com/office/word/2015/wordml/symex" xmlns:wpg="http://schemas.microsoft.com/office/word/2010/wordprocessingGroup" xmlns:wpi="http://schemas.microsoft.com/office/word/2010/wordprocessingInk" xmlns:wne="http://schemas.microsoft.com/office/word/2006/wordml" xmlns:wps="http://schemas.microsoft.com/office/word/2010/wordprocessingShape" mc:Ignorable="w14 w15 w16se w16cid w16 w16cex w16sdtdh w16sdtfl w16du wp14">
+<w:footnotes xmlns:wpc="http://schemas.microsoft.com/office/word/2010/wordprocessingCanvas" xmlns:cx="http://schemas.microsoft.com/office/drawing/2014/chartex" xmlns:cx1="http://schemas.microsoft.com/office/drawing/2015/9/8/chartex" xmlns:cx2="http://schemas.microsoft.com/office/drawing/2015/10/21/chartex" xmlns:cx3="http://schemas.microsoft.com/office/drawing/2016/5/9/chartex" xmlns:cx4="http://schemas.microsoft.com/office/drawing/2016/5/10/chartex" xmlns:cx5="http://schemas.microsoft.com/office/drawing/2016/5/11/chartex" xmlns:cx6="http://schemas.microsoft.com/office/drawing/2016/5/12/chartex" xmlns:cx7="http://schemas.microsoft.com/office/drawing/2016/5/13/chartex" xmlns:cx8="http://schemas.microsoft.com/office/drawing/2016/5/14/chartex" xmlns:mc="http://schemas.openxmlformats.org/markup-compatibility/2006" xmlns:aink="http://schemas.microsoft.com/office/drawing/2016/ink" xmlns:am3d="http://schemas.microsoft.com/office/drawing/2017/model3d" xmlns:o="urn:schemas-microsoft-com:office:office" xmlns:oel="http://schemas.microsoft.com/office/2019/extlst" xmlns:r="http://schemas.openxmlformats.org/officeDocument/2006/relationships" xmlns:m="http://schemas.openxmlformats.org/officeDocument/2006/math" xmlns:v="urn:schemas-microsoft-com:vml" xmlns:wp14="http://schemas.microsoft.com/office/word/2010/wordprocessingDrawing" xmlns:wp="http://schemas.openxmlformats.org/drawingml/2006/wordprocessingDrawing" xmlns:w10="urn:schemas-microsoft-com:office:word" xmlns:w="http://schemas.openxmlformats.org/wordprocessingml/2006/main" xmlns:w14="http://schemas.microsoft.com/office/word/2010/wordml" xmlns:w15="http://schemas.microsoft.com/office/word/2012/wordml" xmlns:w16cex="http://schemas.microsoft.com/office/word/2018/wordml/cex" xmlns:w16cid="http://schemas.microsoft.com/office/word/2016/wordml/cid" xmlns:w16="http://schemas.microsoft.com/office/word/2018/wordml" xmlns:w16du="http://schemas.microsoft.com/office/word/2023/wordml/word16du" xmlns:w16sdtdh="http://schemas.microsoft.com/office/word/2020/wordml/sdtdatahash" xmlns:w16se="http://schemas.microsoft.com/office/word/2015/wordml/symex" xmlns:wpg="http://schemas.microsoft.com/office/word/2010/wordprocessingGroup" xmlns:wpi="http://schemas.microsoft.com/office/word/2010/wordprocessingInk" xmlns:wne="http://schemas.microsoft.com/office/word/2006/wordml" xmlns:wps="http://schemas.microsoft.com/office/word/2010/wordprocessingShape" mc:Ignorable="w14 w15 w16se w16cid w16 w16cex w16sdtdh wp14">
   <w:footnote w:type="separator" w:id="-1">
     <w:p>
       <w:pPr>
@@ -2733,7 +2625,7 @@
 </file>
 
 <file path=word/header1.xml><?xml version="1.0" encoding="utf-8"?>
-<w:hdr xmlns:wpc="http://schemas.microsoft.com/office/word/2010/wordprocessingCanvas" xmlns:cx="http://schemas.microsoft.com/office/drawing/2014/chartex" xmlns:cx1="http://schemas.microsoft.com/office/drawing/2015/9/8/chartex" xmlns:cx2="http://schemas.microsoft.com/office/drawing/2015/10/21/chartex" xmlns:cx3="http://schemas.microsoft.com/office/drawing/2016/5/9/chartex" xmlns:cx4="http://schemas.microsoft.com/office/drawing/2016/5/10/chartex" xmlns:cx5="http://schemas.microsoft.com/office/drawing/2016/5/11/chartex" xmlns:cx6="http://schemas.microsoft.com/office/drawing/2016/5/12/chartex" xmlns:cx7="http://schemas.microsoft.com/office/drawing/2016/5/13/chartex" xmlns:cx8="http://schemas.microsoft.com/office/drawing/2016/5/14/chartex" xmlns:mc="http://schemas.openxmlformats.org/markup-compatibility/2006" xmlns:aink="http://schemas.microsoft.com/office/drawing/2016/ink" xmlns:am3d="http://schemas.microsoft.com/office/drawing/2017/model3d" xmlns:o="urn:schemas-microsoft-com:office:office" xmlns:oel="http://schemas.microsoft.com/office/2019/extlst" xmlns:r="http://schemas.openxmlformats.org/officeDocument/2006/relationships" xmlns:m="http://schemas.openxmlformats.org/officeDocument/2006/math" xmlns:v="urn:schemas-microsoft-com:vml" xmlns:wp14="http://schemas.microsoft.com/office/word/2010/wordprocessingDrawing" xmlns:wp="http://schemas.openxmlformats.org/drawingml/2006/wordprocessingDrawing" xmlns:w10="urn:schemas-microsoft-com:office:word" xmlns:w="http://schemas.openxmlformats.org/wordprocessingml/2006/main" xmlns:w14="http://schemas.microsoft.com/office/word/2010/wordml" xmlns:w15="http://schemas.microsoft.com/office/word/2012/wordml" xmlns:w16cex="http://schemas.microsoft.com/office/word/2018/wordml/cex" xmlns:w16cid="http://schemas.microsoft.com/office/word/2016/wordml/cid" xmlns:w16="http://schemas.microsoft.com/office/word/2018/wordml" xmlns:w16du="http://schemas.microsoft.com/office/word/2023/wordml/word16du" xmlns:w16sdtdh="http://schemas.microsoft.com/office/word/2020/wordml/sdtdatahash" xmlns:w16sdtfl="http://schemas.microsoft.com/office/word/2024/wordml/sdtformatlock" xmlns:w16se="http://schemas.microsoft.com/office/word/2015/wordml/symex" xmlns:wpg="http://schemas.microsoft.com/office/word/2010/wordprocessingGroup" xmlns:wpi="http://schemas.microsoft.com/office/word/2010/wordprocessingInk" xmlns:wne="http://schemas.microsoft.com/office/word/2006/wordml" xmlns:wps="http://schemas.microsoft.com/office/word/2010/wordprocessingShape" xmlns:a="http://schemas.openxmlformats.org/drawingml/2006/main" xmlns:aclsh="http://schemas.microsoft.com/office/drawing/2020/classificationShape" mc:Ignorable="w14 w15 w16se w16cid w16 w16cex w16sdtdh w16sdtfl w16du wp14">
+<w:hdr xmlns:wpc="http://schemas.microsoft.com/office/word/2010/wordprocessingCanvas" xmlns:cx="http://schemas.microsoft.com/office/drawing/2014/chartex" xmlns:cx1="http://schemas.microsoft.com/office/drawing/2015/9/8/chartex" xmlns:cx2="http://schemas.microsoft.com/office/drawing/2015/10/21/chartex" xmlns:cx3="http://schemas.microsoft.com/office/drawing/2016/5/9/chartex" xmlns:cx4="http://schemas.microsoft.com/office/drawing/2016/5/10/chartex" xmlns:cx5="http://schemas.microsoft.com/office/drawing/2016/5/11/chartex" xmlns:cx6="http://schemas.microsoft.com/office/drawing/2016/5/12/chartex" xmlns:cx7="http://schemas.microsoft.com/office/drawing/2016/5/13/chartex" xmlns:cx8="http://schemas.microsoft.com/office/drawing/2016/5/14/chartex" xmlns:mc="http://schemas.openxmlformats.org/markup-compatibility/2006" xmlns:aink="http://schemas.microsoft.com/office/drawing/2016/ink" xmlns:am3d="http://schemas.microsoft.com/office/drawing/2017/model3d" xmlns:o="urn:schemas-microsoft-com:office:office" xmlns:oel="http://schemas.microsoft.com/office/2019/extlst" xmlns:r="http://schemas.openxmlformats.org/officeDocument/2006/relationships" xmlns:m="http://schemas.openxmlformats.org/officeDocument/2006/math" xmlns:v="urn:schemas-microsoft-com:vml" xmlns:wp14="http://schemas.microsoft.com/office/word/2010/wordprocessingDrawing" xmlns:wp="http://schemas.openxmlformats.org/drawingml/2006/wordprocessingDrawing" xmlns:w10="urn:schemas-microsoft-com:office:word" xmlns:w="http://schemas.openxmlformats.org/wordprocessingml/2006/main" xmlns:w14="http://schemas.microsoft.com/office/word/2010/wordml" xmlns:w15="http://schemas.microsoft.com/office/word/2012/wordml" xmlns:w16cex="http://schemas.microsoft.com/office/word/2018/wordml/cex" xmlns:w16cid="http://schemas.microsoft.com/office/word/2016/wordml/cid" xmlns:w16="http://schemas.microsoft.com/office/word/2018/wordml" xmlns:w16du="http://schemas.microsoft.com/office/word/2023/wordml/word16du" xmlns:w16sdtdh="http://schemas.microsoft.com/office/word/2020/wordml/sdtdatahash" xmlns:w16se="http://schemas.microsoft.com/office/word/2015/wordml/symex" xmlns:wpg="http://schemas.microsoft.com/office/word/2010/wordprocessingGroup" xmlns:wpi="http://schemas.microsoft.com/office/word/2010/wordprocessingInk" xmlns:wne="http://schemas.microsoft.com/office/word/2006/wordml" xmlns:wps="http://schemas.microsoft.com/office/word/2010/wordprocessingShape" mc:Ignorable="w14 w15 w16se w16cid w16 w16cex w16sdtdh wp14">
   <w:p>
     <w:pPr>
       <w:pStyle w:val="Header"/>
@@ -2787,7 +2679,7 @@
                           <w:pPr>
                             <w:spacing w:after="0"/>
                             <w:rPr>
-                              <w:rFonts w:ascii="Century Gothic" w:hAnsi="Century Gothic" w:eastAsia="Century Gothic" w:cs="Century Gothic"/>
+                              <w:rFonts w:ascii="Century Gothic" w:eastAsia="Century Gothic" w:hAnsi="Century Gothic" w:cs="Century Gothic"/>
                               <w:noProof/>
                               <w:color w:val="5514B4"/>
                               <w:sz w:val="18"/>
@@ -2796,7 +2688,7 @@
                           </w:pPr>
                           <w:r>
                             <w:rPr>
-                              <w:rFonts w:ascii="Century Gothic" w:hAnsi="Century Gothic" w:eastAsia="Century Gothic" w:cs="Century Gothic"/>
+                              <w:rFonts w:ascii="Century Gothic" w:eastAsia="Century Gothic" w:hAnsi="Century Gothic" w:cs="Century Gothic"/>
                               <w:noProof/>
                               <w:color w:val="5514B4"/>
                               <w:sz w:val="18"/>
@@ -2819,7 +2711,7 @@
             </wp:anchor>
           </w:drawing>
         </mc:Choice>
-        <mc:Fallback>
+        <mc:Fallback xmlns:aclsh="http://schemas.microsoft.com/office/drawing/2020/classificationShape" xmlns:a="http://schemas.openxmlformats.org/drawingml/2006/main" xmlns:w16sdtfl="http://schemas.microsoft.com/office/word/2024/wordml/sdtformatlock">
           <w:pict w14:anchorId="23061543">
             <v:shapetype id="_x0000_t202" coordsize="21600,21600" o:spt="202" path="m,l,21600r21600,l21600,xe" w14:anchorId="19CDC61F">
               <v:stroke joinstyle="miter"/>
@@ -2864,7 +2756,7 @@
 </file>
 
 <file path=word/header2.xml><?xml version="1.0" encoding="utf-8"?>
-<w:hdr xmlns:wpc="http://schemas.microsoft.com/office/word/2010/wordprocessingCanvas" xmlns:cx="http://schemas.microsoft.com/office/drawing/2014/chartex" xmlns:cx1="http://schemas.microsoft.com/office/drawing/2015/9/8/chartex" xmlns:cx2="http://schemas.microsoft.com/office/drawing/2015/10/21/chartex" xmlns:cx3="http://schemas.microsoft.com/office/drawing/2016/5/9/chartex" xmlns:cx4="http://schemas.microsoft.com/office/drawing/2016/5/10/chartex" xmlns:cx5="http://schemas.microsoft.com/office/drawing/2016/5/11/chartex" xmlns:cx6="http://schemas.microsoft.com/office/drawing/2016/5/12/chartex" xmlns:cx7="http://schemas.microsoft.com/office/drawing/2016/5/13/chartex" xmlns:cx8="http://schemas.microsoft.com/office/drawing/2016/5/14/chartex" xmlns:mc="http://schemas.openxmlformats.org/markup-compatibility/2006" xmlns:aink="http://schemas.microsoft.com/office/drawing/2016/ink" xmlns:am3d="http://schemas.microsoft.com/office/drawing/2017/model3d" xmlns:o="urn:schemas-microsoft-com:office:office" xmlns:oel="http://schemas.microsoft.com/office/2019/extlst" xmlns:r="http://schemas.openxmlformats.org/officeDocument/2006/relationships" xmlns:m="http://schemas.openxmlformats.org/officeDocument/2006/math" xmlns:v="urn:schemas-microsoft-com:vml" xmlns:wp14="http://schemas.microsoft.com/office/word/2010/wordprocessingDrawing" xmlns:wp="http://schemas.openxmlformats.org/drawingml/2006/wordprocessingDrawing" xmlns:w10="urn:schemas-microsoft-com:office:word" xmlns:w="http://schemas.openxmlformats.org/wordprocessingml/2006/main" xmlns:w14="http://schemas.microsoft.com/office/word/2010/wordml" xmlns:w15="http://schemas.microsoft.com/office/word/2012/wordml" xmlns:w16cex="http://schemas.microsoft.com/office/word/2018/wordml/cex" xmlns:w16cid="http://schemas.microsoft.com/office/word/2016/wordml/cid" xmlns:w16="http://schemas.microsoft.com/office/word/2018/wordml" xmlns:w16du="http://schemas.microsoft.com/office/word/2023/wordml/word16du" xmlns:w16sdtdh="http://schemas.microsoft.com/office/word/2020/wordml/sdtdatahash" xmlns:w16sdtfl="http://schemas.microsoft.com/office/word/2024/wordml/sdtformatlock" xmlns:w16se="http://schemas.microsoft.com/office/word/2015/wordml/symex" xmlns:wpg="http://schemas.microsoft.com/office/word/2010/wordprocessingGroup" xmlns:wpi="http://schemas.microsoft.com/office/word/2010/wordprocessingInk" xmlns:wne="http://schemas.microsoft.com/office/word/2006/wordml" xmlns:wps="http://schemas.microsoft.com/office/word/2010/wordprocessingShape" xmlns:a="http://schemas.openxmlformats.org/drawingml/2006/main" xmlns:aclsh="http://schemas.microsoft.com/office/drawing/2020/classificationShape" mc:Ignorable="w14 w15 w16se w16cid w16 w16cex w16sdtdh w16sdtfl w16du wp14">
+<w:hdr xmlns:wpc="http://schemas.microsoft.com/office/word/2010/wordprocessingCanvas" xmlns:cx="http://schemas.microsoft.com/office/drawing/2014/chartex" xmlns:cx1="http://schemas.microsoft.com/office/drawing/2015/9/8/chartex" xmlns:cx2="http://schemas.microsoft.com/office/drawing/2015/10/21/chartex" xmlns:cx3="http://schemas.microsoft.com/office/drawing/2016/5/9/chartex" xmlns:cx4="http://schemas.microsoft.com/office/drawing/2016/5/10/chartex" xmlns:cx5="http://schemas.microsoft.com/office/drawing/2016/5/11/chartex" xmlns:cx6="http://schemas.microsoft.com/office/drawing/2016/5/12/chartex" xmlns:cx7="http://schemas.microsoft.com/office/drawing/2016/5/13/chartex" xmlns:cx8="http://schemas.microsoft.com/office/drawing/2016/5/14/chartex" xmlns:mc="http://schemas.openxmlformats.org/markup-compatibility/2006" xmlns:aink="http://schemas.microsoft.com/office/drawing/2016/ink" xmlns:am3d="http://schemas.microsoft.com/office/drawing/2017/model3d" xmlns:o="urn:schemas-microsoft-com:office:office" xmlns:oel="http://schemas.microsoft.com/office/2019/extlst" xmlns:r="http://schemas.openxmlformats.org/officeDocument/2006/relationships" xmlns:m="http://schemas.openxmlformats.org/officeDocument/2006/math" xmlns:v="urn:schemas-microsoft-com:vml" xmlns:wp14="http://schemas.microsoft.com/office/word/2010/wordprocessingDrawing" xmlns:wp="http://schemas.openxmlformats.org/drawingml/2006/wordprocessingDrawing" xmlns:w10="urn:schemas-microsoft-com:office:word" xmlns:w="http://schemas.openxmlformats.org/wordprocessingml/2006/main" xmlns:w14="http://schemas.microsoft.com/office/word/2010/wordml" xmlns:w15="http://schemas.microsoft.com/office/word/2012/wordml" xmlns:w16cex="http://schemas.microsoft.com/office/word/2018/wordml/cex" xmlns:w16cid="http://schemas.microsoft.com/office/word/2016/wordml/cid" xmlns:w16="http://schemas.microsoft.com/office/word/2018/wordml" xmlns:w16du="http://schemas.microsoft.com/office/word/2023/wordml/word16du" xmlns:w16sdtdh="http://schemas.microsoft.com/office/word/2020/wordml/sdtdatahash" xmlns:w16se="http://schemas.microsoft.com/office/word/2015/wordml/symex" xmlns:wpg="http://schemas.microsoft.com/office/word/2010/wordprocessingGroup" xmlns:wpi="http://schemas.microsoft.com/office/word/2010/wordprocessingInk" xmlns:wne="http://schemas.microsoft.com/office/word/2006/wordml" xmlns:wps="http://schemas.microsoft.com/office/word/2010/wordprocessingShape" mc:Ignorable="w14 w15 w16se w16cid w16 w16cex w16sdtdh wp14">
   <w:p>
     <w:pPr>
       <w:pStyle w:val="Header"/>
@@ -2918,7 +2810,7 @@
                           <w:pPr>
                             <w:spacing w:after="0"/>
                             <w:rPr>
-                              <w:rFonts w:ascii="Century Gothic" w:hAnsi="Century Gothic" w:eastAsia="Century Gothic" w:cs="Century Gothic"/>
+                              <w:rFonts w:ascii="Century Gothic" w:eastAsia="Century Gothic" w:hAnsi="Century Gothic" w:cs="Century Gothic"/>
                               <w:noProof/>
                               <w:color w:val="5514B4"/>
                               <w:sz w:val="18"/>
@@ -2927,7 +2819,7 @@
                           </w:pPr>
                           <w:r>
                             <w:rPr>
-                              <w:rFonts w:ascii="Century Gothic" w:hAnsi="Century Gothic" w:eastAsia="Century Gothic" w:cs="Century Gothic"/>
+                              <w:rFonts w:ascii="Century Gothic" w:eastAsia="Century Gothic" w:hAnsi="Century Gothic" w:cs="Century Gothic"/>
                               <w:noProof/>
                               <w:color w:val="5514B4"/>
                               <w:sz w:val="18"/>
@@ -2950,7 +2842,7 @@
             </wp:anchor>
           </w:drawing>
         </mc:Choice>
-        <mc:Fallback>
+        <mc:Fallback xmlns:aclsh="http://schemas.microsoft.com/office/drawing/2020/classificationShape" xmlns:a="http://schemas.openxmlformats.org/drawingml/2006/main" xmlns:w16sdtfl="http://schemas.microsoft.com/office/word/2024/wordml/sdtformatlock">
           <w:pict w14:anchorId="1588125C">
             <v:shapetype id="_x0000_t202" coordsize="21600,21600" o:spt="202" path="m,l,21600r21600,l21600,xe" w14:anchorId="4F8E5F23">
               <v:stroke joinstyle="miter"/>
@@ -2995,7 +2887,7 @@
 </file>
 
 <file path=word/header3.xml><?xml version="1.0" encoding="utf-8"?>
-<w:hdr xmlns:wpc="http://schemas.microsoft.com/office/word/2010/wordprocessingCanvas" xmlns:cx="http://schemas.microsoft.com/office/drawing/2014/chartex" xmlns:cx1="http://schemas.microsoft.com/office/drawing/2015/9/8/chartex" xmlns:cx2="http://schemas.microsoft.com/office/drawing/2015/10/21/chartex" xmlns:cx3="http://schemas.microsoft.com/office/drawing/2016/5/9/chartex" xmlns:cx4="http://schemas.microsoft.com/office/drawing/2016/5/10/chartex" xmlns:cx5="http://schemas.microsoft.com/office/drawing/2016/5/11/chartex" xmlns:cx6="http://schemas.microsoft.com/office/drawing/2016/5/12/chartex" xmlns:cx7="http://schemas.microsoft.com/office/drawing/2016/5/13/chartex" xmlns:cx8="http://schemas.microsoft.com/office/drawing/2016/5/14/chartex" xmlns:mc="http://schemas.openxmlformats.org/markup-compatibility/2006" xmlns:aink="http://schemas.microsoft.com/office/drawing/2016/ink" xmlns:am3d="http://schemas.microsoft.com/office/drawing/2017/model3d" xmlns:o="urn:schemas-microsoft-com:office:office" xmlns:oel="http://schemas.microsoft.com/office/2019/extlst" xmlns:r="http://schemas.openxmlformats.org/officeDocument/2006/relationships" xmlns:m="http://schemas.openxmlformats.org/officeDocument/2006/math" xmlns:v="urn:schemas-microsoft-com:vml" xmlns:wp14="http://schemas.microsoft.com/office/word/2010/wordprocessingDrawing" xmlns:wp="http://schemas.openxmlformats.org/drawingml/2006/wordprocessingDrawing" xmlns:w10="urn:schemas-microsoft-com:office:word" xmlns:w="http://schemas.openxmlformats.org/wordprocessingml/2006/main" xmlns:w14="http://schemas.microsoft.com/office/word/2010/wordml" xmlns:w15="http://schemas.microsoft.com/office/word/2012/wordml" xmlns:w16cex="http://schemas.microsoft.com/office/word/2018/wordml/cex" xmlns:w16cid="http://schemas.microsoft.com/office/word/2016/wordml/cid" xmlns:w16="http://schemas.microsoft.com/office/word/2018/wordml" xmlns:w16du="http://schemas.microsoft.com/office/word/2023/wordml/word16du" xmlns:w16sdtdh="http://schemas.microsoft.com/office/word/2020/wordml/sdtdatahash" xmlns:w16sdtfl="http://schemas.microsoft.com/office/word/2024/wordml/sdtformatlock" xmlns:w16se="http://schemas.microsoft.com/office/word/2015/wordml/symex" xmlns:wpg="http://schemas.microsoft.com/office/word/2010/wordprocessingGroup" xmlns:wpi="http://schemas.microsoft.com/office/word/2010/wordprocessingInk" xmlns:wne="http://schemas.microsoft.com/office/word/2006/wordml" xmlns:wps="http://schemas.microsoft.com/office/word/2010/wordprocessingShape" xmlns:a="http://schemas.openxmlformats.org/drawingml/2006/main" xmlns:aclsh="http://schemas.microsoft.com/office/drawing/2020/classificationShape" mc:Ignorable="w14 w15 w16se w16cid w16 w16cex w16sdtdh w16sdtfl w16du wp14">
+<w:hdr xmlns:wpc="http://schemas.microsoft.com/office/word/2010/wordprocessingCanvas" xmlns:cx="http://schemas.microsoft.com/office/drawing/2014/chartex" xmlns:cx1="http://schemas.microsoft.com/office/drawing/2015/9/8/chartex" xmlns:cx2="http://schemas.microsoft.com/office/drawing/2015/10/21/chartex" xmlns:cx3="http://schemas.microsoft.com/office/drawing/2016/5/9/chartex" xmlns:cx4="http://schemas.microsoft.com/office/drawing/2016/5/10/chartex" xmlns:cx5="http://schemas.microsoft.com/office/drawing/2016/5/11/chartex" xmlns:cx6="http://schemas.microsoft.com/office/drawing/2016/5/12/chartex" xmlns:cx7="http://schemas.microsoft.com/office/drawing/2016/5/13/chartex" xmlns:cx8="http://schemas.microsoft.com/office/drawing/2016/5/14/chartex" xmlns:mc="http://schemas.openxmlformats.org/markup-compatibility/2006" xmlns:aink="http://schemas.microsoft.com/office/drawing/2016/ink" xmlns:am3d="http://schemas.microsoft.com/office/drawing/2017/model3d" xmlns:o="urn:schemas-microsoft-com:office:office" xmlns:oel="http://schemas.microsoft.com/office/2019/extlst" xmlns:r="http://schemas.openxmlformats.org/officeDocument/2006/relationships" xmlns:m="http://schemas.openxmlformats.org/officeDocument/2006/math" xmlns:v="urn:schemas-microsoft-com:vml" xmlns:wp14="http://schemas.microsoft.com/office/word/2010/wordprocessingDrawing" xmlns:wp="http://schemas.openxmlformats.org/drawingml/2006/wordprocessingDrawing" xmlns:w10="urn:schemas-microsoft-com:office:word" xmlns:w="http://schemas.openxmlformats.org/wordprocessingml/2006/main" xmlns:w14="http://schemas.microsoft.com/office/word/2010/wordml" xmlns:w15="http://schemas.microsoft.com/office/word/2012/wordml" xmlns:w16cex="http://schemas.microsoft.com/office/word/2018/wordml/cex" xmlns:w16cid="http://schemas.microsoft.com/office/word/2016/wordml/cid" xmlns:w16="http://schemas.microsoft.com/office/word/2018/wordml" xmlns:w16du="http://schemas.microsoft.com/office/word/2023/wordml/word16du" xmlns:w16sdtdh="http://schemas.microsoft.com/office/word/2020/wordml/sdtdatahash" xmlns:w16se="http://schemas.microsoft.com/office/word/2015/wordml/symex" xmlns:wpg="http://schemas.microsoft.com/office/word/2010/wordprocessingGroup" xmlns:wpi="http://schemas.microsoft.com/office/word/2010/wordprocessingInk" xmlns:wne="http://schemas.microsoft.com/office/word/2006/wordml" xmlns:wps="http://schemas.microsoft.com/office/word/2010/wordprocessingShape" mc:Ignorable="w14 w15 w16se w16cid w16 w16cex w16sdtdh wp14">
   <w:p>
     <w:pPr>
       <w:pStyle w:val="Header"/>
@@ -3049,7 +2941,7 @@
                           <w:pPr>
                             <w:spacing w:after="0"/>
                             <w:rPr>
-                              <w:rFonts w:ascii="Century Gothic" w:hAnsi="Century Gothic" w:eastAsia="Century Gothic" w:cs="Century Gothic"/>
+                              <w:rFonts w:ascii="Century Gothic" w:eastAsia="Century Gothic" w:hAnsi="Century Gothic" w:cs="Century Gothic"/>
                               <w:noProof/>
                               <w:color w:val="5514B4"/>
                               <w:sz w:val="18"/>
@@ -3058,7 +2950,7 @@
                           </w:pPr>
                           <w:r>
                             <w:rPr>
-                              <w:rFonts w:ascii="Century Gothic" w:hAnsi="Century Gothic" w:eastAsia="Century Gothic" w:cs="Century Gothic"/>
+                              <w:rFonts w:ascii="Century Gothic" w:eastAsia="Century Gothic" w:hAnsi="Century Gothic" w:cs="Century Gothic"/>
                               <w:noProof/>
                               <w:color w:val="5514B4"/>
                               <w:sz w:val="18"/>
@@ -3081,7 +2973,7 @@
             </wp:anchor>
           </w:drawing>
         </mc:Choice>
-        <mc:Fallback>
+        <mc:Fallback xmlns:aclsh="http://schemas.microsoft.com/office/drawing/2020/classificationShape" xmlns:a="http://schemas.openxmlformats.org/drawingml/2006/main" xmlns:w16sdtfl="http://schemas.microsoft.com/office/word/2024/wordml/sdtformatlock">
           <w:pict w14:anchorId="07CBCF24">
             <v:shapetype id="_x0000_t202" coordsize="21600,21600" o:spt="202" path="m,l,21600r21600,l21600,xe" w14:anchorId="5D03A778">
               <v:stroke joinstyle="miter"/>
@@ -3126,7 +3018,7 @@
 </file>
 
 <file path=word/numbering.xml><?xml version="1.0" encoding="utf-8"?>
-<w:numbering xmlns:wpc="http://schemas.microsoft.com/office/word/2010/wordprocessingCanvas" xmlns:cx="http://schemas.microsoft.com/office/drawing/2014/chartex" xmlns:cx1="http://schemas.microsoft.com/office/drawing/2015/9/8/chartex" xmlns:cx2="http://schemas.microsoft.com/office/drawing/2015/10/21/chartex" xmlns:cx3="http://schemas.microsoft.com/office/drawing/2016/5/9/chartex" xmlns:cx4="http://schemas.microsoft.com/office/drawing/2016/5/10/chartex" xmlns:cx5="http://schemas.microsoft.com/office/drawing/2016/5/11/chartex" xmlns:cx6="http://schemas.microsoft.com/office/drawing/2016/5/12/chartex" xmlns:cx7="http://schemas.microsoft.com/office/drawing/2016/5/13/chartex" xmlns:cx8="http://schemas.microsoft.com/office/drawing/2016/5/14/chartex" xmlns:mc="http://schemas.openxmlformats.org/markup-compatibility/2006" xmlns:aink="http://schemas.microsoft.com/office/drawing/2016/ink" xmlns:am3d="http://schemas.microsoft.com/office/drawing/2017/model3d" xmlns:o="urn:schemas-microsoft-com:office:office" xmlns:oel="http://schemas.microsoft.com/office/2019/extlst" xmlns:r="http://schemas.openxmlformats.org/officeDocument/2006/relationships" xmlns:m="http://schemas.openxmlformats.org/officeDocument/2006/math" xmlns:v="urn:schemas-microsoft-com:vml" xmlns:wp14="http://schemas.microsoft.com/office/word/2010/wordprocessingDrawing" xmlns:wp="http://schemas.openxmlformats.org/drawingml/2006/wordprocessingDrawing" xmlns:w10="urn:schemas-microsoft-com:office:word" xmlns:w="http://schemas.openxmlformats.org/wordprocessingml/2006/main" xmlns:w14="http://schemas.microsoft.com/office/word/2010/wordml" xmlns:w15="http://schemas.microsoft.com/office/word/2012/wordml" xmlns:w16cex="http://schemas.microsoft.com/office/word/2018/wordml/cex" xmlns:w16cid="http://schemas.microsoft.com/office/word/2016/wordml/cid" xmlns:w16="http://schemas.microsoft.com/office/word/2018/wordml" xmlns:w16du="http://schemas.microsoft.com/office/word/2023/wordml/word16du" xmlns:w16sdtdh="http://schemas.microsoft.com/office/word/2020/wordml/sdtdatahash" xmlns:w16sdtfl="http://schemas.microsoft.com/office/word/2024/wordml/sdtformatlock" xmlns:w16se="http://schemas.microsoft.com/office/word/2015/wordml/symex" xmlns:wpg="http://schemas.microsoft.com/office/word/2010/wordprocessingGroup" xmlns:wpi="http://schemas.microsoft.com/office/word/2010/wordprocessingInk" xmlns:wne="http://schemas.microsoft.com/office/word/2006/wordml" xmlns:wps="http://schemas.microsoft.com/office/word/2010/wordprocessingShape" mc:Ignorable="w14 w15 w16se w16cid w16 w16cex w16sdtdh w16sdtfl w16du wp14">
+<w:numbering xmlns:wpc="http://schemas.microsoft.com/office/word/2010/wordprocessingCanvas" xmlns:cx="http://schemas.microsoft.com/office/drawing/2014/chartex" xmlns:cx1="http://schemas.microsoft.com/office/drawing/2015/9/8/chartex" xmlns:cx2="http://schemas.microsoft.com/office/drawing/2015/10/21/chartex" xmlns:cx3="http://schemas.microsoft.com/office/drawing/2016/5/9/chartex" xmlns:cx4="http://schemas.microsoft.com/office/drawing/2016/5/10/chartex" xmlns:cx5="http://schemas.microsoft.com/office/drawing/2016/5/11/chartex" xmlns:cx6="http://schemas.microsoft.com/office/drawing/2016/5/12/chartex" xmlns:cx7="http://schemas.microsoft.com/office/drawing/2016/5/13/chartex" xmlns:cx8="http://schemas.microsoft.com/office/drawing/2016/5/14/chartex" xmlns:mc="http://schemas.openxmlformats.org/markup-compatibility/2006" xmlns:aink="http://schemas.microsoft.com/office/drawing/2016/ink" xmlns:am3d="http://schemas.microsoft.com/office/drawing/2017/model3d" xmlns:o="urn:schemas-microsoft-com:office:office" xmlns:oel="http://schemas.microsoft.com/office/2019/extlst" xmlns:r="http://schemas.openxmlformats.org/officeDocument/2006/relationships" xmlns:m="http://schemas.openxmlformats.org/officeDocument/2006/math" xmlns:v="urn:schemas-microsoft-com:vml" xmlns:wp14="http://schemas.microsoft.com/office/word/2010/wordprocessingDrawing" xmlns:wp="http://schemas.openxmlformats.org/drawingml/2006/wordprocessingDrawing" xmlns:w10="urn:schemas-microsoft-com:office:word" xmlns:w="http://schemas.openxmlformats.org/wordprocessingml/2006/main" xmlns:w14="http://schemas.microsoft.com/office/word/2010/wordml" xmlns:w15="http://schemas.microsoft.com/office/word/2012/wordml" xmlns:w16cex="http://schemas.microsoft.com/office/word/2018/wordml/cex" xmlns:w16cid="http://schemas.microsoft.com/office/word/2016/wordml/cid" xmlns:w16="http://schemas.microsoft.com/office/word/2018/wordml" xmlns:w16du="http://schemas.microsoft.com/office/word/2023/wordml/word16du" xmlns:w16sdtdh="http://schemas.microsoft.com/office/word/2020/wordml/sdtdatahash" xmlns:w16se="http://schemas.microsoft.com/office/word/2015/wordml/symex" xmlns:wpg="http://schemas.microsoft.com/office/word/2010/wordprocessingGroup" xmlns:wpi="http://schemas.microsoft.com/office/word/2010/wordprocessingInk" xmlns:wne="http://schemas.microsoft.com/office/word/2006/wordml" xmlns:wps="http://schemas.microsoft.com/office/word/2010/wordprocessingShape" mc:Ignorable="w14 w15 w16se w16cid w16 w16cex w16sdtdh wp14">
   <w:abstractNum w:abstractNumId="0" w15:restartNumberingAfterBreak="0">
     <w:nsid w:val="1BB2C3EF"/>
     <w:multiLevelType w:val="hybridMultilevel"/>
@@ -3226,7 +3118,7 @@
         <w:ind w:left="720" w:hanging="360"/>
       </w:pPr>
       <w:rPr>
-        <w:rFonts w:ascii="Symbol" w:hAnsi="Symbol" w:eastAsia="Symbol" w:cs="Symbol"/>
+        <w:rFonts w:ascii="Symbol" w:eastAsia="Symbol" w:hAnsi="Symbol" w:cs="Symbol"/>
       </w:rPr>
     </w:lvl>
     <w:lvl w:ilvl="1" w:tplc="99445C92">
@@ -3238,7 +3130,7 @@
         <w:ind w:left="1440" w:hanging="360"/>
       </w:pPr>
       <w:rPr>
-        <w:rFonts w:ascii="Courier New" w:hAnsi="Courier New" w:eastAsia="Courier New" w:cs="Courier New"/>
+        <w:rFonts w:ascii="Courier New" w:eastAsia="Courier New" w:hAnsi="Courier New" w:cs="Courier New"/>
       </w:rPr>
     </w:lvl>
     <w:lvl w:ilvl="2" w:tplc="E0861122">
@@ -3250,7 +3142,7 @@
         <w:ind w:left="2160" w:hanging="360"/>
       </w:pPr>
       <w:rPr>
-        <w:rFonts w:ascii="Wingdings" w:hAnsi="Wingdings" w:eastAsia="Wingdings" w:cs="Wingdings"/>
+        <w:rFonts w:ascii="Wingdings" w:eastAsia="Wingdings" w:hAnsi="Wingdings" w:cs="Wingdings"/>
       </w:rPr>
     </w:lvl>
     <w:lvl w:ilvl="3" w:tplc="8426212C">
@@ -3262,7 +3154,7 @@
         <w:ind w:left="2880" w:hanging="360"/>
       </w:pPr>
       <w:rPr>
-        <w:rFonts w:ascii="Symbol" w:hAnsi="Symbol" w:eastAsia="Symbol" w:cs="Symbol"/>
+        <w:rFonts w:ascii="Symbol" w:eastAsia="Symbol" w:hAnsi="Symbol" w:cs="Symbol"/>
       </w:rPr>
     </w:lvl>
     <w:lvl w:ilvl="4" w:tplc="DFF0976A">
@@ -3274,7 +3166,7 @@
         <w:ind w:left="3600" w:hanging="360"/>
       </w:pPr>
       <w:rPr>
-        <w:rFonts w:ascii="Courier New" w:hAnsi="Courier New" w:eastAsia="Courier New" w:cs="Courier New"/>
+        <w:rFonts w:ascii="Courier New" w:eastAsia="Courier New" w:hAnsi="Courier New" w:cs="Courier New"/>
       </w:rPr>
     </w:lvl>
     <w:lvl w:ilvl="5" w:tplc="2284A838">
@@ -3286,7 +3178,7 @@
         <w:ind w:left="4320" w:hanging="360"/>
       </w:pPr>
       <w:rPr>
-        <w:rFonts w:ascii="Wingdings" w:hAnsi="Wingdings" w:eastAsia="Wingdings" w:cs="Wingdings"/>
+        <w:rFonts w:ascii="Wingdings" w:eastAsia="Wingdings" w:hAnsi="Wingdings" w:cs="Wingdings"/>
       </w:rPr>
     </w:lvl>
     <w:lvl w:ilvl="6" w:tplc="106C74B2">
@@ -3298,7 +3190,7 @@
         <w:ind w:left="5040" w:hanging="360"/>
       </w:pPr>
       <w:rPr>
-        <w:rFonts w:ascii="Symbol" w:hAnsi="Symbol" w:eastAsia="Symbol" w:cs="Symbol"/>
+        <w:rFonts w:ascii="Symbol" w:eastAsia="Symbol" w:hAnsi="Symbol" w:cs="Symbol"/>
       </w:rPr>
     </w:lvl>
     <w:lvl w:ilvl="7" w:tplc="34E80E8C">
@@ -3310,7 +3202,7 @@
         <w:ind w:left="5760" w:hanging="360"/>
       </w:pPr>
       <w:rPr>
-        <w:rFonts w:ascii="Courier New" w:hAnsi="Courier New" w:eastAsia="Courier New" w:cs="Courier New"/>
+        <w:rFonts w:ascii="Courier New" w:eastAsia="Courier New" w:hAnsi="Courier New" w:cs="Courier New"/>
       </w:rPr>
     </w:lvl>
     <w:lvl w:ilvl="8" w:tplc="846813D8">
@@ -3322,7 +3214,7 @@
         <w:ind w:left="6480" w:hanging="360"/>
       </w:pPr>
       <w:rPr>
-        <w:rFonts w:ascii="Wingdings" w:hAnsi="Wingdings" w:eastAsia="Wingdings" w:cs="Wingdings"/>
+        <w:rFonts w:ascii="Wingdings" w:eastAsia="Wingdings" w:hAnsi="Wingdings" w:cs="Wingdings"/>
       </w:rPr>
     </w:lvl>
   </w:abstractNum>
@@ -3339,7 +3231,7 @@
         <w:ind w:left="720" w:hanging="360"/>
       </w:pPr>
       <w:rPr>
-        <w:rFonts w:ascii="Symbol" w:hAnsi="Symbol" w:eastAsia="Symbol" w:cs="Symbol"/>
+        <w:rFonts w:ascii="Symbol" w:eastAsia="Symbol" w:hAnsi="Symbol" w:cs="Symbol"/>
       </w:rPr>
     </w:lvl>
     <w:lvl w:ilvl="1" w:tplc="E878C354">
@@ -3351,7 +3243,7 @@
         <w:ind w:left="1440" w:hanging="360"/>
       </w:pPr>
       <w:rPr>
-        <w:rFonts w:ascii="Courier New" w:hAnsi="Courier New" w:eastAsia="Courier New" w:cs="Courier New"/>
+        <w:rFonts w:ascii="Courier New" w:eastAsia="Courier New" w:hAnsi="Courier New" w:cs="Courier New"/>
       </w:rPr>
     </w:lvl>
     <w:lvl w:ilvl="2" w:tplc="EEC8F4AA">
@@ -3363,7 +3255,7 @@
         <w:ind w:left="2160" w:hanging="360"/>
       </w:pPr>
       <w:rPr>
-        <w:rFonts w:ascii="Wingdings" w:hAnsi="Wingdings" w:eastAsia="Wingdings" w:cs="Wingdings"/>
+        <w:rFonts w:ascii="Wingdings" w:eastAsia="Wingdings" w:hAnsi="Wingdings" w:cs="Wingdings"/>
       </w:rPr>
     </w:lvl>
     <w:lvl w:ilvl="3" w:tplc="C806427C">
@@ -3375,7 +3267,7 @@
         <w:ind w:left="2880" w:hanging="360"/>
       </w:pPr>
       <w:rPr>
-        <w:rFonts w:ascii="Symbol" w:hAnsi="Symbol" w:eastAsia="Symbol" w:cs="Symbol"/>
+        <w:rFonts w:ascii="Symbol" w:eastAsia="Symbol" w:hAnsi="Symbol" w:cs="Symbol"/>
       </w:rPr>
     </w:lvl>
     <w:lvl w:ilvl="4" w:tplc="0E02D202">
@@ -3387,7 +3279,7 @@
         <w:ind w:left="3600" w:hanging="360"/>
       </w:pPr>
       <w:rPr>
-        <w:rFonts w:ascii="Courier New" w:hAnsi="Courier New" w:eastAsia="Courier New" w:cs="Courier New"/>
+        <w:rFonts w:ascii="Courier New" w:eastAsia="Courier New" w:hAnsi="Courier New" w:cs="Courier New"/>
       </w:rPr>
     </w:lvl>
     <w:lvl w:ilvl="5" w:tplc="586236FA">
@@ -3399,7 +3291,7 @@
         <w:ind w:left="4320" w:hanging="360"/>
       </w:pPr>
       <w:rPr>
-        <w:rFonts w:ascii="Wingdings" w:hAnsi="Wingdings" w:eastAsia="Wingdings" w:cs="Wingdings"/>
+        <w:rFonts w:ascii="Wingdings" w:eastAsia="Wingdings" w:hAnsi="Wingdings" w:cs="Wingdings"/>
       </w:rPr>
     </w:lvl>
     <w:lvl w:ilvl="6" w:tplc="9992F0CE">
@@ -3411,7 +3303,7 @@
         <w:ind w:left="5040" w:hanging="360"/>
       </w:pPr>
       <w:rPr>
-        <w:rFonts w:ascii="Symbol" w:hAnsi="Symbol" w:eastAsia="Symbol" w:cs="Symbol"/>
+        <w:rFonts w:ascii="Symbol" w:eastAsia="Symbol" w:hAnsi="Symbol" w:cs="Symbol"/>
       </w:rPr>
     </w:lvl>
     <w:lvl w:ilvl="7" w:tplc="99327E8C">
@@ -3423,7 +3315,7 @@
         <w:ind w:left="5760" w:hanging="360"/>
       </w:pPr>
       <w:rPr>
-        <w:rFonts w:ascii="Courier New" w:hAnsi="Courier New" w:eastAsia="Courier New" w:cs="Courier New"/>
+        <w:rFonts w:ascii="Courier New" w:eastAsia="Courier New" w:hAnsi="Courier New" w:cs="Courier New"/>
       </w:rPr>
     </w:lvl>
     <w:lvl w:ilvl="8" w:tplc="3E48E3E0">
@@ -3435,7 +3327,7 @@
         <w:ind w:left="6480" w:hanging="360"/>
       </w:pPr>
       <w:rPr>
-        <w:rFonts w:ascii="Wingdings" w:hAnsi="Wingdings" w:eastAsia="Wingdings" w:cs="Wingdings"/>
+        <w:rFonts w:ascii="Wingdings" w:eastAsia="Wingdings" w:hAnsi="Wingdings" w:cs="Wingdings"/>
       </w:rPr>
     </w:lvl>
   </w:abstractNum>
@@ -3452,7 +3344,7 @@
         <w:ind w:left="720" w:hanging="360"/>
       </w:pPr>
       <w:rPr>
-        <w:rFonts w:ascii="Symbol" w:hAnsi="Symbol" w:eastAsia="Symbol" w:cs="Symbol"/>
+        <w:rFonts w:ascii="Symbol" w:eastAsia="Symbol" w:hAnsi="Symbol" w:cs="Symbol"/>
       </w:rPr>
     </w:lvl>
     <w:lvl w:ilvl="1" w:tplc="8F763506">
@@ -3464,7 +3356,7 @@
         <w:ind w:left="1440" w:hanging="360"/>
       </w:pPr>
       <w:rPr>
-        <w:rFonts w:ascii="Courier New" w:hAnsi="Courier New" w:eastAsia="Courier New" w:cs="Courier New"/>
+        <w:rFonts w:ascii="Courier New" w:eastAsia="Courier New" w:hAnsi="Courier New" w:cs="Courier New"/>
       </w:rPr>
     </w:lvl>
     <w:lvl w:ilvl="2" w:tplc="B9C65678">
@@ -3476,7 +3368,7 @@
         <w:ind w:left="2160" w:hanging="360"/>
       </w:pPr>
       <w:rPr>
-        <w:rFonts w:ascii="Wingdings" w:hAnsi="Wingdings" w:eastAsia="Wingdings" w:cs="Wingdings"/>
+        <w:rFonts w:ascii="Wingdings" w:eastAsia="Wingdings" w:hAnsi="Wingdings" w:cs="Wingdings"/>
       </w:rPr>
     </w:lvl>
     <w:lvl w:ilvl="3" w:tplc="B2FC0E72">
@@ -3488,7 +3380,7 @@
         <w:ind w:left="2880" w:hanging="360"/>
       </w:pPr>
       <w:rPr>
-        <w:rFonts w:ascii="Symbol" w:hAnsi="Symbol" w:eastAsia="Symbol" w:cs="Symbol"/>
+        <w:rFonts w:ascii="Symbol" w:eastAsia="Symbol" w:hAnsi="Symbol" w:cs="Symbol"/>
       </w:rPr>
     </w:lvl>
     <w:lvl w:ilvl="4" w:tplc="9830F7E8">
@@ -3500,7 +3392,7 @@
         <w:ind w:left="3600" w:hanging="360"/>
       </w:pPr>
       <w:rPr>
-        <w:rFonts w:ascii="Courier New" w:hAnsi="Courier New" w:eastAsia="Courier New" w:cs="Courier New"/>
+        <w:rFonts w:ascii="Courier New" w:eastAsia="Courier New" w:hAnsi="Courier New" w:cs="Courier New"/>
       </w:rPr>
     </w:lvl>
     <w:lvl w:ilvl="5" w:tplc="1DB28B14">
@@ -3512,7 +3404,7 @@
         <w:ind w:left="4320" w:hanging="360"/>
       </w:pPr>
       <w:rPr>
-        <w:rFonts w:ascii="Wingdings" w:hAnsi="Wingdings" w:eastAsia="Wingdings" w:cs="Wingdings"/>
+        <w:rFonts w:ascii="Wingdings" w:eastAsia="Wingdings" w:hAnsi="Wingdings" w:cs="Wingdings"/>
       </w:rPr>
     </w:lvl>
     <w:lvl w:ilvl="6" w:tplc="213EC0B4">
@@ -3524,7 +3416,7 @@
         <w:ind w:left="5040" w:hanging="360"/>
       </w:pPr>
       <w:rPr>
-        <w:rFonts w:ascii="Symbol" w:hAnsi="Symbol" w:eastAsia="Symbol" w:cs="Symbol"/>
+        <w:rFonts w:ascii="Symbol" w:eastAsia="Symbol" w:hAnsi="Symbol" w:cs="Symbol"/>
       </w:rPr>
     </w:lvl>
     <w:lvl w:ilvl="7" w:tplc="29A6544C">
@@ -3536,7 +3428,7 @@
         <w:ind w:left="5760" w:hanging="360"/>
       </w:pPr>
       <w:rPr>
-        <w:rFonts w:ascii="Courier New" w:hAnsi="Courier New" w:eastAsia="Courier New" w:cs="Courier New"/>
+        <w:rFonts w:ascii="Courier New" w:eastAsia="Courier New" w:hAnsi="Courier New" w:cs="Courier New"/>
       </w:rPr>
     </w:lvl>
     <w:lvl w:ilvl="8" w:tplc="782828F6">
@@ -3548,7 +3440,7 @@
         <w:ind w:left="6480" w:hanging="360"/>
       </w:pPr>
       <w:rPr>
-        <w:rFonts w:ascii="Wingdings" w:hAnsi="Wingdings" w:eastAsia="Wingdings" w:cs="Wingdings"/>
+        <w:rFonts w:ascii="Wingdings" w:eastAsia="Wingdings" w:hAnsi="Wingdings" w:cs="Wingdings"/>
       </w:rPr>
     </w:lvl>
   </w:abstractNum>
@@ -3565,7 +3457,7 @@
         <w:ind w:left="720" w:hanging="360"/>
       </w:pPr>
       <w:rPr>
-        <w:rFonts w:ascii="Symbol" w:hAnsi="Symbol" w:eastAsia="Symbol" w:cs="Symbol"/>
+        <w:rFonts w:ascii="Symbol" w:eastAsia="Symbol" w:hAnsi="Symbol" w:cs="Symbol"/>
       </w:rPr>
     </w:lvl>
     <w:lvl w:ilvl="1" w:tplc="C2A6D172">
@@ -3577,7 +3469,7 @@
         <w:ind w:left="1440" w:hanging="360"/>
       </w:pPr>
       <w:rPr>
-        <w:rFonts w:ascii="Courier New" w:hAnsi="Courier New" w:eastAsia="Courier New" w:cs="Courier New"/>
+        <w:rFonts w:ascii="Courier New" w:eastAsia="Courier New" w:hAnsi="Courier New" w:cs="Courier New"/>
       </w:rPr>
     </w:lvl>
     <w:lvl w:ilvl="2" w:tplc="89D2B658">
@@ -3589,7 +3481,7 @@
         <w:ind w:left="2160" w:hanging="360"/>
       </w:pPr>
       <w:rPr>
-        <w:rFonts w:ascii="Wingdings" w:hAnsi="Wingdings" w:eastAsia="Wingdings" w:cs="Wingdings"/>
+        <w:rFonts w:ascii="Wingdings" w:eastAsia="Wingdings" w:hAnsi="Wingdings" w:cs="Wingdings"/>
       </w:rPr>
     </w:lvl>
     <w:lvl w:ilvl="3" w:tplc="E7AC4E90">
@@ -3601,7 +3493,7 @@
         <w:ind w:left="2880" w:hanging="360"/>
       </w:pPr>
       <w:rPr>
-        <w:rFonts w:ascii="Symbol" w:hAnsi="Symbol" w:eastAsia="Symbol" w:cs="Symbol"/>
+        <w:rFonts w:ascii="Symbol" w:eastAsia="Symbol" w:hAnsi="Symbol" w:cs="Symbol"/>
       </w:rPr>
     </w:lvl>
     <w:lvl w:ilvl="4" w:tplc="69D475D6">
@@ -3613,7 +3505,7 @@
         <w:ind w:left="3600" w:hanging="360"/>
       </w:pPr>
       <w:rPr>
-        <w:rFonts w:ascii="Courier New" w:hAnsi="Courier New" w:eastAsia="Courier New" w:cs="Courier New"/>
+        <w:rFonts w:ascii="Courier New" w:eastAsia="Courier New" w:hAnsi="Courier New" w:cs="Courier New"/>
       </w:rPr>
     </w:lvl>
     <w:lvl w:ilvl="5" w:tplc="EFB23B7E">
@@ -3625,7 +3517,7 @@
         <w:ind w:left="4320" w:hanging="360"/>
       </w:pPr>
       <w:rPr>
-        <w:rFonts w:ascii="Wingdings" w:hAnsi="Wingdings" w:eastAsia="Wingdings" w:cs="Wingdings"/>
+        <w:rFonts w:ascii="Wingdings" w:eastAsia="Wingdings" w:hAnsi="Wingdings" w:cs="Wingdings"/>
       </w:rPr>
     </w:lvl>
     <w:lvl w:ilvl="6" w:tplc="D20A6DD4">
@@ -3637,7 +3529,7 @@
         <w:ind w:left="5040" w:hanging="360"/>
       </w:pPr>
       <w:rPr>
-        <w:rFonts w:ascii="Symbol" w:hAnsi="Symbol" w:eastAsia="Symbol" w:cs="Symbol"/>
+        <w:rFonts w:ascii="Symbol" w:eastAsia="Symbol" w:hAnsi="Symbol" w:cs="Symbol"/>
       </w:rPr>
     </w:lvl>
     <w:lvl w:ilvl="7" w:tplc="D430E404">
@@ -3649,7 +3541,7 @@
         <w:ind w:left="5760" w:hanging="360"/>
       </w:pPr>
       <w:rPr>
-        <w:rFonts w:ascii="Courier New" w:hAnsi="Courier New" w:eastAsia="Courier New" w:cs="Courier New"/>
+        <w:rFonts w:ascii="Courier New" w:eastAsia="Courier New" w:hAnsi="Courier New" w:cs="Courier New"/>
       </w:rPr>
     </w:lvl>
     <w:lvl w:ilvl="8" w:tplc="049AF61E">
@@ -3661,7 +3553,7 @@
         <w:ind w:left="6480" w:hanging="360"/>
       </w:pPr>
       <w:rPr>
-        <w:rFonts w:ascii="Wingdings" w:hAnsi="Wingdings" w:eastAsia="Wingdings" w:cs="Wingdings"/>
+        <w:rFonts w:ascii="Wingdings" w:eastAsia="Wingdings" w:hAnsi="Wingdings" w:cs="Wingdings"/>
       </w:rPr>
     </w:lvl>
   </w:abstractNum>
@@ -3687,11 +3579,11 @@
 </file>
 
 <file path=word/styles.xml><?xml version="1.0" encoding="utf-8"?>
-<w:styles xmlns:wp14="http://schemas.microsoft.com/office/word/2010/wordprocessingDrawing" xmlns:mc="http://schemas.openxmlformats.org/markup-compatibility/2006" xmlns:r="http://schemas.openxmlformats.org/officeDocument/2006/relationships" xmlns:w="http://schemas.openxmlformats.org/wordprocessingml/2006/main" xmlns:w14="http://schemas.microsoft.com/office/word/2010/wordml" xmlns:w15="http://schemas.microsoft.com/office/word/2012/wordml" xmlns:w16cex="http://schemas.microsoft.com/office/word/2018/wordml/cex" xmlns:w16cid="http://schemas.microsoft.com/office/word/2016/wordml/cid" xmlns:w16="http://schemas.microsoft.com/office/word/2018/wordml" xmlns:w16du="http://schemas.microsoft.com/office/word/2023/wordml/word16du" xmlns:w16sdtdh="http://schemas.microsoft.com/office/word/2020/wordml/sdtdatahash" xmlns:w16sdtfl="http://schemas.microsoft.com/office/word/2024/wordml/sdtformatlock" xmlns:w16se="http://schemas.microsoft.com/office/word/2015/wordml/symex" mc:Ignorable="w14 w15 w16se w16cid w16 w16cex w16sdtdh w16sdtfl w16du wp14">
+<w:styles xmlns:mc="http://schemas.openxmlformats.org/markup-compatibility/2006" xmlns:r="http://schemas.openxmlformats.org/officeDocument/2006/relationships" xmlns:w="http://schemas.openxmlformats.org/wordprocessingml/2006/main" xmlns:w14="http://schemas.microsoft.com/office/word/2010/wordml" xmlns:w15="http://schemas.microsoft.com/office/word/2012/wordml" xmlns:w16cex="http://schemas.microsoft.com/office/word/2018/wordml/cex" xmlns:w16cid="http://schemas.microsoft.com/office/word/2016/wordml/cid" xmlns:w16="http://schemas.microsoft.com/office/word/2018/wordml" xmlns:w16sdtdh="http://schemas.microsoft.com/office/word/2020/wordml/sdtdatahash" xmlns:w16se="http://schemas.microsoft.com/office/word/2015/wordml/symex" mc:Ignorable="w14 w15 w16se w16cid w16 w16cex w16sdtdh">
   <w:docDefaults>
     <w:rPrDefault>
       <w:rPr>
-        <w:rFonts w:asciiTheme="minorHAnsi" w:hAnsiTheme="minorHAnsi" w:eastAsiaTheme="minorEastAsia" w:cstheme="minorBidi"/>
+        <w:rFonts w:asciiTheme="minorHAnsi" w:eastAsiaTheme="minorEastAsia" w:hAnsiTheme="minorHAnsi" w:cstheme="minorBidi"/>
         <w:sz w:val="24"/>
         <w:szCs w:val="24"/>
         <w:lang w:val="en-US" w:eastAsia="ja-JP" w:bidi="ar-SA"/>
@@ -3706,14 +3598,14 @@
   <w:latentStyles w:defLockedState="0" w:defUIPriority="99" w:defSemiHidden="0" w:defUnhideWhenUsed="0" w:defQFormat="0" w:count="376">
     <w:lsdException w:name="Normal" w:uiPriority="0" w:qFormat="1"/>
     <w:lsdException w:name="heading 1" w:uiPriority="9" w:qFormat="1"/>
-    <w:lsdException w:name="heading 2" w:uiPriority="9" w:semiHidden="1" w:unhideWhenUsed="1" w:qFormat="1"/>
-    <w:lsdException w:name="heading 3" w:uiPriority="9" w:semiHidden="1" w:unhideWhenUsed="1" w:qFormat="1"/>
-    <w:lsdException w:name="heading 4" w:uiPriority="9" w:semiHidden="1" w:unhideWhenUsed="1" w:qFormat="1"/>
-    <w:lsdException w:name="heading 5" w:uiPriority="9" w:semiHidden="1" w:unhideWhenUsed="1" w:qFormat="1"/>
-    <w:lsdException w:name="heading 6" w:uiPriority="9" w:semiHidden="1" w:unhideWhenUsed="1" w:qFormat="1"/>
-    <w:lsdException w:name="heading 7" w:uiPriority="9" w:semiHidden="1" w:unhideWhenUsed="1" w:qFormat="1"/>
-    <w:lsdException w:name="heading 8" w:uiPriority="9" w:semiHidden="1" w:unhideWhenUsed="1" w:qFormat="1"/>
-    <w:lsdException w:name="heading 9" w:uiPriority="9" w:semiHidden="1" w:unhideWhenUsed="1" w:qFormat="1"/>
+    <w:lsdException w:name="heading 2" w:semiHidden="1" w:uiPriority="9" w:unhideWhenUsed="1" w:qFormat="1"/>
+    <w:lsdException w:name="heading 3" w:semiHidden="1" w:uiPriority="9" w:unhideWhenUsed="1" w:qFormat="1"/>
+    <w:lsdException w:name="heading 4" w:semiHidden="1" w:uiPriority="9" w:unhideWhenUsed="1" w:qFormat="1"/>
+    <w:lsdException w:name="heading 5" w:semiHidden="1" w:uiPriority="9" w:unhideWhenUsed="1" w:qFormat="1"/>
+    <w:lsdException w:name="heading 6" w:semiHidden="1" w:uiPriority="9" w:unhideWhenUsed="1" w:qFormat="1"/>
+    <w:lsdException w:name="heading 7" w:semiHidden="1" w:uiPriority="9" w:unhideWhenUsed="1" w:qFormat="1"/>
+    <w:lsdException w:name="heading 8" w:semiHidden="1" w:uiPriority="9" w:unhideWhenUsed="1" w:qFormat="1"/>
+    <w:lsdException w:name="heading 9" w:semiHidden="1" w:uiPriority="9" w:unhideWhenUsed="1" w:qFormat="1"/>
     <w:lsdException w:name="index 1" w:semiHidden="1" w:unhideWhenUsed="1"/>
     <w:lsdException w:name="index 2" w:semiHidden="1" w:unhideWhenUsed="1"/>
     <w:lsdException w:name="index 3" w:semiHidden="1" w:unhideWhenUsed="1"/>
@@ -3723,22 +3615,22 @@
     <w:lsdException w:name="index 7" w:semiHidden="1" w:unhideWhenUsed="1"/>
     <w:lsdException w:name="index 8" w:semiHidden="1" w:unhideWhenUsed="1"/>
     <w:lsdException w:name="index 9" w:semiHidden="1" w:unhideWhenUsed="1"/>
-    <w:lsdException w:name="toc 1" w:uiPriority="39" w:semiHidden="1" w:unhideWhenUsed="1"/>
-    <w:lsdException w:name="toc 2" w:uiPriority="39" w:semiHidden="1" w:unhideWhenUsed="1"/>
-    <w:lsdException w:name="toc 3" w:uiPriority="39" w:semiHidden="1" w:unhideWhenUsed="1"/>
-    <w:lsdException w:name="toc 4" w:uiPriority="39" w:semiHidden="1" w:unhideWhenUsed="1"/>
-    <w:lsdException w:name="toc 5" w:uiPriority="39" w:semiHidden="1" w:unhideWhenUsed="1"/>
-    <w:lsdException w:name="toc 6" w:uiPriority="39" w:semiHidden="1" w:unhideWhenUsed="1"/>
-    <w:lsdException w:name="toc 7" w:uiPriority="39" w:semiHidden="1" w:unhideWhenUsed="1"/>
-    <w:lsdException w:name="toc 8" w:uiPriority="39" w:semiHidden="1" w:unhideWhenUsed="1"/>
-    <w:lsdException w:name="toc 9" w:uiPriority="39" w:semiHidden="1" w:unhideWhenUsed="1"/>
+    <w:lsdException w:name="toc 1" w:semiHidden="1" w:uiPriority="39" w:unhideWhenUsed="1"/>
+    <w:lsdException w:name="toc 2" w:semiHidden="1" w:uiPriority="39" w:unhideWhenUsed="1"/>
+    <w:lsdException w:name="toc 3" w:semiHidden="1" w:uiPriority="39" w:unhideWhenUsed="1"/>
+    <w:lsdException w:name="toc 4" w:semiHidden="1" w:uiPriority="39" w:unhideWhenUsed="1"/>
+    <w:lsdException w:name="toc 5" w:semiHidden="1" w:uiPriority="39" w:unhideWhenUsed="1"/>
+    <w:lsdException w:name="toc 6" w:semiHidden="1" w:uiPriority="39" w:unhideWhenUsed="1"/>
+    <w:lsdException w:name="toc 7" w:semiHidden="1" w:uiPriority="39" w:unhideWhenUsed="1"/>
+    <w:lsdException w:name="toc 8" w:semiHidden="1" w:uiPriority="39" w:unhideWhenUsed="1"/>
+    <w:lsdException w:name="toc 9" w:semiHidden="1" w:uiPriority="39" w:unhideWhenUsed="1"/>
     <w:lsdException w:name="Normal Indent" w:semiHidden="1" w:unhideWhenUsed="1"/>
     <w:lsdException w:name="footnote text" w:semiHidden="1" w:unhideWhenUsed="1"/>
     <w:lsdException w:name="annotation text" w:semiHidden="1" w:unhideWhenUsed="1"/>
     <w:lsdException w:name="header" w:semiHidden="1" w:unhideWhenUsed="1"/>
     <w:lsdException w:name="footer" w:semiHidden="1" w:unhideWhenUsed="1"/>
     <w:lsdException w:name="index heading" w:semiHidden="1" w:unhideWhenUsed="1"/>
-    <w:lsdException w:name="caption" w:uiPriority="35" w:semiHidden="1" w:unhideWhenUsed="1" w:qFormat="1"/>
+    <w:lsdException w:name="caption" w:semiHidden="1" w:uiPriority="35" w:unhideWhenUsed="1" w:qFormat="1"/>
     <w:lsdException w:name="table of figures" w:semiHidden="1" w:unhideWhenUsed="1"/>
     <w:lsdException w:name="envelope address" w:semiHidden="1" w:unhideWhenUsed="1"/>
     <w:lsdException w:name="envelope return" w:semiHidden="1" w:unhideWhenUsed="1"/>
@@ -3769,7 +3661,7 @@
     <w:lsdException w:name="Title" w:uiPriority="10" w:qFormat="1"/>
     <w:lsdException w:name="Closing" w:semiHidden="1" w:unhideWhenUsed="1"/>
     <w:lsdException w:name="Signature" w:semiHidden="1" w:unhideWhenUsed="1"/>
-    <w:lsdException w:name="Default Paragraph Font" w:uiPriority="1" w:semiHidden="1" w:unhideWhenUsed="1"/>
+    <w:lsdException w:name="Default Paragraph Font" w:semiHidden="1" w:uiPriority="1" w:unhideWhenUsed="1"/>
     <w:lsdException w:name="Body Text" w:semiHidden="1" w:unhideWhenUsed="1"/>
     <w:lsdException w:name="Body Text Indent" w:semiHidden="1" w:unhideWhenUsed="1"/>
     <w:lsdException w:name="List Continue" w:semiHidden="1" w:unhideWhenUsed="1"/>
@@ -3969,8 +3861,8 @@
     <w:lsdException w:name="Subtle Reference" w:uiPriority="31" w:qFormat="1"/>
     <w:lsdException w:name="Intense Reference" w:uiPriority="32" w:qFormat="1"/>
     <w:lsdException w:name="Book Title" w:uiPriority="33" w:qFormat="1"/>
-    <w:lsdException w:name="Bibliography" w:uiPriority="37" w:semiHidden="1" w:unhideWhenUsed="1"/>
-    <w:lsdException w:name="TOC Heading" w:uiPriority="39" w:semiHidden="1" w:unhideWhenUsed="1" w:qFormat="1"/>
+    <w:lsdException w:name="Bibliography" w:semiHidden="1" w:uiPriority="37" w:unhideWhenUsed="1"/>
+    <w:lsdException w:name="TOC Heading" w:semiHidden="1" w:uiPriority="39" w:unhideWhenUsed="1" w:qFormat="1"/>
     <w:lsdException w:name="Plain Table 1" w:uiPriority="41"/>
     <w:lsdException w:name="Plain Table 2" w:uiPriority="42"/>
     <w:lsdException w:name="Plain Table 3" w:uiPriority="43"/>
@@ -4081,7 +3973,7 @@
     <w:lsdException w:name="Unresolved Mention" w:semiHidden="1" w:unhideWhenUsed="1"/>
     <w:lsdException w:name="Smart Link" w:semiHidden="1" w:unhideWhenUsed="1"/>
   </w:latentStyles>
-  <w:style w:type="paragraph" w:styleId="Normal" w:default="1">
+  <w:style w:type="paragraph" w:default="1" w:styleId="Normal">
     <w:name w:val="Normal"/>
     <w:qFormat/>
   </w:style>
@@ -4099,7 +3991,7 @@
       <w:outlineLvl w:val="0"/>
     </w:pPr>
     <w:rPr>
-      <w:rFonts w:asciiTheme="majorHAnsi" w:hAnsiTheme="majorHAnsi" w:eastAsiaTheme="majorEastAsia" w:cstheme="majorBidi"/>
+      <w:rFonts w:asciiTheme="majorHAnsi" w:eastAsiaTheme="majorEastAsia" w:hAnsiTheme="majorHAnsi" w:cstheme="majorBidi"/>
       <w:color w:val="0F4761"/>
       <w:sz w:val="40"/>
       <w:szCs w:val="40"/>
@@ -4120,7 +4012,7 @@
       <w:outlineLvl w:val="1"/>
     </w:pPr>
     <w:rPr>
-      <w:rFonts w:asciiTheme="majorHAnsi" w:hAnsiTheme="majorHAnsi" w:eastAsiaTheme="majorEastAsia" w:cstheme="majorBidi"/>
+      <w:rFonts w:asciiTheme="majorHAnsi" w:eastAsiaTheme="majorEastAsia" w:hAnsiTheme="majorHAnsi" w:cstheme="majorBidi"/>
       <w:color w:val="0F4761"/>
       <w:sz w:val="32"/>
       <w:szCs w:val="32"/>
@@ -4267,13 +4159,13 @@
       <w:color w:val="272727"/>
     </w:rPr>
   </w:style>
-  <w:style w:type="character" w:styleId="DefaultParagraphFont" w:default="1">
+  <w:style w:type="character" w:default="1" w:styleId="DefaultParagraphFont">
     <w:name w:val="Default Paragraph Font"/>
     <w:uiPriority w:val="1"/>
     <w:semiHidden/>
     <w:unhideWhenUsed/>
   </w:style>
-  <w:style w:type="table" w:styleId="TableNormal" w:default="1">
+  <w:style w:type="table" w:default="1" w:styleId="TableNormal">
     <w:name w:val="Normal Table"/>
     <w:uiPriority w:val="99"/>
     <w:semiHidden/>
@@ -4288,37 +4180,37 @@
       </w:tblCellMar>
     </w:tblPr>
   </w:style>
-  <w:style w:type="numbering" w:styleId="NoList" w:default="1">
+  <w:style w:type="numbering" w:default="1" w:styleId="NoList">
     <w:name w:val="No List"/>
     <w:uiPriority w:val="99"/>
     <w:semiHidden/>
     <w:unhideWhenUsed/>
   </w:style>
-  <w:style w:type="character" w:styleId="Heading1Char" w:customStyle="1">
+  <w:style w:type="character" w:customStyle="1" w:styleId="Heading1Char">
     <w:name w:val="Heading 1 Char"/>
     <w:basedOn w:val="DefaultParagraphFont"/>
     <w:link w:val="Heading1"/>
     <w:uiPriority w:val="9"/>
     <w:rPr>
-      <w:rFonts w:asciiTheme="majorHAnsi" w:hAnsiTheme="majorHAnsi" w:eastAsiaTheme="majorEastAsia" w:cstheme="majorBidi"/>
+      <w:rFonts w:asciiTheme="majorHAnsi" w:eastAsiaTheme="majorEastAsia" w:hAnsiTheme="majorHAnsi" w:cstheme="majorBidi"/>
       <w:color w:val="0F4761"/>
       <w:sz w:val="40"/>
       <w:szCs w:val="40"/>
     </w:rPr>
   </w:style>
-  <w:style w:type="character" w:styleId="Heading2Char" w:customStyle="1">
+  <w:style w:type="character" w:customStyle="1" w:styleId="Heading2Char">
     <w:name w:val="Heading 2 Char"/>
     <w:basedOn w:val="DefaultParagraphFont"/>
     <w:link w:val="Heading2"/>
     <w:uiPriority w:val="9"/>
     <w:rPr>
-      <w:rFonts w:asciiTheme="majorHAnsi" w:hAnsiTheme="majorHAnsi" w:eastAsiaTheme="majorEastAsia" w:cstheme="majorBidi"/>
+      <w:rFonts w:asciiTheme="majorHAnsi" w:eastAsiaTheme="majorEastAsia" w:hAnsiTheme="majorHAnsi" w:cstheme="majorBidi"/>
       <w:color w:val="0F4761"/>
       <w:sz w:val="32"/>
       <w:szCs w:val="32"/>
     </w:rPr>
   </w:style>
-  <w:style w:type="character" w:styleId="Heading3Char" w:customStyle="1">
+  <w:style w:type="character" w:customStyle="1" w:styleId="Heading3Char">
     <w:name w:val="Heading 3 Char"/>
     <w:basedOn w:val="DefaultParagraphFont"/>
     <w:link w:val="Heading3"/>
@@ -4330,7 +4222,7 @@
       <w:szCs w:val="28"/>
     </w:rPr>
   </w:style>
-  <w:style w:type="character" w:styleId="Heading4Char" w:customStyle="1">
+  <w:style w:type="character" w:customStyle="1" w:styleId="Heading4Char">
     <w:name w:val="Heading 4 Char"/>
     <w:basedOn w:val="DefaultParagraphFont"/>
     <w:link w:val="Heading4"/>
@@ -4342,7 +4234,7 @@
       <w:color w:val="0F4761"/>
     </w:rPr>
   </w:style>
-  <w:style w:type="character" w:styleId="Heading5Char" w:customStyle="1">
+  <w:style w:type="character" w:customStyle="1" w:styleId="Heading5Char">
     <w:name w:val="Heading 5 Char"/>
     <w:basedOn w:val="DefaultParagraphFont"/>
     <w:link w:val="Heading5"/>
@@ -4352,7 +4244,7 @@
       <w:color w:val="0F4761"/>
     </w:rPr>
   </w:style>
-  <w:style w:type="character" w:styleId="Heading6Char" w:customStyle="1">
+  <w:style w:type="character" w:customStyle="1" w:styleId="Heading6Char">
     <w:name w:val="Heading 6 Char"/>
     <w:basedOn w:val="DefaultParagraphFont"/>
     <w:link w:val="Heading6"/>
@@ -4364,7 +4256,7 @@
       <w:color w:val="595959"/>
     </w:rPr>
   </w:style>
-  <w:style w:type="character" w:styleId="Heading7Char" w:customStyle="1">
+  <w:style w:type="character" w:customStyle="1" w:styleId="Heading7Char">
     <w:name w:val="Heading 7 Char"/>
     <w:basedOn w:val="DefaultParagraphFont"/>
     <w:link w:val="Heading7"/>
@@ -4374,7 +4266,7 @@
       <w:color w:val="595959"/>
     </w:rPr>
   </w:style>
-  <w:style w:type="character" w:styleId="Heading8Char" w:customStyle="1">
+  <w:style w:type="character" w:customStyle="1" w:styleId="Heading8Char">
     <w:name w:val="Heading 8 Char"/>
     <w:basedOn w:val="DefaultParagraphFont"/>
     <w:link w:val="Heading8"/>
@@ -4386,7 +4278,7 @@
       <w:color w:val="272727"/>
     </w:rPr>
   </w:style>
-  <w:style w:type="character" w:styleId="Heading9Char" w:customStyle="1">
+  <w:style w:type="character" w:customStyle="1" w:styleId="Heading9Char">
     <w:name w:val="Heading 9 Char"/>
     <w:basedOn w:val="DefaultParagraphFont"/>
     <w:link w:val="Heading9"/>
@@ -4396,13 +4288,13 @@
       <w:color w:val="272727"/>
     </w:rPr>
   </w:style>
-  <w:style w:type="character" w:styleId="TitleChar" w:customStyle="1">
+  <w:style w:type="character" w:customStyle="1" w:styleId="TitleChar">
     <w:name w:val="Title Char"/>
     <w:basedOn w:val="DefaultParagraphFont"/>
     <w:link w:val="Title"/>
     <w:uiPriority w:val="10"/>
     <w:rPr>
-      <w:rFonts w:asciiTheme="majorHAnsi" w:hAnsiTheme="majorHAnsi" w:eastAsiaTheme="majorEastAsia" w:cstheme="majorBidi"/>
+      <w:rFonts w:asciiTheme="majorHAnsi" w:eastAsiaTheme="majorEastAsia" w:hAnsiTheme="majorHAnsi" w:cstheme="majorBidi"/>
       <w:spacing w:val="-10"/>
       <w:kern w:val="28"/>
       <w:sz w:val="56"/>
@@ -4421,14 +4313,14 @@
       <w:contextualSpacing/>
     </w:pPr>
     <w:rPr>
-      <w:rFonts w:asciiTheme="majorHAnsi" w:hAnsiTheme="majorHAnsi" w:eastAsiaTheme="majorEastAsia" w:cstheme="majorBidi"/>
+      <w:rFonts w:asciiTheme="majorHAnsi" w:eastAsiaTheme="majorEastAsia" w:hAnsiTheme="majorHAnsi" w:cstheme="majorBidi"/>
       <w:spacing w:val="-10"/>
       <w:kern w:val="28"/>
       <w:sz w:val="56"/>
       <w:szCs w:val="56"/>
     </w:rPr>
   </w:style>
-  <w:style w:type="character" w:styleId="SubtitleChar" w:customStyle="1">
+  <w:style w:type="character" w:customStyle="1" w:styleId="SubtitleChar">
     <w:name w:val="Subtitle Char"/>
     <w:basedOn w:val="DefaultParagraphFont"/>
     <w:link w:val="Subtitle"/>
@@ -4472,7 +4364,7 @@
       <w:color w:val="0F4761"/>
     </w:rPr>
   </w:style>
-  <w:style w:type="character" w:styleId="QuoteChar" w:customStyle="1">
+  <w:style w:type="character" w:customStyle="1" w:styleId="QuoteChar">
     <w:name w:val="Quote Char"/>
     <w:basedOn w:val="DefaultParagraphFont"/>
     <w:link w:val="Quote"/>
@@ -4500,7 +4392,7 @@
       <w:color w:val="404040"/>
     </w:rPr>
   </w:style>
-  <w:style w:type="character" w:styleId="IntenseQuoteChar" w:customStyle="1">
+  <w:style w:type="character" w:customStyle="1" w:styleId="IntenseQuoteChar">
     <w:name w:val="Intense Quote Char"/>
     <w:basedOn w:val="DefaultParagraphFont"/>
     <w:link w:val="IntenseQuote"/>
@@ -4520,8 +4412,8 @@
     <w:qFormat/>
     <w:pPr>
       <w:pBdr>
-        <w:top w:val="single" w:color="0F4761" w:sz="4" w:space="10"/>
-        <w:bottom w:val="single" w:color="0F4761" w:sz="4" w:space="10"/>
+        <w:top w:val="single" w:sz="4" w:space="10" w:color="0F4761"/>
+        <w:bottom w:val="single" w:sz="4" w:space="10" w:color="0F4761"/>
       </w:pBdr>
       <w:spacing w:before="360" w:after="360"/>
       <w:ind w:left="864" w:right="864"/>
@@ -4556,12 +4448,12 @@
     </w:pPr>
     <w:tblPr>
       <w:tblBorders>
-        <w:top w:val="single" w:color="000000" w:sz="4" w:space="0"/>
-        <w:left w:val="single" w:color="000000" w:sz="4" w:space="0"/>
-        <w:bottom w:val="single" w:color="000000" w:sz="4" w:space="0"/>
-        <w:right w:val="single" w:color="000000" w:sz="4" w:space="0"/>
-        <w:insideH w:val="single" w:color="000000" w:sz="4" w:space="0"/>
-        <w:insideV w:val="single" w:color="000000" w:sz="4" w:space="0"/>
+        <w:top w:val="single" w:sz="4" w:space="0" w:color="000000"/>
+        <w:left w:val="single" w:sz="4" w:space="0" w:color="000000"/>
+        <w:bottom w:val="single" w:sz="4" w:space="0" w:color="000000"/>
+        <w:right w:val="single" w:sz="4" w:space="0" w:color="000000"/>
+        <w:insideH w:val="single" w:sz="4" w:space="0" w:color="000000"/>
+        <w:insideV w:val="single" w:sz="4" w:space="0" w:color="000000"/>
       </w:tblBorders>
     </w:tblPr>
   </w:style>
@@ -4576,12 +4468,12 @@
       <w:tblStyleRowBandSize w:val="1"/>
       <w:tblStyleColBandSize w:val="1"/>
       <w:tblBorders>
-        <w:top w:val="single" w:color="9CC2E5" w:sz="4" w:space="0"/>
-        <w:left w:val="single" w:color="9CC2E5" w:sz="4" w:space="0"/>
-        <w:bottom w:val="single" w:color="9CC2E5" w:sz="4" w:space="0"/>
-        <w:right w:val="single" w:color="9CC2E5" w:sz="4" w:space="0"/>
-        <w:insideH w:val="single" w:color="9CC2E5" w:sz="4" w:space="0"/>
-        <w:insideV w:val="single" w:color="9CC2E5" w:sz="4" w:space="0"/>
+        <w:top w:val="single" w:sz="4" w:space="0" w:color="9CC2E5"/>
+        <w:left w:val="single" w:sz="4" w:space="0" w:color="9CC2E5"/>
+        <w:bottom w:val="single" w:sz="4" w:space="0" w:color="9CC2E5"/>
+        <w:right w:val="single" w:sz="4" w:space="0" w:color="9CC2E5"/>
+        <w:insideH w:val="single" w:sz="4" w:space="0" w:color="9CC2E5"/>
+        <w:insideV w:val="single" w:sz="4" w:space="0" w:color="9CC2E5"/>
       </w:tblBorders>
     </w:tblPr>
     <w:tblStylePr w:type="firstRow">
@@ -4592,10 +4484,10 @@
       <w:tblPr/>
       <w:tcPr>
         <w:tcBorders>
-          <w:top w:val="single" w:color="5B9BD5" w:sz="4" w:space="0"/>
-          <w:left w:val="single" w:color="5B9BD5" w:sz="4" w:space="0"/>
-          <w:bottom w:val="single" w:color="5B9BD5" w:sz="4" w:space="0"/>
-          <w:right w:val="single" w:color="5B9BD5" w:sz="4" w:space="0"/>
+          <w:top w:val="single" w:sz="4" w:space="0" w:color="5B9BD5"/>
+          <w:left w:val="single" w:sz="4" w:space="0" w:color="5B9BD5"/>
+          <w:bottom w:val="single" w:sz="4" w:space="0" w:color="5B9BD5"/>
+          <w:right w:val="single" w:sz="4" w:space="0" w:color="5B9BD5"/>
           <w:insideH w:val="nil"/>
           <w:insideV w:val="nil"/>
         </w:tcBorders>
@@ -4610,7 +4502,7 @@
       <w:tblPr/>
       <w:tcPr>
         <w:tcBorders>
-          <w:top w:val="double" w:color="5B9BD5" w:sz="4" w:space="0"/>
+          <w:top w:val="double" w:sz="4" w:space="0" w:color="5B9BD5"/>
         </w:tcBorders>
       </w:tcPr>
     </w:tblStylePr>
@@ -4659,7 +4551,7 @@
       <w:contextualSpacing/>
     </w:pPr>
   </w:style>
-  <w:style w:type="paragraph" w:styleId="Code" w:customStyle="1">
+  <w:style w:type="paragraph" w:customStyle="1" w:styleId="Code">
     <w:name w:val="Code"/>
     <w:basedOn w:val="Normal"/>
     <w:next w:val="Normal"/>
@@ -4691,7 +4583,7 @@
       <w:szCs w:val="20"/>
     </w:rPr>
   </w:style>
-  <w:style w:type="character" w:styleId="FootnoteTextChar" w:customStyle="1">
+  <w:style w:type="character" w:customStyle="1" w:styleId="FootnoteTextChar">
     <w:name w:val="Footnote Text Char"/>
     <w:basedOn w:val="DefaultParagraphFont"/>
     <w:link w:val="FootnoteText"/>
@@ -4729,7 +4621,7 @@
       <w:spacing w:after="0" w:line="240" w:lineRule="auto"/>
     </w:pPr>
   </w:style>
-  <w:style w:type="character" w:styleId="HeaderChar" w:customStyle="1">
+  <w:style w:type="character" w:customStyle="1" w:styleId="HeaderChar">
     <w:name w:val="Header Char"/>
     <w:basedOn w:val="DefaultParagraphFont"/>
     <w:link w:val="Header"/>
@@ -4751,7 +4643,7 @@
       <w:spacing w:after="0" w:line="240" w:lineRule="auto"/>
     </w:pPr>
   </w:style>
-  <w:style w:type="character" w:styleId="FooterChar" w:customStyle="1">
+  <w:style w:type="character" w:customStyle="1" w:styleId="FooterChar">
     <w:name w:val="Footer Char"/>
     <w:basedOn w:val="DefaultParagraphFont"/>
     <w:link w:val="Footer"/>
@@ -4762,7 +4654,7 @@
 </file>
 
 <file path=word/theme/theme1.xml><?xml version="1.0" encoding="utf-8"?>
-<a:theme xmlns:a="http://schemas.openxmlformats.org/drawingml/2006/main" xmlns:thm15="http://schemas.microsoft.com/office/thememl/2012/main" name="Office Theme">
+<a:theme xmlns:a="http://schemas.openxmlformats.org/drawingml/2006/main" name="Office Theme">
   <a:themeElements>
     <a:clrScheme name="Office">
       <a:dk1>

</xml_diff>